<commit_message>
RHAS: validation run and Werkzeugnachweis for 2026-10-07-wp10; local package updated
- validation: 107/107 Node tests, 8/8 browser checks, build SHA-256 aef2ec14...5245 (commit 3b3edc6)
- Werkzeugnachweis regenerated from the run (TR-14, TR-15 added)
- RHAS_lokal: new build, launchers/ollama_pack unchanged, guide refreshed

Co-Authored-By: Claude Sonnet 5.5 <noreply@anthropic.com>
Claude-Session: https://claude.ai/code/session_01C75FqTLfyAjNtuqqyZgKLW
</commit_message>
<xml_diff>
--- a/rhas/docs/werkzeugnachweis/04_Werkzeugnachweis_RHAS.docx
+++ b/rhas/docs/werkzeugnachweis/04_Werkzeugnachweis_RHAS.docx
@@ -27,7 +27,7 @@
           <w:sz w:val="22"/>
           <w:szCs w:val="22"/>
         </w:rPr>
-        <w:t xml:space="preserve">Werkzeugbeschreibung, Einstufung nach EN 50129:2018 6.3, Validierung · Version 2026-09-27-wp9 · Stand 2026-09-27 11:15 UTC</w:t>
+        <w:t xml:space="preserve">Werkzeugbeschreibung, Einstufung nach EN 50129:2018 6.3, Validierung · Version 2026-10-07-wp10 · Stand 2026-10-07 08:30 UTC</w:t>
       </w:r>
     </w:p>
     <w:tbl>
@@ -220,7 +220,7 @@
                 <w:sz w:val="18"/>
                 <w:szCs w:val="18"/>
               </w:rPr>
-              <w:t xml:space="preserve">2026-09-27-wp9 / Commit 9140264</w:t>
+              <w:t xml:space="preserve">2026-10-07-wp10 / Commit 3b3edc6</w:t>
             </w:r>
           </w:p>
         </w:tc>
@@ -278,7 +278,7 @@
                 <w:sz w:val="18"/>
                 <w:szCs w:val="18"/>
               </w:rPr>
-              <w:t xml:space="preserve">b7d8cffa52c1fda45c6e21cac8b8ad14ecce875a02e18c405eb6f63ff610bf14</w:t>
+              <w:t xml:space="preserve">aef2ec147b77db306ff2c1ce6ca43432adca325e749bd763af2ee1955c385245</w:t>
             </w:r>
           </w:p>
         </w:tc>
@@ -336,7 +336,7 @@
                 <w:sz w:val="18"/>
                 <w:szCs w:val="18"/>
               </w:rPr>
-              <w:t xml:space="preserve">2026-09-27 11:15 UTC; Node v22.22.2, Python 3.12.3, Chromium (Playwright)</w:t>
+              <w:t xml:space="preserve">2026-10-07 08:30 UTC; Node v22.22.0, Python 3.13.16, Chromium (Playwright)</w:t>
             </w:r>
           </w:p>
         </w:tc>
@@ -394,7 +394,7 @@
                 <w:sz w:val="18"/>
                 <w:szCs w:val="18"/>
               </w:rPr>
-              <w:t xml:space="preserve">96 von 96 Modul- und Berichtstests bestanden; 8 von 8 Browser-Prüfungen bestanden</w:t>
+              <w:t xml:space="preserve">107 von 107 Modul- und Berichtstests bestanden; 8 von 8 Browser-Prüfungen bestanden</w:t>
             </w:r>
           </w:p>
         </w:tc>
@@ -2615,7 +2615,7 @@
                 <w:sz w:val="18"/>
                 <w:szCs w:val="18"/>
               </w:rPr>
-              <w:t xml:space="preserve">Restrisiko nur aus bestätigten Maßnahmen; verworfene Maßnahmen ohne Wirkung.</w:t>
+              <w:t xml:space="preserve">Restrisiko und „kontrolliert“ nur aus angenommenen Maßnahmen; vorgeschlagene und verworfene Maßnahmen ohne Wirkung; Restrisiko nie schlechter als das Ausgangsrisiko; „weitgehend akzeptabel“ bei Klassen mit Maßnahmenpflicht nur mit begründeter Abweichung.</w:t>
             </w:r>
           </w:p>
         </w:tc>
@@ -3045,7 +3045,7 @@
                 <w:sz w:val="18"/>
                 <w:szCs w:val="18"/>
               </w:rPr>
-              <w:t xml:space="preserve">Kalibrierung konfigurierbar, validiert, versioniert, freigabepflichtig; Auswirkungen auf bestehende Gefährdungen werden angezeigt.</w:t>
+              <w:t xml:space="preserve">Kalibrierung konfigurierbar, validiert, versioniert, freigabepflichtig (ein Freigabeweg mit Protokoll); Auswirkungen auf bestehende Gefährdungen werden angezeigt; eine Änderung, die bestehenden Gefährdungen Kategorien entzieht, wird abgewiesen.</w:t>
             </w:r>
           </w:p>
         </w:tc>
@@ -3389,7 +3389,7 @@
                 <w:sz w:val="18"/>
                 <w:szCs w:val="18"/>
               </w:rPr>
-              <w:t xml:space="preserve">Eine Datei, ohne externe Ressourcen, reproduzierbar aus dem Quellstand gebaut.</w:t>
+              <w:t xml:space="preserve">Eine Datei, ohne externe Ressourcen, reproduzierbar aus dem Quellstand gebaut; eingebettete Daten können die Seite nicht beschädigen; nicht aufgeführte Module führen zum Abbruch.</w:t>
             </w:r>
           </w:p>
         </w:tc>
@@ -3418,6 +3418,178 @@
                 <w:szCs w:val="18"/>
               </w:rPr>
               <w:t xml:space="preserve">build</w:t>
+            </w:r>
+          </w:p>
+        </w:tc>
+      </w:tr>
+      <w:tr>
+        <w:tc>
+          <w:tcPr>
+            <w:tcW w:type="dxa" w:w="771"/>
+            <w:tcBorders>
+              <w:top w:val="single" w:color="BFC7D5" w:sz="4"/>
+              <w:left w:val="single" w:color="BFC7D5" w:sz="4"/>
+              <w:bottom w:val="single" w:color="BFC7D5" w:sz="4"/>
+              <w:right w:val="single" w:color="BFC7D5" w:sz="4"/>
+            </w:tcBorders>
+            <w:tcMar>
+              <w:top w:type="dxa" w:w="50"/>
+              <w:left w:type="dxa" w:w="80"/>
+              <w:bottom w:type="dxa" w:w="50"/>
+              <w:right w:type="dxa" w:w="80"/>
+            </w:tcMar>
+          </w:tcPr>
+          <w:p>
+            <w:r>
+              <w:rPr>
+                <w:b w:val="false"/>
+                <w:bCs w:val="false"/>
+                <w:sz w:val="18"/>
+                <w:szCs w:val="18"/>
+              </w:rPr>
+              <w:t xml:space="preserve">TR-14</w:t>
+            </w:r>
+          </w:p>
+        </w:tc>
+        <w:tc>
+          <w:tcPr>
+            <w:tcW w:type="dxa" w:w="6168"/>
+            <w:tcBorders>
+              <w:top w:val="single" w:color="BFC7D5" w:sz="4"/>
+              <w:left w:val="single" w:color="BFC7D5" w:sz="4"/>
+              <w:bottom w:val="single" w:color="BFC7D5" w:sz="4"/>
+              <w:right w:val="single" w:color="BFC7D5" w:sz="4"/>
+            </w:tcBorders>
+            <w:tcMar>
+              <w:top w:type="dxa" w:w="50"/>
+              <w:left w:type="dxa" w:w="80"/>
+              <w:bottom w:type="dxa" w:w="50"/>
+              <w:right w:type="dxa" w:w="80"/>
+            </w:tcMar>
+          </w:tcPr>
+          <w:p>
+            <w:r>
+              <w:rPr>
+                <w:b w:val="false"/>
+                <w:bCs w:val="false"/>
+                <w:sz w:val="18"/>
+                <w:szCs w:val="18"/>
+              </w:rPr>
+              <w:t xml:space="preserve">Import und Kennungen: Kennungen und Verweise mit HTML-relevanten Zeichen werden beim Import abgewiesen; Kennungen gelöschter Datensätze werden nicht erneut vergeben; Anbieter-Prüfung für vertrauliche Projekte erkennt nur echte lokale Adressen.</w:t>
+            </w:r>
+          </w:p>
+        </w:tc>
+        <w:tc>
+          <w:tcPr>
+            <w:tcW w:type="dxa" w:w="2699"/>
+            <w:tcBorders>
+              <w:top w:val="single" w:color="BFC7D5" w:sz="4"/>
+              <w:left w:val="single" w:color="BFC7D5" w:sz="4"/>
+              <w:bottom w:val="single" w:color="BFC7D5" w:sz="4"/>
+              <w:right w:val="single" w:color="BFC7D5" w:sz="4"/>
+            </w:tcBorders>
+            <w:tcMar>
+              <w:top w:type="dxa" w:w="50"/>
+              <w:left w:type="dxa" w:w="80"/>
+              <w:bottom w:type="dxa" w:w="50"/>
+              <w:right w:type="dxa" w:w="80"/>
+            </w:tcMar>
+          </w:tcPr>
+          <w:p>
+            <w:r>
+              <w:rPr>
+                <w:b w:val="false"/>
+                <w:bCs w:val="false"/>
+                <w:sz w:val="18"/>
+                <w:szCs w:val="18"/>
+              </w:rPr>
+              <w:t xml:space="preserve">import-ids, db-ids, local-providers; Browser: smoke_local</w:t>
+            </w:r>
+          </w:p>
+        </w:tc>
+      </w:tr>
+      <w:tr>
+        <w:tc>
+          <w:tcPr>
+            <w:tcW w:type="dxa" w:w="771"/>
+            <w:tcBorders>
+              <w:top w:val="single" w:color="BFC7D5" w:sz="4"/>
+              <w:left w:val="single" w:color="BFC7D5" w:sz="4"/>
+              <w:bottom w:val="single" w:color="BFC7D5" w:sz="4"/>
+              <w:right w:val="single" w:color="BFC7D5" w:sz="4"/>
+            </w:tcBorders>
+            <w:tcMar>
+              <w:top w:type="dxa" w:w="50"/>
+              <w:left w:type="dxa" w:w="80"/>
+              <w:bottom w:type="dxa" w:w="50"/>
+              <w:right w:type="dxa" w:w="80"/>
+            </w:tcMar>
+          </w:tcPr>
+          <w:p>
+            <w:r>
+              <w:rPr>
+                <w:b w:val="false"/>
+                <w:bCs w:val="false"/>
+                <w:sz w:val="18"/>
+                <w:szCs w:val="18"/>
+              </w:rPr>
+              <w:t xml:space="preserve">TR-15</w:t>
+            </w:r>
+          </w:p>
+        </w:tc>
+        <w:tc>
+          <w:tcPr>
+            <w:tcW w:type="dxa" w:w="6168"/>
+            <w:tcBorders>
+              <w:top w:val="single" w:color="BFC7D5" w:sz="4"/>
+              <w:left w:val="single" w:color="BFC7D5" w:sz="4"/>
+              <w:bottom w:val="single" w:color="BFC7D5" w:sz="4"/>
+              <w:right w:val="single" w:color="BFC7D5" w:sz="4"/>
+            </w:tcBorders>
+            <w:tcMar>
+              <w:top w:type="dxa" w:w="50"/>
+              <w:left w:type="dxa" w:w="80"/>
+              <w:bottom w:type="dxa" w:w="50"/>
+              <w:right w:type="dxa" w:w="80"/>
+            </w:tcMar>
+          </w:tcPr>
+          <w:p>
+            <w:r>
+              <w:rPr>
+                <w:b w:val="false"/>
+                <w:bCs w:val="false"/>
+                <w:sz w:val="18"/>
+                <w:szCs w:val="18"/>
+              </w:rPr>
+              <w:t xml:space="preserve">Berichte sind unabhängig von der Zeitzone des Rechners; die Excel-Arbeitsmappe enthält die Security-Tabellen des Word-Berichts je Stufe.</w:t>
+            </w:r>
+          </w:p>
+        </w:tc>
+        <w:tc>
+          <w:tcPr>
+            <w:tcW w:type="dxa" w:w="2699"/>
+            <w:tcBorders>
+              <w:top w:val="single" w:color="BFC7D5" w:sz="4"/>
+              <w:left w:val="single" w:color="BFC7D5" w:sz="4"/>
+              <w:bottom w:val="single" w:color="BFC7D5" w:sz="4"/>
+              <w:right w:val="single" w:color="BFC7D5" w:sz="4"/>
+            </w:tcBorders>
+            <w:tcMar>
+              <w:top w:type="dxa" w:w="50"/>
+              <w:left w:type="dxa" w:w="80"/>
+              <w:bottom w:type="dxa" w:w="50"/>
+              <w:right w:type="dxa" w:w="80"/>
+            </w:tcMar>
+          </w:tcPr>
+          <w:p>
+            <w:r>
+              <w:rPr>
+                <w:b w:val="false"/>
+                <w:bCs w:val="false"/>
+                <w:sz w:val="18"/>
+                <w:szCs w:val="18"/>
+              </w:rPr>
+              <w:t xml:space="preserve">reports, xlsx-security</w:t>
             </w:r>
           </w:p>
         </w:tc>
@@ -3436,7 +3608,7 @@
         <w:spacing w:after="120"/>
       </w:pPr>
       <w:r>
-        <w:t xml:space="preserve">Validierungslauf vom 2026-09-27 11:15 UTC mit Version 2026-09-27-wp9 (Commit 9140264). Der Lauf ist mit „python3 scripts/validate.py“ wiederholbar; die Rohdaten liegen unter docs/validation.</w:t>
+        <w:t xml:space="preserve">Validierungslauf vom 2026-10-07 08:30 UTC mit Version 2026-10-07-wp10 (Commit 3b3edc6). Der Lauf ist mit „python3 scripts/validate.py“ wiederholbar; die Rohdaten liegen unter docs/validation.</w:t>
       </w:r>
     </w:p>
     <w:p>
@@ -3697,6 +3869,716 @@
                 <w:sz w:val="18"/>
                 <w:szCs w:val="18"/>
               </w:rPr>
+              <w:t xml:space="preserve">4</w:t>
+            </w:r>
+          </w:p>
+        </w:tc>
+        <w:tc>
+          <w:tcPr>
+            <w:tcW w:type="dxa" w:w="1349"/>
+            <w:tcBorders>
+              <w:top w:val="single" w:color="BFC7D5" w:sz="4"/>
+              <w:left w:val="single" w:color="BFC7D5" w:sz="4"/>
+              <w:bottom w:val="single" w:color="BFC7D5" w:sz="4"/>
+              <w:right w:val="single" w:color="BFC7D5" w:sz="4"/>
+            </w:tcBorders>
+            <w:tcMar>
+              <w:top w:type="dxa" w:w="50"/>
+              <w:left w:type="dxa" w:w="80"/>
+              <w:bottom w:type="dxa" w:w="50"/>
+              <w:right w:type="dxa" w:w="80"/>
+            </w:tcMar>
+          </w:tcPr>
+          <w:p>
+            <w:r>
+              <w:rPr>
+                <w:b w:val="false"/>
+                <w:bCs w:val="false"/>
+                <w:sz w:val="18"/>
+                <w:szCs w:val="18"/>
+              </w:rPr>
+              <w:t xml:space="preserve">4</w:t>
+            </w:r>
+          </w:p>
+        </w:tc>
+        <w:tc>
+          <w:tcPr>
+            <w:tcW w:type="dxa" w:w="1349"/>
+            <w:tcBorders>
+              <w:top w:val="single" w:color="BFC7D5" w:sz="4"/>
+              <w:left w:val="single" w:color="BFC7D5" w:sz="4"/>
+              <w:bottom w:val="single" w:color="BFC7D5" w:sz="4"/>
+              <w:right w:val="single" w:color="BFC7D5" w:sz="4"/>
+            </w:tcBorders>
+            <w:tcMar>
+              <w:top w:type="dxa" w:w="50"/>
+              <w:left w:type="dxa" w:w="80"/>
+              <w:bottom w:type="dxa" w:w="50"/>
+              <w:right w:type="dxa" w:w="80"/>
+            </w:tcMar>
+          </w:tcPr>
+          <w:p>
+            <w:r>
+              <w:rPr>
+                <w:b w:val="false"/>
+                <w:bCs w:val="false"/>
+                <w:sz w:val="18"/>
+                <w:szCs w:val="18"/>
+              </w:rPr>
+              <w:t xml:space="preserve">0</w:t>
+            </w:r>
+          </w:p>
+        </w:tc>
+      </w:tr>
+      <w:tr>
+        <w:tc>
+          <w:tcPr>
+            <w:tcW w:type="dxa" w:w="3277"/>
+            <w:tcBorders>
+              <w:top w:val="single" w:color="BFC7D5" w:sz="4"/>
+              <w:left w:val="single" w:color="BFC7D5" w:sz="4"/>
+              <w:bottom w:val="single" w:color="BFC7D5" w:sz="4"/>
+              <w:right w:val="single" w:color="BFC7D5" w:sz="4"/>
+            </w:tcBorders>
+            <w:tcMar>
+              <w:top w:type="dxa" w:w="50"/>
+              <w:left w:type="dxa" w:w="80"/>
+              <w:bottom w:type="dxa" w:w="50"/>
+              <w:right w:type="dxa" w:w="80"/>
+            </w:tcMar>
+          </w:tcPr>
+          <w:p>
+            <w:r>
+              <w:rPr>
+                <w:b w:val="false"/>
+                <w:bCs w:val="false"/>
+                <w:sz w:val="18"/>
+                <w:szCs w:val="18"/>
+              </w:rPr>
+              <w:t xml:space="preserve">Kalibrierung</w:t>
+            </w:r>
+          </w:p>
+        </w:tc>
+        <w:tc>
+          <w:tcPr>
+            <w:tcW w:type="dxa" w:w="2506"/>
+            <w:tcBorders>
+              <w:top w:val="single" w:color="BFC7D5" w:sz="4"/>
+              <w:left w:val="single" w:color="BFC7D5" w:sz="4"/>
+              <w:bottom w:val="single" w:color="BFC7D5" w:sz="4"/>
+              <w:right w:val="single" w:color="BFC7D5" w:sz="4"/>
+            </w:tcBorders>
+            <w:tcMar>
+              <w:top w:type="dxa" w:w="50"/>
+              <w:left w:type="dxa" w:w="80"/>
+              <w:bottom w:type="dxa" w:w="50"/>
+              <w:right w:type="dxa" w:w="80"/>
+            </w:tcMar>
+          </w:tcPr>
+          <w:p>
+            <w:r>
+              <w:rPr>
+                <w:b w:val="false"/>
+                <w:bCs w:val="false"/>
+                <w:sz w:val="18"/>
+                <w:szCs w:val="18"/>
+              </w:rPr>
+              <w:t xml:space="preserve">calibration.test.js</w:t>
+            </w:r>
+          </w:p>
+        </w:tc>
+        <w:tc>
+          <w:tcPr>
+            <w:tcW w:type="dxa" w:w="1157"/>
+            <w:tcBorders>
+              <w:top w:val="single" w:color="BFC7D5" w:sz="4"/>
+              <w:left w:val="single" w:color="BFC7D5" w:sz="4"/>
+              <w:bottom w:val="single" w:color="BFC7D5" w:sz="4"/>
+              <w:right w:val="single" w:color="BFC7D5" w:sz="4"/>
+            </w:tcBorders>
+            <w:tcMar>
+              <w:top w:type="dxa" w:w="50"/>
+              <w:left w:type="dxa" w:w="80"/>
+              <w:bottom w:type="dxa" w:w="50"/>
+              <w:right w:type="dxa" w:w="80"/>
+            </w:tcMar>
+          </w:tcPr>
+          <w:p>
+            <w:r>
+              <w:rPr>
+                <w:b w:val="false"/>
+                <w:bCs w:val="false"/>
+                <w:sz w:val="18"/>
+                <w:szCs w:val="18"/>
+              </w:rPr>
+              <w:t xml:space="preserve">7</w:t>
+            </w:r>
+          </w:p>
+        </w:tc>
+        <w:tc>
+          <w:tcPr>
+            <w:tcW w:type="dxa" w:w="1349"/>
+            <w:tcBorders>
+              <w:top w:val="single" w:color="BFC7D5" w:sz="4"/>
+              <w:left w:val="single" w:color="BFC7D5" w:sz="4"/>
+              <w:bottom w:val="single" w:color="BFC7D5" w:sz="4"/>
+              <w:right w:val="single" w:color="BFC7D5" w:sz="4"/>
+            </w:tcBorders>
+            <w:tcMar>
+              <w:top w:type="dxa" w:w="50"/>
+              <w:left w:type="dxa" w:w="80"/>
+              <w:bottom w:type="dxa" w:w="50"/>
+              <w:right w:type="dxa" w:w="80"/>
+            </w:tcMar>
+          </w:tcPr>
+          <w:p>
+            <w:r>
+              <w:rPr>
+                <w:b w:val="false"/>
+                <w:bCs w:val="false"/>
+                <w:sz w:val="18"/>
+                <w:szCs w:val="18"/>
+              </w:rPr>
+              <w:t xml:space="preserve">7</w:t>
+            </w:r>
+          </w:p>
+        </w:tc>
+        <w:tc>
+          <w:tcPr>
+            <w:tcW w:type="dxa" w:w="1349"/>
+            <w:tcBorders>
+              <w:top w:val="single" w:color="BFC7D5" w:sz="4"/>
+              <w:left w:val="single" w:color="BFC7D5" w:sz="4"/>
+              <w:bottom w:val="single" w:color="BFC7D5" w:sz="4"/>
+              <w:right w:val="single" w:color="BFC7D5" w:sz="4"/>
+            </w:tcBorders>
+            <w:tcMar>
+              <w:top w:type="dxa" w:w="50"/>
+              <w:left w:type="dxa" w:w="80"/>
+              <w:bottom w:type="dxa" w:w="50"/>
+              <w:right w:type="dxa" w:w="80"/>
+            </w:tcMar>
+          </w:tcPr>
+          <w:p>
+            <w:r>
+              <w:rPr>
+                <w:b w:val="false"/>
+                <w:bCs w:val="false"/>
+                <w:sz w:val="18"/>
+                <w:szCs w:val="18"/>
+              </w:rPr>
+              <w:t xml:space="preserve">0</w:t>
+            </w:r>
+          </w:p>
+        </w:tc>
+      </w:tr>
+      <w:tr>
+        <w:tc>
+          <w:tcPr>
+            <w:tcW w:type="dxa" w:w="3277"/>
+            <w:tcBorders>
+              <w:top w:val="single" w:color="BFC7D5" w:sz="4"/>
+              <w:left w:val="single" w:color="BFC7D5" w:sz="4"/>
+              <w:bottom w:val="single" w:color="BFC7D5" w:sz="4"/>
+              <w:right w:val="single" w:color="BFC7D5" w:sz="4"/>
+            </w:tcBorders>
+            <w:tcMar>
+              <w:top w:type="dxa" w:w="50"/>
+              <w:left w:type="dxa" w:w="80"/>
+              <w:bottom w:type="dxa" w:w="50"/>
+              <w:right w:type="dxa" w:w="80"/>
+            </w:tcMar>
+          </w:tcPr>
+          <w:p>
+            <w:r>
+              <w:rPr>
+                <w:b w:val="false"/>
+                <w:bCs w:val="false"/>
+                <w:sz w:val="18"/>
+                <w:szCs w:val="18"/>
+              </w:rPr>
+              <w:t xml:space="preserve">Kennungsvergabe</w:t>
+            </w:r>
+          </w:p>
+        </w:tc>
+        <w:tc>
+          <w:tcPr>
+            <w:tcW w:type="dxa" w:w="2506"/>
+            <w:tcBorders>
+              <w:top w:val="single" w:color="BFC7D5" w:sz="4"/>
+              <w:left w:val="single" w:color="BFC7D5" w:sz="4"/>
+              <w:bottom w:val="single" w:color="BFC7D5" w:sz="4"/>
+              <w:right w:val="single" w:color="BFC7D5" w:sz="4"/>
+            </w:tcBorders>
+            <w:tcMar>
+              <w:top w:type="dxa" w:w="50"/>
+              <w:left w:type="dxa" w:w="80"/>
+              <w:bottom w:type="dxa" w:w="50"/>
+              <w:right w:type="dxa" w:w="80"/>
+            </w:tcMar>
+          </w:tcPr>
+          <w:p>
+            <w:r>
+              <w:rPr>
+                <w:b w:val="false"/>
+                <w:bCs w:val="false"/>
+                <w:sz w:val="18"/>
+                <w:szCs w:val="18"/>
+              </w:rPr>
+              <w:t xml:space="preserve">db-ids.test.js</w:t>
+            </w:r>
+          </w:p>
+        </w:tc>
+        <w:tc>
+          <w:tcPr>
+            <w:tcW w:type="dxa" w:w="1157"/>
+            <w:tcBorders>
+              <w:top w:val="single" w:color="BFC7D5" w:sz="4"/>
+              <w:left w:val="single" w:color="BFC7D5" w:sz="4"/>
+              <w:bottom w:val="single" w:color="BFC7D5" w:sz="4"/>
+              <w:right w:val="single" w:color="BFC7D5" w:sz="4"/>
+            </w:tcBorders>
+            <w:tcMar>
+              <w:top w:type="dxa" w:w="50"/>
+              <w:left w:type="dxa" w:w="80"/>
+              <w:bottom w:type="dxa" w:w="50"/>
+              <w:right w:type="dxa" w:w="80"/>
+            </w:tcMar>
+          </w:tcPr>
+          <w:p>
+            <w:r>
+              <w:rPr>
+                <w:b w:val="false"/>
+                <w:bCs w:val="false"/>
+                <w:sz w:val="18"/>
+                <w:szCs w:val="18"/>
+              </w:rPr>
+              <w:t xml:space="preserve">1</w:t>
+            </w:r>
+          </w:p>
+        </w:tc>
+        <w:tc>
+          <w:tcPr>
+            <w:tcW w:type="dxa" w:w="1349"/>
+            <w:tcBorders>
+              <w:top w:val="single" w:color="BFC7D5" w:sz="4"/>
+              <w:left w:val="single" w:color="BFC7D5" w:sz="4"/>
+              <w:bottom w:val="single" w:color="BFC7D5" w:sz="4"/>
+              <w:right w:val="single" w:color="BFC7D5" w:sz="4"/>
+            </w:tcBorders>
+            <w:tcMar>
+              <w:top w:type="dxa" w:w="50"/>
+              <w:left w:type="dxa" w:w="80"/>
+              <w:bottom w:type="dxa" w:w="50"/>
+              <w:right w:type="dxa" w:w="80"/>
+            </w:tcMar>
+          </w:tcPr>
+          <w:p>
+            <w:r>
+              <w:rPr>
+                <w:b w:val="false"/>
+                <w:bCs w:val="false"/>
+                <w:sz w:val="18"/>
+                <w:szCs w:val="18"/>
+              </w:rPr>
+              <w:t xml:space="preserve">1</w:t>
+            </w:r>
+          </w:p>
+        </w:tc>
+        <w:tc>
+          <w:tcPr>
+            <w:tcW w:type="dxa" w:w="1349"/>
+            <w:tcBorders>
+              <w:top w:val="single" w:color="BFC7D5" w:sz="4"/>
+              <w:left w:val="single" w:color="BFC7D5" w:sz="4"/>
+              <w:bottom w:val="single" w:color="BFC7D5" w:sz="4"/>
+              <w:right w:val="single" w:color="BFC7D5" w:sz="4"/>
+            </w:tcBorders>
+            <w:tcMar>
+              <w:top w:type="dxa" w:w="50"/>
+              <w:left w:type="dxa" w:w="80"/>
+              <w:bottom w:type="dxa" w:w="50"/>
+              <w:right w:type="dxa" w:w="80"/>
+            </w:tcMar>
+          </w:tcPr>
+          <w:p>
+            <w:r>
+              <w:rPr>
+                <w:b w:val="false"/>
+                <w:bCs w:val="false"/>
+                <w:sz w:val="18"/>
+                <w:szCs w:val="18"/>
+              </w:rPr>
+              <w:t xml:space="preserve">0</w:t>
+            </w:r>
+          </w:p>
+        </w:tc>
+      </w:tr>
+      <w:tr>
+        <w:tc>
+          <w:tcPr>
+            <w:tcW w:type="dxa" w:w="3277"/>
+            <w:tcBorders>
+              <w:top w:val="single" w:color="BFC7D5" w:sz="4"/>
+              <w:left w:val="single" w:color="BFC7D5" w:sz="4"/>
+              <w:bottom w:val="single" w:color="BFC7D5" w:sz="4"/>
+              <w:right w:val="single" w:color="BFC7D5" w:sz="4"/>
+            </w:tcBorders>
+            <w:tcMar>
+              <w:top w:type="dxa" w:w="50"/>
+              <w:left w:type="dxa" w:w="80"/>
+              <w:bottom w:type="dxa" w:w="50"/>
+              <w:right w:type="dxa" w:w="80"/>
+            </w:tcMar>
+          </w:tcPr>
+          <w:p>
+            <w:r>
+              <w:rPr>
+                <w:b w:val="false"/>
+                <w:bCs w:val="false"/>
+                <w:sz w:val="18"/>
+                <w:szCs w:val="18"/>
+              </w:rPr>
+              <w:t xml:space="preserve">Domänenpakete und Demo</w:t>
+            </w:r>
+          </w:p>
+        </w:tc>
+        <w:tc>
+          <w:tcPr>
+            <w:tcW w:type="dxa" w:w="2506"/>
+            <w:tcBorders>
+              <w:top w:val="single" w:color="BFC7D5" w:sz="4"/>
+              <w:left w:val="single" w:color="BFC7D5" w:sz="4"/>
+              <w:bottom w:val="single" w:color="BFC7D5" w:sz="4"/>
+              <w:right w:val="single" w:color="BFC7D5" w:sz="4"/>
+            </w:tcBorders>
+            <w:tcMar>
+              <w:top w:type="dxa" w:w="50"/>
+              <w:left w:type="dxa" w:w="80"/>
+              <w:bottom w:type="dxa" w:w="50"/>
+              <w:right w:type="dxa" w:w="80"/>
+            </w:tcMar>
+          </w:tcPr>
+          <w:p>
+            <w:r>
+              <w:rPr>
+                <w:b w:val="false"/>
+                <w:bCs w:val="false"/>
+                <w:sz w:val="18"/>
+                <w:szCs w:val="18"/>
+              </w:rPr>
+              <w:t xml:space="preserve">domains.test.js</w:t>
+            </w:r>
+          </w:p>
+        </w:tc>
+        <w:tc>
+          <w:tcPr>
+            <w:tcW w:type="dxa" w:w="1157"/>
+            <w:tcBorders>
+              <w:top w:val="single" w:color="BFC7D5" w:sz="4"/>
+              <w:left w:val="single" w:color="BFC7D5" w:sz="4"/>
+              <w:bottom w:val="single" w:color="BFC7D5" w:sz="4"/>
+              <w:right w:val="single" w:color="BFC7D5" w:sz="4"/>
+            </w:tcBorders>
+            <w:tcMar>
+              <w:top w:type="dxa" w:w="50"/>
+              <w:left w:type="dxa" w:w="80"/>
+              <w:bottom w:type="dxa" w:w="50"/>
+              <w:right w:type="dxa" w:w="80"/>
+            </w:tcMar>
+          </w:tcPr>
+          <w:p>
+            <w:r>
+              <w:rPr>
+                <w:b w:val="false"/>
+                <w:bCs w:val="false"/>
+                <w:sz w:val="18"/>
+                <w:szCs w:val="18"/>
+              </w:rPr>
+              <w:t xml:space="preserve">8</w:t>
+            </w:r>
+          </w:p>
+        </w:tc>
+        <w:tc>
+          <w:tcPr>
+            <w:tcW w:type="dxa" w:w="1349"/>
+            <w:tcBorders>
+              <w:top w:val="single" w:color="BFC7D5" w:sz="4"/>
+              <w:left w:val="single" w:color="BFC7D5" w:sz="4"/>
+              <w:bottom w:val="single" w:color="BFC7D5" w:sz="4"/>
+              <w:right w:val="single" w:color="BFC7D5" w:sz="4"/>
+            </w:tcBorders>
+            <w:tcMar>
+              <w:top w:type="dxa" w:w="50"/>
+              <w:left w:type="dxa" w:w="80"/>
+              <w:bottom w:type="dxa" w:w="50"/>
+              <w:right w:type="dxa" w:w="80"/>
+            </w:tcMar>
+          </w:tcPr>
+          <w:p>
+            <w:r>
+              <w:rPr>
+                <w:b w:val="false"/>
+                <w:bCs w:val="false"/>
+                <w:sz w:val="18"/>
+                <w:szCs w:val="18"/>
+              </w:rPr>
+              <w:t xml:space="preserve">8</w:t>
+            </w:r>
+          </w:p>
+        </w:tc>
+        <w:tc>
+          <w:tcPr>
+            <w:tcW w:type="dxa" w:w="1349"/>
+            <w:tcBorders>
+              <w:top w:val="single" w:color="BFC7D5" w:sz="4"/>
+              <w:left w:val="single" w:color="BFC7D5" w:sz="4"/>
+              <w:bottom w:val="single" w:color="BFC7D5" w:sz="4"/>
+              <w:right w:val="single" w:color="BFC7D5" w:sz="4"/>
+            </w:tcBorders>
+            <w:tcMar>
+              <w:top w:type="dxa" w:w="50"/>
+              <w:left w:type="dxa" w:w="80"/>
+              <w:bottom w:type="dxa" w:w="50"/>
+              <w:right w:type="dxa" w:w="80"/>
+            </w:tcMar>
+          </w:tcPr>
+          <w:p>
+            <w:r>
+              <w:rPr>
+                <w:b w:val="false"/>
+                <w:bCs w:val="false"/>
+                <w:sz w:val="18"/>
+                <w:szCs w:val="18"/>
+              </w:rPr>
+              <w:t xml:space="preserve">0</w:t>
+            </w:r>
+          </w:p>
+        </w:tc>
+      </w:tr>
+      <w:tr>
+        <w:tc>
+          <w:tcPr>
+            <w:tcW w:type="dxa" w:w="3277"/>
+            <w:tcBorders>
+              <w:top w:val="single" w:color="BFC7D5" w:sz="4"/>
+              <w:left w:val="single" w:color="BFC7D5" w:sz="4"/>
+              <w:bottom w:val="single" w:color="BFC7D5" w:sz="4"/>
+              <w:right w:val="single" w:color="BFC7D5" w:sz="4"/>
+            </w:tcBorders>
+            <w:tcMar>
+              <w:top w:type="dxa" w:w="50"/>
+              <w:left w:type="dxa" w:w="80"/>
+              <w:bottom w:type="dxa" w:w="50"/>
+              <w:right w:type="dxa" w:w="80"/>
+            </w:tcMar>
+          </w:tcPr>
+          <w:p>
+            <w:r>
+              <w:rPr>
+                <w:b w:val="false"/>
+                <w:bCs w:val="false"/>
+                <w:sz w:val="18"/>
+                <w:szCs w:val="18"/>
+              </w:rPr>
+              <w:t xml:space="preserve">KI-Orchestrierung</w:t>
+            </w:r>
+          </w:p>
+        </w:tc>
+        <w:tc>
+          <w:tcPr>
+            <w:tcW w:type="dxa" w:w="2506"/>
+            <w:tcBorders>
+              <w:top w:val="single" w:color="BFC7D5" w:sz="4"/>
+              <w:left w:val="single" w:color="BFC7D5" w:sz="4"/>
+              <w:bottom w:val="single" w:color="BFC7D5" w:sz="4"/>
+              <w:right w:val="single" w:color="BFC7D5" w:sz="4"/>
+            </w:tcBorders>
+            <w:tcMar>
+              <w:top w:type="dxa" w:w="50"/>
+              <w:left w:type="dxa" w:w="80"/>
+              <w:bottom w:type="dxa" w:w="50"/>
+              <w:right w:type="dxa" w:w="80"/>
+            </w:tcMar>
+          </w:tcPr>
+          <w:p>
+            <w:r>
+              <w:rPr>
+                <w:b w:val="false"/>
+                <w:bCs w:val="false"/>
+                <w:sz w:val="18"/>
+                <w:szCs w:val="18"/>
+              </w:rPr>
+              <w:t xml:space="preserve">engine.test.js</w:t>
+            </w:r>
+          </w:p>
+        </w:tc>
+        <w:tc>
+          <w:tcPr>
+            <w:tcW w:type="dxa" w:w="1157"/>
+            <w:tcBorders>
+              <w:top w:val="single" w:color="BFC7D5" w:sz="4"/>
+              <w:left w:val="single" w:color="BFC7D5" w:sz="4"/>
+              <w:bottom w:val="single" w:color="BFC7D5" w:sz="4"/>
+              <w:right w:val="single" w:color="BFC7D5" w:sz="4"/>
+            </w:tcBorders>
+            <w:tcMar>
+              <w:top w:type="dxa" w:w="50"/>
+              <w:left w:type="dxa" w:w="80"/>
+              <w:bottom w:type="dxa" w:w="50"/>
+              <w:right w:type="dxa" w:w="80"/>
+            </w:tcMar>
+          </w:tcPr>
+          <w:p>
+            <w:r>
+              <w:rPr>
+                <w:b w:val="false"/>
+                <w:bCs w:val="false"/>
+                <w:sz w:val="18"/>
+                <w:szCs w:val="18"/>
+              </w:rPr>
+              <w:t xml:space="preserve">5</w:t>
+            </w:r>
+          </w:p>
+        </w:tc>
+        <w:tc>
+          <w:tcPr>
+            <w:tcW w:type="dxa" w:w="1349"/>
+            <w:tcBorders>
+              <w:top w:val="single" w:color="BFC7D5" w:sz="4"/>
+              <w:left w:val="single" w:color="BFC7D5" w:sz="4"/>
+              <w:bottom w:val="single" w:color="BFC7D5" w:sz="4"/>
+              <w:right w:val="single" w:color="BFC7D5" w:sz="4"/>
+            </w:tcBorders>
+            <w:tcMar>
+              <w:top w:type="dxa" w:w="50"/>
+              <w:left w:type="dxa" w:w="80"/>
+              <w:bottom w:type="dxa" w:w="50"/>
+              <w:right w:type="dxa" w:w="80"/>
+            </w:tcMar>
+          </w:tcPr>
+          <w:p>
+            <w:r>
+              <w:rPr>
+                <w:b w:val="false"/>
+                <w:bCs w:val="false"/>
+                <w:sz w:val="18"/>
+                <w:szCs w:val="18"/>
+              </w:rPr>
+              <w:t xml:space="preserve">5</w:t>
+            </w:r>
+          </w:p>
+        </w:tc>
+        <w:tc>
+          <w:tcPr>
+            <w:tcW w:type="dxa" w:w="1349"/>
+            <w:tcBorders>
+              <w:top w:val="single" w:color="BFC7D5" w:sz="4"/>
+              <w:left w:val="single" w:color="BFC7D5" w:sz="4"/>
+              <w:bottom w:val="single" w:color="BFC7D5" w:sz="4"/>
+              <w:right w:val="single" w:color="BFC7D5" w:sz="4"/>
+            </w:tcBorders>
+            <w:tcMar>
+              <w:top w:type="dxa" w:w="50"/>
+              <w:left w:type="dxa" w:w="80"/>
+              <w:bottom w:type="dxa" w:w="50"/>
+              <w:right w:type="dxa" w:w="80"/>
+            </w:tcMar>
+          </w:tcPr>
+          <w:p>
+            <w:r>
+              <w:rPr>
+                <w:b w:val="false"/>
+                <w:bCs w:val="false"/>
+                <w:sz w:val="18"/>
+                <w:szCs w:val="18"/>
+              </w:rPr>
+              <w:t xml:space="preserve">0</w:t>
+            </w:r>
+          </w:p>
+        </w:tc>
+      </w:tr>
+      <w:tr>
+        <w:tc>
+          <w:tcPr>
+            <w:tcW w:type="dxa" w:w="3277"/>
+            <w:tcBorders>
+              <w:top w:val="single" w:color="BFC7D5" w:sz="4"/>
+              <w:left w:val="single" w:color="BFC7D5" w:sz="4"/>
+              <w:bottom w:val="single" w:color="BFC7D5" w:sz="4"/>
+              <w:right w:val="single" w:color="BFC7D5" w:sz="4"/>
+            </w:tcBorders>
+            <w:tcMar>
+              <w:top w:type="dxa" w:w="50"/>
+              <w:left w:type="dxa" w:w="80"/>
+              <w:bottom w:type="dxa" w:w="50"/>
+              <w:right w:type="dxa" w:w="80"/>
+            </w:tcMar>
+          </w:tcPr>
+          <w:p>
+            <w:r>
+              <w:rPr>
+                <w:b w:val="false"/>
+                <w:bCs w:val="false"/>
+                <w:sz w:val="18"/>
+                <w:szCs w:val="18"/>
+              </w:rPr>
+              <w:t xml:space="preserve">Import und Kennungen</w:t>
+            </w:r>
+          </w:p>
+        </w:tc>
+        <w:tc>
+          <w:tcPr>
+            <w:tcW w:type="dxa" w:w="2506"/>
+            <w:tcBorders>
+              <w:top w:val="single" w:color="BFC7D5" w:sz="4"/>
+              <w:left w:val="single" w:color="BFC7D5" w:sz="4"/>
+              <w:bottom w:val="single" w:color="BFC7D5" w:sz="4"/>
+              <w:right w:val="single" w:color="BFC7D5" w:sz="4"/>
+            </w:tcBorders>
+            <w:tcMar>
+              <w:top w:type="dxa" w:w="50"/>
+              <w:left w:type="dxa" w:w="80"/>
+              <w:bottom w:type="dxa" w:w="50"/>
+              <w:right w:type="dxa" w:w="80"/>
+            </w:tcMar>
+          </w:tcPr>
+          <w:p>
+            <w:r>
+              <w:rPr>
+                <w:b w:val="false"/>
+                <w:bCs w:val="false"/>
+                <w:sz w:val="18"/>
+                <w:szCs w:val="18"/>
+              </w:rPr>
+              <w:t xml:space="preserve">import-ids.test.js</w:t>
+            </w:r>
+          </w:p>
+        </w:tc>
+        <w:tc>
+          <w:tcPr>
+            <w:tcW w:type="dxa" w:w="1157"/>
+            <w:tcBorders>
+              <w:top w:val="single" w:color="BFC7D5" w:sz="4"/>
+              <w:left w:val="single" w:color="BFC7D5" w:sz="4"/>
+              <w:bottom w:val="single" w:color="BFC7D5" w:sz="4"/>
+              <w:right w:val="single" w:color="BFC7D5" w:sz="4"/>
+            </w:tcBorders>
+            <w:tcMar>
+              <w:top w:type="dxa" w:w="50"/>
+              <w:left w:type="dxa" w:w="80"/>
+              <w:bottom w:type="dxa" w:w="50"/>
+              <w:right w:type="dxa" w:w="80"/>
+            </w:tcMar>
+          </w:tcPr>
+          <w:p>
+            <w:r>
+              <w:rPr>
+                <w:b w:val="false"/>
+                <w:bCs w:val="false"/>
+                <w:sz w:val="18"/>
+                <w:szCs w:val="18"/>
+              </w:rPr>
               <w:t xml:space="preserve">2</w:t>
             </w:r>
           </w:p>
@@ -3783,7 +4665,7 @@
                 <w:sz w:val="18"/>
                 <w:szCs w:val="18"/>
               </w:rPr>
-              <w:t xml:space="preserve">Kalibrierung</w:t>
+              <w:t xml:space="preserve">Lokale KI-Anbieter und Vertraulichkeit</w:t>
             </w:r>
           </w:p>
         </w:tc>
@@ -3811,7 +4693,7 @@
                 <w:sz w:val="18"/>
                 <w:szCs w:val="18"/>
               </w:rPr>
-              <w:t xml:space="preserve">calibration.test.js</w:t>
+              <w:t xml:space="preserve">local-providers.test.js</w:t>
             </w:r>
           </w:p>
         </w:tc>
@@ -3839,6 +4721,432 @@
                 <w:sz w:val="18"/>
                 <w:szCs w:val="18"/>
               </w:rPr>
+              <w:t xml:space="preserve">11</w:t>
+            </w:r>
+          </w:p>
+        </w:tc>
+        <w:tc>
+          <w:tcPr>
+            <w:tcW w:type="dxa" w:w="1349"/>
+            <w:tcBorders>
+              <w:top w:val="single" w:color="BFC7D5" w:sz="4"/>
+              <w:left w:val="single" w:color="BFC7D5" w:sz="4"/>
+              <w:bottom w:val="single" w:color="BFC7D5" w:sz="4"/>
+              <w:right w:val="single" w:color="BFC7D5" w:sz="4"/>
+            </w:tcBorders>
+            <w:tcMar>
+              <w:top w:type="dxa" w:w="50"/>
+              <w:left w:type="dxa" w:w="80"/>
+              <w:bottom w:type="dxa" w:w="50"/>
+              <w:right w:type="dxa" w:w="80"/>
+            </w:tcMar>
+          </w:tcPr>
+          <w:p>
+            <w:r>
+              <w:rPr>
+                <w:b w:val="false"/>
+                <w:bCs w:val="false"/>
+                <w:sz w:val="18"/>
+                <w:szCs w:val="18"/>
+              </w:rPr>
+              <w:t xml:space="preserve">11</w:t>
+            </w:r>
+          </w:p>
+        </w:tc>
+        <w:tc>
+          <w:tcPr>
+            <w:tcW w:type="dxa" w:w="1349"/>
+            <w:tcBorders>
+              <w:top w:val="single" w:color="BFC7D5" w:sz="4"/>
+              <w:left w:val="single" w:color="BFC7D5" w:sz="4"/>
+              <w:bottom w:val="single" w:color="BFC7D5" w:sz="4"/>
+              <w:right w:val="single" w:color="BFC7D5" w:sz="4"/>
+            </w:tcBorders>
+            <w:tcMar>
+              <w:top w:type="dxa" w:w="50"/>
+              <w:left w:type="dxa" w:w="80"/>
+              <w:bottom w:type="dxa" w:w="50"/>
+              <w:right w:type="dxa" w:w="80"/>
+            </w:tcMar>
+          </w:tcPr>
+          <w:p>
+            <w:r>
+              <w:rPr>
+                <w:b w:val="false"/>
+                <w:bCs w:val="false"/>
+                <w:sz w:val="18"/>
+                <w:szCs w:val="18"/>
+              </w:rPr>
+              <w:t xml:space="preserve">0</w:t>
+            </w:r>
+          </w:p>
+        </w:tc>
+      </w:tr>
+      <w:tr>
+        <w:tc>
+          <w:tcPr>
+            <w:tcW w:type="dxa" w:w="3277"/>
+            <w:tcBorders>
+              <w:top w:val="single" w:color="BFC7D5" w:sz="4"/>
+              <w:left w:val="single" w:color="BFC7D5" w:sz="4"/>
+              <w:bottom w:val="single" w:color="BFC7D5" w:sz="4"/>
+              <w:right w:val="single" w:color="BFC7D5" w:sz="4"/>
+            </w:tcBorders>
+            <w:tcMar>
+              <w:top w:type="dxa" w:w="50"/>
+              <w:left w:type="dxa" w:w="80"/>
+              <w:bottom w:type="dxa" w:w="50"/>
+              <w:right w:type="dxa" w:w="80"/>
+            </w:tcMar>
+          </w:tcPr>
+          <w:p>
+            <w:r>
+              <w:rPr>
+                <w:b w:val="false"/>
+                <w:bCs w:val="false"/>
+                <w:sz w:val="18"/>
+                <w:szCs w:val="18"/>
+              </w:rPr>
+              <w:t xml:space="preserve">Normativer Kern (model.js)</w:t>
+            </w:r>
+          </w:p>
+        </w:tc>
+        <w:tc>
+          <w:tcPr>
+            <w:tcW w:type="dxa" w:w="2506"/>
+            <w:tcBorders>
+              <w:top w:val="single" w:color="BFC7D5" w:sz="4"/>
+              <w:left w:val="single" w:color="BFC7D5" w:sz="4"/>
+              <w:bottom w:val="single" w:color="BFC7D5" w:sz="4"/>
+              <w:right w:val="single" w:color="BFC7D5" w:sz="4"/>
+            </w:tcBorders>
+            <w:tcMar>
+              <w:top w:type="dxa" w:w="50"/>
+              <w:left w:type="dxa" w:w="80"/>
+              <w:bottom w:type="dxa" w:w="50"/>
+              <w:right w:type="dxa" w:w="80"/>
+            </w:tcMar>
+          </w:tcPr>
+          <w:p>
+            <w:r>
+              <w:rPr>
+                <w:b w:val="false"/>
+                <w:bCs w:val="false"/>
+                <w:sz w:val="18"/>
+                <w:szCs w:val="18"/>
+              </w:rPr>
+              <w:t xml:space="preserve">model.test.js</w:t>
+            </w:r>
+          </w:p>
+        </w:tc>
+        <w:tc>
+          <w:tcPr>
+            <w:tcW w:type="dxa" w:w="1157"/>
+            <w:tcBorders>
+              <w:top w:val="single" w:color="BFC7D5" w:sz="4"/>
+              <w:left w:val="single" w:color="BFC7D5" w:sz="4"/>
+              <w:bottom w:val="single" w:color="BFC7D5" w:sz="4"/>
+              <w:right w:val="single" w:color="BFC7D5" w:sz="4"/>
+            </w:tcBorders>
+            <w:tcMar>
+              <w:top w:type="dxa" w:w="50"/>
+              <w:left w:type="dxa" w:w="80"/>
+              <w:bottom w:type="dxa" w:w="50"/>
+              <w:right w:type="dxa" w:w="80"/>
+            </w:tcMar>
+          </w:tcPr>
+          <w:p>
+            <w:r>
+              <w:rPr>
+                <w:b w:val="false"/>
+                <w:bCs w:val="false"/>
+                <w:sz w:val="18"/>
+                <w:szCs w:val="18"/>
+              </w:rPr>
+              <w:t xml:space="preserve">20</w:t>
+            </w:r>
+          </w:p>
+        </w:tc>
+        <w:tc>
+          <w:tcPr>
+            <w:tcW w:type="dxa" w:w="1349"/>
+            <w:tcBorders>
+              <w:top w:val="single" w:color="BFC7D5" w:sz="4"/>
+              <w:left w:val="single" w:color="BFC7D5" w:sz="4"/>
+              <w:bottom w:val="single" w:color="BFC7D5" w:sz="4"/>
+              <w:right w:val="single" w:color="BFC7D5" w:sz="4"/>
+            </w:tcBorders>
+            <w:tcMar>
+              <w:top w:type="dxa" w:w="50"/>
+              <w:left w:type="dxa" w:w="80"/>
+              <w:bottom w:type="dxa" w:w="50"/>
+              <w:right w:type="dxa" w:w="80"/>
+            </w:tcMar>
+          </w:tcPr>
+          <w:p>
+            <w:r>
+              <w:rPr>
+                <w:b w:val="false"/>
+                <w:bCs w:val="false"/>
+                <w:sz w:val="18"/>
+                <w:szCs w:val="18"/>
+              </w:rPr>
+              <w:t xml:space="preserve">20</w:t>
+            </w:r>
+          </w:p>
+        </w:tc>
+        <w:tc>
+          <w:tcPr>
+            <w:tcW w:type="dxa" w:w="1349"/>
+            <w:tcBorders>
+              <w:top w:val="single" w:color="BFC7D5" w:sz="4"/>
+              <w:left w:val="single" w:color="BFC7D5" w:sz="4"/>
+              <w:bottom w:val="single" w:color="BFC7D5" w:sz="4"/>
+              <w:right w:val="single" w:color="BFC7D5" w:sz="4"/>
+            </w:tcBorders>
+            <w:tcMar>
+              <w:top w:type="dxa" w:w="50"/>
+              <w:left w:type="dxa" w:w="80"/>
+              <w:bottom w:type="dxa" w:w="50"/>
+              <w:right w:type="dxa" w:w="80"/>
+            </w:tcMar>
+          </w:tcPr>
+          <w:p>
+            <w:r>
+              <w:rPr>
+                <w:b w:val="false"/>
+                <w:bCs w:val="false"/>
+                <w:sz w:val="18"/>
+                <w:szCs w:val="18"/>
+              </w:rPr>
+              <w:t xml:space="preserve">0</w:t>
+            </w:r>
+          </w:p>
+        </w:tc>
+      </w:tr>
+      <w:tr>
+        <w:tc>
+          <w:tcPr>
+            <w:tcW w:type="dxa" w:w="3277"/>
+            <w:tcBorders>
+              <w:top w:val="single" w:color="BFC7D5" w:sz="4"/>
+              <w:left w:val="single" w:color="BFC7D5" w:sz="4"/>
+              <w:bottom w:val="single" w:color="BFC7D5" w:sz="4"/>
+              <w:right w:val="single" w:color="BFC7D5" w:sz="4"/>
+            </w:tcBorders>
+            <w:tcMar>
+              <w:top w:type="dxa" w:w="50"/>
+              <w:left w:type="dxa" w:w="80"/>
+              <w:bottom w:type="dxa" w:w="50"/>
+              <w:right w:type="dxa" w:w="80"/>
+            </w:tcMar>
+          </w:tcPr>
+          <w:p>
+            <w:r>
+              <w:rPr>
+                <w:b w:val="false"/>
+                <w:bCs w:val="false"/>
+                <w:sz w:val="18"/>
+                <w:szCs w:val="18"/>
+              </w:rPr>
+              <w:t xml:space="preserve">Projektprofil</w:t>
+            </w:r>
+          </w:p>
+        </w:tc>
+        <w:tc>
+          <w:tcPr>
+            <w:tcW w:type="dxa" w:w="2506"/>
+            <w:tcBorders>
+              <w:top w:val="single" w:color="BFC7D5" w:sz="4"/>
+              <w:left w:val="single" w:color="BFC7D5" w:sz="4"/>
+              <w:bottom w:val="single" w:color="BFC7D5" w:sz="4"/>
+              <w:right w:val="single" w:color="BFC7D5" w:sz="4"/>
+            </w:tcBorders>
+            <w:tcMar>
+              <w:top w:type="dxa" w:w="50"/>
+              <w:left w:type="dxa" w:w="80"/>
+              <w:bottom w:type="dxa" w:w="50"/>
+              <w:right w:type="dxa" w:w="80"/>
+            </w:tcMar>
+          </w:tcPr>
+          <w:p>
+            <w:r>
+              <w:rPr>
+                <w:b w:val="false"/>
+                <w:bCs w:val="false"/>
+                <w:sz w:val="18"/>
+                <w:szCs w:val="18"/>
+              </w:rPr>
+              <w:t xml:space="preserve">profile.test.js</w:t>
+            </w:r>
+          </w:p>
+        </w:tc>
+        <w:tc>
+          <w:tcPr>
+            <w:tcW w:type="dxa" w:w="1157"/>
+            <w:tcBorders>
+              <w:top w:val="single" w:color="BFC7D5" w:sz="4"/>
+              <w:left w:val="single" w:color="BFC7D5" w:sz="4"/>
+              <w:bottom w:val="single" w:color="BFC7D5" w:sz="4"/>
+              <w:right w:val="single" w:color="BFC7D5" w:sz="4"/>
+            </w:tcBorders>
+            <w:tcMar>
+              <w:top w:type="dxa" w:w="50"/>
+              <w:left w:type="dxa" w:w="80"/>
+              <w:bottom w:type="dxa" w:w="50"/>
+              <w:right w:type="dxa" w:w="80"/>
+            </w:tcMar>
+          </w:tcPr>
+          <w:p>
+            <w:r>
+              <w:rPr>
+                <w:b w:val="false"/>
+                <w:bCs w:val="false"/>
+                <w:sz w:val="18"/>
+                <w:szCs w:val="18"/>
+              </w:rPr>
+              <w:t xml:space="preserve">10</w:t>
+            </w:r>
+          </w:p>
+        </w:tc>
+        <w:tc>
+          <w:tcPr>
+            <w:tcW w:type="dxa" w:w="1349"/>
+            <w:tcBorders>
+              <w:top w:val="single" w:color="BFC7D5" w:sz="4"/>
+              <w:left w:val="single" w:color="BFC7D5" w:sz="4"/>
+              <w:bottom w:val="single" w:color="BFC7D5" w:sz="4"/>
+              <w:right w:val="single" w:color="BFC7D5" w:sz="4"/>
+            </w:tcBorders>
+            <w:tcMar>
+              <w:top w:type="dxa" w:w="50"/>
+              <w:left w:type="dxa" w:w="80"/>
+              <w:bottom w:type="dxa" w:w="50"/>
+              <w:right w:type="dxa" w:w="80"/>
+            </w:tcMar>
+          </w:tcPr>
+          <w:p>
+            <w:r>
+              <w:rPr>
+                <w:b w:val="false"/>
+                <w:bCs w:val="false"/>
+                <w:sz w:val="18"/>
+                <w:szCs w:val="18"/>
+              </w:rPr>
+              <w:t xml:space="preserve">10</w:t>
+            </w:r>
+          </w:p>
+        </w:tc>
+        <w:tc>
+          <w:tcPr>
+            <w:tcW w:type="dxa" w:w="1349"/>
+            <w:tcBorders>
+              <w:top w:val="single" w:color="BFC7D5" w:sz="4"/>
+              <w:left w:val="single" w:color="BFC7D5" w:sz="4"/>
+              <w:bottom w:val="single" w:color="BFC7D5" w:sz="4"/>
+              <w:right w:val="single" w:color="BFC7D5" w:sz="4"/>
+            </w:tcBorders>
+            <w:tcMar>
+              <w:top w:type="dxa" w:w="50"/>
+              <w:left w:type="dxa" w:w="80"/>
+              <w:bottom w:type="dxa" w:w="50"/>
+              <w:right w:type="dxa" w:w="80"/>
+            </w:tcMar>
+          </w:tcPr>
+          <w:p>
+            <w:r>
+              <w:rPr>
+                <w:b w:val="false"/>
+                <w:bCs w:val="false"/>
+                <w:sz w:val="18"/>
+                <w:szCs w:val="18"/>
+              </w:rPr>
+              <w:t xml:space="preserve">0</w:t>
+            </w:r>
+          </w:p>
+        </w:tc>
+      </w:tr>
+      <w:tr>
+        <w:tc>
+          <w:tcPr>
+            <w:tcW w:type="dxa" w:w="3277"/>
+            <w:tcBorders>
+              <w:top w:val="single" w:color="BFC7D5" w:sz="4"/>
+              <w:left w:val="single" w:color="BFC7D5" w:sz="4"/>
+              <w:bottom w:val="single" w:color="BFC7D5" w:sz="4"/>
+              <w:right w:val="single" w:color="BFC7D5" w:sz="4"/>
+            </w:tcBorders>
+            <w:tcMar>
+              <w:top w:type="dxa" w:w="50"/>
+              <w:left w:type="dxa" w:w="80"/>
+              <w:bottom w:type="dxa" w:w="50"/>
+              <w:right w:type="dxa" w:w="80"/>
+            </w:tcMar>
+          </w:tcPr>
+          <w:p>
+            <w:r>
+              <w:rPr>
+                <w:b w:val="false"/>
+                <w:bCs w:val="false"/>
+                <w:sz w:val="18"/>
+                <w:szCs w:val="18"/>
+              </w:rPr>
+              <w:t xml:space="preserve">Referenzprojekt (Demo-Verhalten)</w:t>
+            </w:r>
+          </w:p>
+        </w:tc>
+        <w:tc>
+          <w:tcPr>
+            <w:tcW w:type="dxa" w:w="2506"/>
+            <w:tcBorders>
+              <w:top w:val="single" w:color="BFC7D5" w:sz="4"/>
+              <w:left w:val="single" w:color="BFC7D5" w:sz="4"/>
+              <w:bottom w:val="single" w:color="BFC7D5" w:sz="4"/>
+              <w:right w:val="single" w:color="BFC7D5" w:sz="4"/>
+            </w:tcBorders>
+            <w:tcMar>
+              <w:top w:type="dxa" w:w="50"/>
+              <w:left w:type="dxa" w:w="80"/>
+              <w:bottom w:type="dxa" w:w="50"/>
+              <w:right w:type="dxa" w:w="80"/>
+            </w:tcMar>
+          </w:tcPr>
+          <w:p>
+            <w:r>
+              <w:rPr>
+                <w:b w:val="false"/>
+                <w:bCs w:val="false"/>
+                <w:sz w:val="18"/>
+                <w:szCs w:val="18"/>
+              </w:rPr>
+              <w:t xml:space="preserve">reference-project.test.js</w:t>
+            </w:r>
+          </w:p>
+        </w:tc>
+        <w:tc>
+          <w:tcPr>
+            <w:tcW w:type="dxa" w:w="1157"/>
+            <w:tcBorders>
+              <w:top w:val="single" w:color="BFC7D5" w:sz="4"/>
+              <w:left w:val="single" w:color="BFC7D5" w:sz="4"/>
+              <w:bottom w:val="single" w:color="BFC7D5" w:sz="4"/>
+              <w:right w:val="single" w:color="BFC7D5" w:sz="4"/>
+            </w:tcBorders>
+            <w:tcMar>
+              <w:top w:type="dxa" w:w="50"/>
+              <w:left w:type="dxa" w:w="80"/>
+              <w:bottom w:type="dxa" w:w="50"/>
+              <w:right w:type="dxa" w:w="80"/>
+            </w:tcMar>
+          </w:tcPr>
+          <w:p>
+            <w:r>
+              <w:rPr>
+                <w:b w:val="false"/>
+                <w:bCs w:val="false"/>
+                <w:sz w:val="18"/>
+                <w:szCs w:val="18"/>
+              </w:rPr>
               <w:t xml:space="preserve">7</w:t>
             </w:r>
           </w:p>
@@ -3925,7 +5233,7 @@
                 <w:sz w:val="18"/>
                 <w:szCs w:val="18"/>
               </w:rPr>
-              <w:t xml:space="preserve">Domänenpakete und Demo</w:t>
+              <w:t xml:space="preserve">Berichte (Golden-Dateien)</w:t>
             </w:r>
           </w:p>
         </w:tc>
@@ -3953,7 +5261,7 @@
                 <w:sz w:val="18"/>
                 <w:szCs w:val="18"/>
               </w:rPr>
-              <w:t xml:space="preserve">domains.test.js</w:t>
+              <w:t xml:space="preserve">reports.test.js</w:t>
             </w:r>
           </w:p>
         </w:tc>
@@ -3981,7 +5289,7 @@
                 <w:sz w:val="18"/>
                 <w:szCs w:val="18"/>
               </w:rPr>
-              <w:t xml:space="preserve">8</w:t>
+              <w:t xml:space="preserve">13</w:t>
             </w:r>
           </w:p>
         </w:tc>
@@ -4009,7 +5317,7 @@
                 <w:sz w:val="18"/>
                 <w:szCs w:val="18"/>
               </w:rPr>
-              <w:t xml:space="preserve">8</w:t>
+              <w:t xml:space="preserve">13</w:t>
             </w:r>
           </w:p>
         </w:tc>
@@ -4067,7 +5375,7 @@
                 <w:sz w:val="18"/>
                 <w:szCs w:val="18"/>
               </w:rPr>
-              <w:t xml:space="preserve">KI-Orchestrierung</w:t>
+              <w:t xml:space="preserve">Security Stufe 1</w:t>
             </w:r>
           </w:p>
         </w:tc>
@@ -4095,7 +5403,7 @@
                 <w:sz w:val="18"/>
                 <w:szCs w:val="18"/>
               </w:rPr>
-              <w:t xml:space="preserve">engine.test.js</w:t>
+              <w:t xml:space="preserve">security.test.js</w:t>
             </w:r>
           </w:p>
         </w:tc>
@@ -4123,7 +5431,7 @@
                 <w:sz w:val="18"/>
                 <w:szCs w:val="18"/>
               </w:rPr>
-              <w:t xml:space="preserve">4</w:t>
+              <w:t xml:space="preserve">6</w:t>
             </w:r>
           </w:p>
         </w:tc>
@@ -4151,7 +5459,7 @@
                 <w:sz w:val="18"/>
                 <w:szCs w:val="18"/>
               </w:rPr>
-              <w:t xml:space="preserve">4</w:t>
+              <w:t xml:space="preserve">6</w:t>
             </w:r>
           </w:p>
         </w:tc>
@@ -4209,7 +5517,7 @@
                 <w:sz w:val="18"/>
                 <w:szCs w:val="18"/>
               </w:rPr>
-              <w:t xml:space="preserve">local-providers.test.js</w:t>
+              <w:t xml:space="preserve">Security Stufe 2</w:t>
             </w:r>
           </w:p>
         </w:tc>
@@ -4237,7 +5545,7 @@
                 <w:sz w:val="18"/>
                 <w:szCs w:val="18"/>
               </w:rPr>
-              <w:t xml:space="preserve">local-providers.test.js</w:t>
+              <w:t xml:space="preserve">threatlog.test.js</w:t>
             </w:r>
           </w:p>
         </w:tc>
@@ -4265,7 +5573,7 @@
                 <w:sz w:val="18"/>
                 <w:szCs w:val="18"/>
               </w:rPr>
-              <w:t xml:space="preserve">10</w:t>
+              <w:t xml:space="preserve">7</w:t>
             </w:r>
           </w:p>
         </w:tc>
@@ -4293,7 +5601,7 @@
                 <w:sz w:val="18"/>
                 <w:szCs w:val="18"/>
               </w:rPr>
-              <w:t xml:space="preserve">10</w:t>
+              <w:t xml:space="preserve">7</w:t>
             </w:r>
           </w:p>
         </w:tc>
@@ -4351,7 +5659,7 @@
                 <w:sz w:val="18"/>
                 <w:szCs w:val="18"/>
               </w:rPr>
-              <w:t xml:space="preserve">Normativer Kern (model.js)</w:t>
+              <w:t xml:space="preserve">Excel: Security-Blätter</w:t>
             </w:r>
           </w:p>
         </w:tc>
@@ -4379,7 +5687,7 @@
                 <w:sz w:val="18"/>
                 <w:szCs w:val="18"/>
               </w:rPr>
-              <w:t xml:space="preserve">model.test.js</w:t>
+              <w:t xml:space="preserve">xlsx-security.test.js</w:t>
             </w:r>
           </w:p>
         </w:tc>
@@ -4407,7 +5715,7 @@
                 <w:sz w:val="18"/>
                 <w:szCs w:val="18"/>
               </w:rPr>
-              <w:t xml:space="preserve">17</w:t>
+              <w:t xml:space="preserve">1</w:t>
             </w:r>
           </w:p>
         </w:tc>
@@ -4435,7 +5743,7 @@
                 <w:sz w:val="18"/>
                 <w:szCs w:val="18"/>
               </w:rPr>
-              <w:t xml:space="preserve">17</w:t>
+              <w:t xml:space="preserve">1</w:t>
             </w:r>
           </w:p>
         </w:tc>
@@ -4493,7 +5801,7 @@
                 <w:sz w:val="18"/>
                 <w:szCs w:val="18"/>
               </w:rPr>
-              <w:t xml:space="preserve">Projektprofil</w:t>
+              <w:t xml:space="preserve">Security Stufe 3</w:t>
             </w:r>
           </w:p>
         </w:tc>
@@ -4521,7 +5829,7 @@
                 <w:sz w:val="18"/>
                 <w:szCs w:val="18"/>
               </w:rPr>
-              <w:t xml:space="preserve">profile.test.js</w:t>
+              <w:t xml:space="preserve">zones.test.js</w:t>
             </w:r>
           </w:p>
         </w:tc>
@@ -4549,7 +5857,7 @@
                 <w:sz w:val="18"/>
                 <w:szCs w:val="18"/>
               </w:rPr>
-              <w:t xml:space="preserve">10</w:t>
+              <w:t xml:space="preserve">5</w:t>
             </w:r>
           </w:p>
         </w:tc>
@@ -4577,7 +5885,7 @@
                 <w:sz w:val="18"/>
                 <w:szCs w:val="18"/>
               </w:rPr>
-              <w:t xml:space="preserve">10</w:t>
+              <w:t xml:space="preserve">5</w:t>
             </w:r>
           </w:p>
         </w:tc>
@@ -4635,7 +5943,7 @@
                 <w:sz w:val="18"/>
                 <w:szCs w:val="18"/>
               </w:rPr>
-              <w:t xml:space="preserve">Referenzprojekt (Demo-Verhalten)</w:t>
+              <w:t xml:space="preserve">Summe</w:t>
             </w:r>
           </w:p>
         </w:tc>
@@ -4663,7 +5971,6 @@
                 <w:sz w:val="18"/>
                 <w:szCs w:val="18"/>
               </w:rPr>
-              <w:t xml:space="preserve">reference-project.test.js</w:t>
             </w:r>
           </w:p>
         </w:tc>
@@ -4691,7 +5998,7 @@
                 <w:sz w:val="18"/>
                 <w:szCs w:val="18"/>
               </w:rPr>
-              <w:t xml:space="preserve">7</w:t>
+              <w:t xml:space="preserve">107</w:t>
             </w:r>
           </w:p>
         </w:tc>
@@ -4719,717 +6026,7 @@
                 <w:sz w:val="18"/>
                 <w:szCs w:val="18"/>
               </w:rPr>
-              <w:t xml:space="preserve">7</w:t>
-            </w:r>
-          </w:p>
-        </w:tc>
-        <w:tc>
-          <w:tcPr>
-            <w:tcW w:type="dxa" w:w="1349"/>
-            <w:tcBorders>
-              <w:top w:val="single" w:color="BFC7D5" w:sz="4"/>
-              <w:left w:val="single" w:color="BFC7D5" w:sz="4"/>
-              <w:bottom w:val="single" w:color="BFC7D5" w:sz="4"/>
-              <w:right w:val="single" w:color="BFC7D5" w:sz="4"/>
-            </w:tcBorders>
-            <w:tcMar>
-              <w:top w:type="dxa" w:w="50"/>
-              <w:left w:type="dxa" w:w="80"/>
-              <w:bottom w:type="dxa" w:w="50"/>
-              <w:right w:type="dxa" w:w="80"/>
-            </w:tcMar>
-          </w:tcPr>
-          <w:p>
-            <w:r>
-              <w:rPr>
-                <w:b w:val="false"/>
-                <w:bCs w:val="false"/>
-                <w:sz w:val="18"/>
-                <w:szCs w:val="18"/>
-              </w:rPr>
-              <w:t xml:space="preserve">0</w:t>
-            </w:r>
-          </w:p>
-        </w:tc>
-      </w:tr>
-      <w:tr>
-        <w:tc>
-          <w:tcPr>
-            <w:tcW w:type="dxa" w:w="3277"/>
-            <w:tcBorders>
-              <w:top w:val="single" w:color="BFC7D5" w:sz="4"/>
-              <w:left w:val="single" w:color="BFC7D5" w:sz="4"/>
-              <w:bottom w:val="single" w:color="BFC7D5" w:sz="4"/>
-              <w:right w:val="single" w:color="BFC7D5" w:sz="4"/>
-            </w:tcBorders>
-            <w:tcMar>
-              <w:top w:type="dxa" w:w="50"/>
-              <w:left w:type="dxa" w:w="80"/>
-              <w:bottom w:type="dxa" w:w="50"/>
-              <w:right w:type="dxa" w:w="80"/>
-            </w:tcMar>
-          </w:tcPr>
-          <w:p>
-            <w:r>
-              <w:rPr>
-                <w:b w:val="false"/>
-                <w:bCs w:val="false"/>
-                <w:sz w:val="18"/>
-                <w:szCs w:val="18"/>
-              </w:rPr>
-              <w:t xml:space="preserve">Berichte (Golden-Dateien)</w:t>
-            </w:r>
-          </w:p>
-        </w:tc>
-        <w:tc>
-          <w:tcPr>
-            <w:tcW w:type="dxa" w:w="2506"/>
-            <w:tcBorders>
-              <w:top w:val="single" w:color="BFC7D5" w:sz="4"/>
-              <w:left w:val="single" w:color="BFC7D5" w:sz="4"/>
-              <w:bottom w:val="single" w:color="BFC7D5" w:sz="4"/>
-              <w:right w:val="single" w:color="BFC7D5" w:sz="4"/>
-            </w:tcBorders>
-            <w:tcMar>
-              <w:top w:type="dxa" w:w="50"/>
-              <w:left w:type="dxa" w:w="80"/>
-              <w:bottom w:type="dxa" w:w="50"/>
-              <w:right w:type="dxa" w:w="80"/>
-            </w:tcMar>
-          </w:tcPr>
-          <w:p>
-            <w:r>
-              <w:rPr>
-                <w:b w:val="false"/>
-                <w:bCs w:val="false"/>
-                <w:sz w:val="18"/>
-                <w:szCs w:val="18"/>
-              </w:rPr>
-              <w:t xml:space="preserve">reports.test.js</w:t>
-            </w:r>
-          </w:p>
-        </w:tc>
-        <w:tc>
-          <w:tcPr>
-            <w:tcW w:type="dxa" w:w="1157"/>
-            <w:tcBorders>
-              <w:top w:val="single" w:color="BFC7D5" w:sz="4"/>
-              <w:left w:val="single" w:color="BFC7D5" w:sz="4"/>
-              <w:bottom w:val="single" w:color="BFC7D5" w:sz="4"/>
-              <w:right w:val="single" w:color="BFC7D5" w:sz="4"/>
-            </w:tcBorders>
-            <w:tcMar>
-              <w:top w:type="dxa" w:w="50"/>
-              <w:left w:type="dxa" w:w="80"/>
-              <w:bottom w:type="dxa" w:w="50"/>
-              <w:right w:type="dxa" w:w="80"/>
-            </w:tcMar>
-          </w:tcPr>
-          <w:p>
-            <w:r>
-              <w:rPr>
-                <w:b w:val="false"/>
-                <w:bCs w:val="false"/>
-                <w:sz w:val="18"/>
-                <w:szCs w:val="18"/>
-              </w:rPr>
-              <w:t xml:space="preserve">13</w:t>
-            </w:r>
-          </w:p>
-        </w:tc>
-        <w:tc>
-          <w:tcPr>
-            <w:tcW w:type="dxa" w:w="1349"/>
-            <w:tcBorders>
-              <w:top w:val="single" w:color="BFC7D5" w:sz="4"/>
-              <w:left w:val="single" w:color="BFC7D5" w:sz="4"/>
-              <w:bottom w:val="single" w:color="BFC7D5" w:sz="4"/>
-              <w:right w:val="single" w:color="BFC7D5" w:sz="4"/>
-            </w:tcBorders>
-            <w:tcMar>
-              <w:top w:type="dxa" w:w="50"/>
-              <w:left w:type="dxa" w:w="80"/>
-              <w:bottom w:type="dxa" w:w="50"/>
-              <w:right w:type="dxa" w:w="80"/>
-            </w:tcMar>
-          </w:tcPr>
-          <w:p>
-            <w:r>
-              <w:rPr>
-                <w:b w:val="false"/>
-                <w:bCs w:val="false"/>
-                <w:sz w:val="18"/>
-                <w:szCs w:val="18"/>
-              </w:rPr>
-              <w:t xml:space="preserve">13</w:t>
-            </w:r>
-          </w:p>
-        </w:tc>
-        <w:tc>
-          <w:tcPr>
-            <w:tcW w:type="dxa" w:w="1349"/>
-            <w:tcBorders>
-              <w:top w:val="single" w:color="BFC7D5" w:sz="4"/>
-              <w:left w:val="single" w:color="BFC7D5" w:sz="4"/>
-              <w:bottom w:val="single" w:color="BFC7D5" w:sz="4"/>
-              <w:right w:val="single" w:color="BFC7D5" w:sz="4"/>
-            </w:tcBorders>
-            <w:tcMar>
-              <w:top w:type="dxa" w:w="50"/>
-              <w:left w:type="dxa" w:w="80"/>
-              <w:bottom w:type="dxa" w:w="50"/>
-              <w:right w:type="dxa" w:w="80"/>
-            </w:tcMar>
-          </w:tcPr>
-          <w:p>
-            <w:r>
-              <w:rPr>
-                <w:b w:val="false"/>
-                <w:bCs w:val="false"/>
-                <w:sz w:val="18"/>
-                <w:szCs w:val="18"/>
-              </w:rPr>
-              <w:t xml:space="preserve">0</w:t>
-            </w:r>
-          </w:p>
-        </w:tc>
-      </w:tr>
-      <w:tr>
-        <w:tc>
-          <w:tcPr>
-            <w:tcW w:type="dxa" w:w="3277"/>
-            <w:tcBorders>
-              <w:top w:val="single" w:color="BFC7D5" w:sz="4"/>
-              <w:left w:val="single" w:color="BFC7D5" w:sz="4"/>
-              <w:bottom w:val="single" w:color="BFC7D5" w:sz="4"/>
-              <w:right w:val="single" w:color="BFC7D5" w:sz="4"/>
-            </w:tcBorders>
-            <w:tcMar>
-              <w:top w:type="dxa" w:w="50"/>
-              <w:left w:type="dxa" w:w="80"/>
-              <w:bottom w:type="dxa" w:w="50"/>
-              <w:right w:type="dxa" w:w="80"/>
-            </w:tcMar>
-          </w:tcPr>
-          <w:p>
-            <w:r>
-              <w:rPr>
-                <w:b w:val="false"/>
-                <w:bCs w:val="false"/>
-                <w:sz w:val="18"/>
-                <w:szCs w:val="18"/>
-              </w:rPr>
-              <w:t xml:space="preserve">Security Stufe 1</w:t>
-            </w:r>
-          </w:p>
-        </w:tc>
-        <w:tc>
-          <w:tcPr>
-            <w:tcW w:type="dxa" w:w="2506"/>
-            <w:tcBorders>
-              <w:top w:val="single" w:color="BFC7D5" w:sz="4"/>
-              <w:left w:val="single" w:color="BFC7D5" w:sz="4"/>
-              <w:bottom w:val="single" w:color="BFC7D5" w:sz="4"/>
-              <w:right w:val="single" w:color="BFC7D5" w:sz="4"/>
-            </w:tcBorders>
-            <w:tcMar>
-              <w:top w:type="dxa" w:w="50"/>
-              <w:left w:type="dxa" w:w="80"/>
-              <w:bottom w:type="dxa" w:w="50"/>
-              <w:right w:type="dxa" w:w="80"/>
-            </w:tcMar>
-          </w:tcPr>
-          <w:p>
-            <w:r>
-              <w:rPr>
-                <w:b w:val="false"/>
-                <w:bCs w:val="false"/>
-                <w:sz w:val="18"/>
-                <w:szCs w:val="18"/>
-              </w:rPr>
-              <w:t xml:space="preserve">security.test.js</w:t>
-            </w:r>
-          </w:p>
-        </w:tc>
-        <w:tc>
-          <w:tcPr>
-            <w:tcW w:type="dxa" w:w="1157"/>
-            <w:tcBorders>
-              <w:top w:val="single" w:color="BFC7D5" w:sz="4"/>
-              <w:left w:val="single" w:color="BFC7D5" w:sz="4"/>
-              <w:bottom w:val="single" w:color="BFC7D5" w:sz="4"/>
-              <w:right w:val="single" w:color="BFC7D5" w:sz="4"/>
-            </w:tcBorders>
-            <w:tcMar>
-              <w:top w:type="dxa" w:w="50"/>
-              <w:left w:type="dxa" w:w="80"/>
-              <w:bottom w:type="dxa" w:w="50"/>
-              <w:right w:type="dxa" w:w="80"/>
-            </w:tcMar>
-          </w:tcPr>
-          <w:p>
-            <w:r>
-              <w:rPr>
-                <w:b w:val="false"/>
-                <w:bCs w:val="false"/>
-                <w:sz w:val="18"/>
-                <w:szCs w:val="18"/>
-              </w:rPr>
-              <w:t xml:space="preserve">6</w:t>
-            </w:r>
-          </w:p>
-        </w:tc>
-        <w:tc>
-          <w:tcPr>
-            <w:tcW w:type="dxa" w:w="1349"/>
-            <w:tcBorders>
-              <w:top w:val="single" w:color="BFC7D5" w:sz="4"/>
-              <w:left w:val="single" w:color="BFC7D5" w:sz="4"/>
-              <w:bottom w:val="single" w:color="BFC7D5" w:sz="4"/>
-              <w:right w:val="single" w:color="BFC7D5" w:sz="4"/>
-            </w:tcBorders>
-            <w:tcMar>
-              <w:top w:type="dxa" w:w="50"/>
-              <w:left w:type="dxa" w:w="80"/>
-              <w:bottom w:type="dxa" w:w="50"/>
-              <w:right w:type="dxa" w:w="80"/>
-            </w:tcMar>
-          </w:tcPr>
-          <w:p>
-            <w:r>
-              <w:rPr>
-                <w:b w:val="false"/>
-                <w:bCs w:val="false"/>
-                <w:sz w:val="18"/>
-                <w:szCs w:val="18"/>
-              </w:rPr>
-              <w:t xml:space="preserve">6</w:t>
-            </w:r>
-          </w:p>
-        </w:tc>
-        <w:tc>
-          <w:tcPr>
-            <w:tcW w:type="dxa" w:w="1349"/>
-            <w:tcBorders>
-              <w:top w:val="single" w:color="BFC7D5" w:sz="4"/>
-              <w:left w:val="single" w:color="BFC7D5" w:sz="4"/>
-              <w:bottom w:val="single" w:color="BFC7D5" w:sz="4"/>
-              <w:right w:val="single" w:color="BFC7D5" w:sz="4"/>
-            </w:tcBorders>
-            <w:tcMar>
-              <w:top w:type="dxa" w:w="50"/>
-              <w:left w:type="dxa" w:w="80"/>
-              <w:bottom w:type="dxa" w:w="50"/>
-              <w:right w:type="dxa" w:w="80"/>
-            </w:tcMar>
-          </w:tcPr>
-          <w:p>
-            <w:r>
-              <w:rPr>
-                <w:b w:val="false"/>
-                <w:bCs w:val="false"/>
-                <w:sz w:val="18"/>
-                <w:szCs w:val="18"/>
-              </w:rPr>
-              <w:t xml:space="preserve">0</w:t>
-            </w:r>
-          </w:p>
-        </w:tc>
-      </w:tr>
-      <w:tr>
-        <w:tc>
-          <w:tcPr>
-            <w:tcW w:type="dxa" w:w="3277"/>
-            <w:tcBorders>
-              <w:top w:val="single" w:color="BFC7D5" w:sz="4"/>
-              <w:left w:val="single" w:color="BFC7D5" w:sz="4"/>
-              <w:bottom w:val="single" w:color="BFC7D5" w:sz="4"/>
-              <w:right w:val="single" w:color="BFC7D5" w:sz="4"/>
-            </w:tcBorders>
-            <w:tcMar>
-              <w:top w:type="dxa" w:w="50"/>
-              <w:left w:type="dxa" w:w="80"/>
-              <w:bottom w:type="dxa" w:w="50"/>
-              <w:right w:type="dxa" w:w="80"/>
-            </w:tcMar>
-          </w:tcPr>
-          <w:p>
-            <w:r>
-              <w:rPr>
-                <w:b w:val="false"/>
-                <w:bCs w:val="false"/>
-                <w:sz w:val="18"/>
-                <w:szCs w:val="18"/>
-              </w:rPr>
-              <w:t xml:space="preserve">Security Stufe 2</w:t>
-            </w:r>
-          </w:p>
-        </w:tc>
-        <w:tc>
-          <w:tcPr>
-            <w:tcW w:type="dxa" w:w="2506"/>
-            <w:tcBorders>
-              <w:top w:val="single" w:color="BFC7D5" w:sz="4"/>
-              <w:left w:val="single" w:color="BFC7D5" w:sz="4"/>
-              <w:bottom w:val="single" w:color="BFC7D5" w:sz="4"/>
-              <w:right w:val="single" w:color="BFC7D5" w:sz="4"/>
-            </w:tcBorders>
-            <w:tcMar>
-              <w:top w:type="dxa" w:w="50"/>
-              <w:left w:type="dxa" w:w="80"/>
-              <w:bottom w:type="dxa" w:w="50"/>
-              <w:right w:type="dxa" w:w="80"/>
-            </w:tcMar>
-          </w:tcPr>
-          <w:p>
-            <w:r>
-              <w:rPr>
-                <w:b w:val="false"/>
-                <w:bCs w:val="false"/>
-                <w:sz w:val="18"/>
-                <w:szCs w:val="18"/>
-              </w:rPr>
-              <w:t xml:space="preserve">threatlog.test.js</w:t>
-            </w:r>
-          </w:p>
-        </w:tc>
-        <w:tc>
-          <w:tcPr>
-            <w:tcW w:type="dxa" w:w="1157"/>
-            <w:tcBorders>
-              <w:top w:val="single" w:color="BFC7D5" w:sz="4"/>
-              <w:left w:val="single" w:color="BFC7D5" w:sz="4"/>
-              <w:bottom w:val="single" w:color="BFC7D5" w:sz="4"/>
-              <w:right w:val="single" w:color="BFC7D5" w:sz="4"/>
-            </w:tcBorders>
-            <w:tcMar>
-              <w:top w:type="dxa" w:w="50"/>
-              <w:left w:type="dxa" w:w="80"/>
-              <w:bottom w:type="dxa" w:w="50"/>
-              <w:right w:type="dxa" w:w="80"/>
-            </w:tcMar>
-          </w:tcPr>
-          <w:p>
-            <w:r>
-              <w:rPr>
-                <w:b w:val="false"/>
-                <w:bCs w:val="false"/>
-                <w:sz w:val="18"/>
-                <w:szCs w:val="18"/>
-              </w:rPr>
-              <w:t xml:space="preserve">7</w:t>
-            </w:r>
-          </w:p>
-        </w:tc>
-        <w:tc>
-          <w:tcPr>
-            <w:tcW w:type="dxa" w:w="1349"/>
-            <w:tcBorders>
-              <w:top w:val="single" w:color="BFC7D5" w:sz="4"/>
-              <w:left w:val="single" w:color="BFC7D5" w:sz="4"/>
-              <w:bottom w:val="single" w:color="BFC7D5" w:sz="4"/>
-              <w:right w:val="single" w:color="BFC7D5" w:sz="4"/>
-            </w:tcBorders>
-            <w:tcMar>
-              <w:top w:type="dxa" w:w="50"/>
-              <w:left w:type="dxa" w:w="80"/>
-              <w:bottom w:type="dxa" w:w="50"/>
-              <w:right w:type="dxa" w:w="80"/>
-            </w:tcMar>
-          </w:tcPr>
-          <w:p>
-            <w:r>
-              <w:rPr>
-                <w:b w:val="false"/>
-                <w:bCs w:val="false"/>
-                <w:sz w:val="18"/>
-                <w:szCs w:val="18"/>
-              </w:rPr>
-              <w:t xml:space="preserve">7</w:t>
-            </w:r>
-          </w:p>
-        </w:tc>
-        <w:tc>
-          <w:tcPr>
-            <w:tcW w:type="dxa" w:w="1349"/>
-            <w:tcBorders>
-              <w:top w:val="single" w:color="BFC7D5" w:sz="4"/>
-              <w:left w:val="single" w:color="BFC7D5" w:sz="4"/>
-              <w:bottom w:val="single" w:color="BFC7D5" w:sz="4"/>
-              <w:right w:val="single" w:color="BFC7D5" w:sz="4"/>
-            </w:tcBorders>
-            <w:tcMar>
-              <w:top w:type="dxa" w:w="50"/>
-              <w:left w:type="dxa" w:w="80"/>
-              <w:bottom w:type="dxa" w:w="50"/>
-              <w:right w:type="dxa" w:w="80"/>
-            </w:tcMar>
-          </w:tcPr>
-          <w:p>
-            <w:r>
-              <w:rPr>
-                <w:b w:val="false"/>
-                <w:bCs w:val="false"/>
-                <w:sz w:val="18"/>
-                <w:szCs w:val="18"/>
-              </w:rPr>
-              <w:t xml:space="preserve">0</w:t>
-            </w:r>
-          </w:p>
-        </w:tc>
-      </w:tr>
-      <w:tr>
-        <w:tc>
-          <w:tcPr>
-            <w:tcW w:type="dxa" w:w="3277"/>
-            <w:tcBorders>
-              <w:top w:val="single" w:color="BFC7D5" w:sz="4"/>
-              <w:left w:val="single" w:color="BFC7D5" w:sz="4"/>
-              <w:bottom w:val="single" w:color="BFC7D5" w:sz="4"/>
-              <w:right w:val="single" w:color="BFC7D5" w:sz="4"/>
-            </w:tcBorders>
-            <w:tcMar>
-              <w:top w:type="dxa" w:w="50"/>
-              <w:left w:type="dxa" w:w="80"/>
-              <w:bottom w:type="dxa" w:w="50"/>
-              <w:right w:type="dxa" w:w="80"/>
-            </w:tcMar>
-          </w:tcPr>
-          <w:p>
-            <w:r>
-              <w:rPr>
-                <w:b w:val="false"/>
-                <w:bCs w:val="false"/>
-                <w:sz w:val="18"/>
-                <w:szCs w:val="18"/>
-              </w:rPr>
-              <w:t xml:space="preserve">Security Stufe 3</w:t>
-            </w:r>
-          </w:p>
-        </w:tc>
-        <w:tc>
-          <w:tcPr>
-            <w:tcW w:type="dxa" w:w="2506"/>
-            <w:tcBorders>
-              <w:top w:val="single" w:color="BFC7D5" w:sz="4"/>
-              <w:left w:val="single" w:color="BFC7D5" w:sz="4"/>
-              <w:bottom w:val="single" w:color="BFC7D5" w:sz="4"/>
-              <w:right w:val="single" w:color="BFC7D5" w:sz="4"/>
-            </w:tcBorders>
-            <w:tcMar>
-              <w:top w:type="dxa" w:w="50"/>
-              <w:left w:type="dxa" w:w="80"/>
-              <w:bottom w:type="dxa" w:w="50"/>
-              <w:right w:type="dxa" w:w="80"/>
-            </w:tcMar>
-          </w:tcPr>
-          <w:p>
-            <w:r>
-              <w:rPr>
-                <w:b w:val="false"/>
-                <w:bCs w:val="false"/>
-                <w:sz w:val="18"/>
-                <w:szCs w:val="18"/>
-              </w:rPr>
-              <w:t xml:space="preserve">zones.test.js</w:t>
-            </w:r>
-          </w:p>
-        </w:tc>
-        <w:tc>
-          <w:tcPr>
-            <w:tcW w:type="dxa" w:w="1157"/>
-            <w:tcBorders>
-              <w:top w:val="single" w:color="BFC7D5" w:sz="4"/>
-              <w:left w:val="single" w:color="BFC7D5" w:sz="4"/>
-              <w:bottom w:val="single" w:color="BFC7D5" w:sz="4"/>
-              <w:right w:val="single" w:color="BFC7D5" w:sz="4"/>
-            </w:tcBorders>
-            <w:tcMar>
-              <w:top w:type="dxa" w:w="50"/>
-              <w:left w:type="dxa" w:w="80"/>
-              <w:bottom w:type="dxa" w:w="50"/>
-              <w:right w:type="dxa" w:w="80"/>
-            </w:tcMar>
-          </w:tcPr>
-          <w:p>
-            <w:r>
-              <w:rPr>
-                <w:b w:val="false"/>
-                <w:bCs w:val="false"/>
-                <w:sz w:val="18"/>
-                <w:szCs w:val="18"/>
-              </w:rPr>
-              <w:t xml:space="preserve">5</w:t>
-            </w:r>
-          </w:p>
-        </w:tc>
-        <w:tc>
-          <w:tcPr>
-            <w:tcW w:type="dxa" w:w="1349"/>
-            <w:tcBorders>
-              <w:top w:val="single" w:color="BFC7D5" w:sz="4"/>
-              <w:left w:val="single" w:color="BFC7D5" w:sz="4"/>
-              <w:bottom w:val="single" w:color="BFC7D5" w:sz="4"/>
-              <w:right w:val="single" w:color="BFC7D5" w:sz="4"/>
-            </w:tcBorders>
-            <w:tcMar>
-              <w:top w:type="dxa" w:w="50"/>
-              <w:left w:type="dxa" w:w="80"/>
-              <w:bottom w:type="dxa" w:w="50"/>
-              <w:right w:type="dxa" w:w="80"/>
-            </w:tcMar>
-          </w:tcPr>
-          <w:p>
-            <w:r>
-              <w:rPr>
-                <w:b w:val="false"/>
-                <w:bCs w:val="false"/>
-                <w:sz w:val="18"/>
-                <w:szCs w:val="18"/>
-              </w:rPr>
-              <w:t xml:space="preserve">5</w:t>
-            </w:r>
-          </w:p>
-        </w:tc>
-        <w:tc>
-          <w:tcPr>
-            <w:tcW w:type="dxa" w:w="1349"/>
-            <w:tcBorders>
-              <w:top w:val="single" w:color="BFC7D5" w:sz="4"/>
-              <w:left w:val="single" w:color="BFC7D5" w:sz="4"/>
-              <w:bottom w:val="single" w:color="BFC7D5" w:sz="4"/>
-              <w:right w:val="single" w:color="BFC7D5" w:sz="4"/>
-            </w:tcBorders>
-            <w:tcMar>
-              <w:top w:type="dxa" w:w="50"/>
-              <w:left w:type="dxa" w:w="80"/>
-              <w:bottom w:type="dxa" w:w="50"/>
-              <w:right w:type="dxa" w:w="80"/>
-            </w:tcMar>
-          </w:tcPr>
-          <w:p>
-            <w:r>
-              <w:rPr>
-                <w:b w:val="false"/>
-                <w:bCs w:val="false"/>
-                <w:sz w:val="18"/>
-                <w:szCs w:val="18"/>
-              </w:rPr>
-              <w:t xml:space="preserve">0</w:t>
-            </w:r>
-          </w:p>
-        </w:tc>
-      </w:tr>
-      <w:tr>
-        <w:tc>
-          <w:tcPr>
-            <w:tcW w:type="dxa" w:w="3277"/>
-            <w:tcBorders>
-              <w:top w:val="single" w:color="BFC7D5" w:sz="4"/>
-              <w:left w:val="single" w:color="BFC7D5" w:sz="4"/>
-              <w:bottom w:val="single" w:color="BFC7D5" w:sz="4"/>
-              <w:right w:val="single" w:color="BFC7D5" w:sz="4"/>
-            </w:tcBorders>
-            <w:tcMar>
-              <w:top w:type="dxa" w:w="50"/>
-              <w:left w:type="dxa" w:w="80"/>
-              <w:bottom w:type="dxa" w:w="50"/>
-              <w:right w:type="dxa" w:w="80"/>
-            </w:tcMar>
-          </w:tcPr>
-          <w:p>
-            <w:r>
-              <w:rPr>
-                <w:b w:val="false"/>
-                <w:bCs w:val="false"/>
-                <w:sz w:val="18"/>
-                <w:szCs w:val="18"/>
-              </w:rPr>
-              <w:t xml:space="preserve">Summe</w:t>
-            </w:r>
-          </w:p>
-        </w:tc>
-        <w:tc>
-          <w:tcPr>
-            <w:tcW w:type="dxa" w:w="2506"/>
-            <w:tcBorders>
-              <w:top w:val="single" w:color="BFC7D5" w:sz="4"/>
-              <w:left w:val="single" w:color="BFC7D5" w:sz="4"/>
-              <w:bottom w:val="single" w:color="BFC7D5" w:sz="4"/>
-              <w:right w:val="single" w:color="BFC7D5" w:sz="4"/>
-            </w:tcBorders>
-            <w:tcMar>
-              <w:top w:type="dxa" w:w="50"/>
-              <w:left w:type="dxa" w:w="80"/>
-              <w:bottom w:type="dxa" w:w="50"/>
-              <w:right w:type="dxa" w:w="80"/>
-            </w:tcMar>
-          </w:tcPr>
-          <w:p>
-            <w:r>
-              <w:rPr>
-                <w:b w:val="false"/>
-                <w:bCs w:val="false"/>
-                <w:sz w:val="18"/>
-                <w:szCs w:val="18"/>
-              </w:rPr>
-              <w:t xml:space="preserve"/>
-            </w:r>
-          </w:p>
-        </w:tc>
-        <w:tc>
-          <w:tcPr>
-            <w:tcW w:type="dxa" w:w="1157"/>
-            <w:tcBorders>
-              <w:top w:val="single" w:color="BFC7D5" w:sz="4"/>
-              <w:left w:val="single" w:color="BFC7D5" w:sz="4"/>
-              <w:bottom w:val="single" w:color="BFC7D5" w:sz="4"/>
-              <w:right w:val="single" w:color="BFC7D5" w:sz="4"/>
-            </w:tcBorders>
-            <w:tcMar>
-              <w:top w:type="dxa" w:w="50"/>
-              <w:left w:type="dxa" w:w="80"/>
-              <w:bottom w:type="dxa" w:w="50"/>
-              <w:right w:type="dxa" w:w="80"/>
-            </w:tcMar>
-          </w:tcPr>
-          <w:p>
-            <w:r>
-              <w:rPr>
-                <w:b w:val="false"/>
-                <w:bCs w:val="false"/>
-                <w:sz w:val="18"/>
-                <w:szCs w:val="18"/>
-              </w:rPr>
-              <w:t xml:space="preserve">96</w:t>
-            </w:r>
-          </w:p>
-        </w:tc>
-        <w:tc>
-          <w:tcPr>
-            <w:tcW w:type="dxa" w:w="1349"/>
-            <w:tcBorders>
-              <w:top w:val="single" w:color="BFC7D5" w:sz="4"/>
-              <w:left w:val="single" w:color="BFC7D5" w:sz="4"/>
-              <w:bottom w:val="single" w:color="BFC7D5" w:sz="4"/>
-              <w:right w:val="single" w:color="BFC7D5" w:sz="4"/>
-            </w:tcBorders>
-            <w:tcMar>
-              <w:top w:type="dxa" w:w="50"/>
-              <w:left w:type="dxa" w:w="80"/>
-              <w:bottom w:type="dxa" w:w="50"/>
-              <w:right w:type="dxa" w:w="80"/>
-            </w:tcMar>
-          </w:tcPr>
-          <w:p>
-            <w:r>
-              <w:rPr>
-                <w:b w:val="false"/>
-                <w:bCs w:val="false"/>
-                <w:sz w:val="18"/>
-                <w:szCs w:val="18"/>
-              </w:rPr>
-              <w:t xml:space="preserve">96</w:t>
+              <w:t xml:space="preserve">107</w:t>
             </w:r>
           </w:p>
         </w:tc>
@@ -5812,7 +6409,7 @@
                 <w:sz w:val="16"/>
                 <w:szCs w:val="16"/>
               </w:rPr>
-              <w:t xml:space="preserve">class filter options: ['Alle Risikoklassen', 'Nicht akzeptabel', 'Akzeptabel']</w:t>
+              <w:t xml:space="preserve">class filter options: ['Alle Risikoklassen', 'Untragbar', 'Unerwünscht', 'Tragbar', 'Vernachlässigbar']</w:t>
             </w:r>
           </w:p>
           <w:p>
@@ -7434,6 +8031,124 @@
           </w:p>
         </w:tc>
       </w:tr>
+      <w:tr>
+        <w:tc>
+          <w:tcPr>
+            <w:tcW w:type="dxa" w:w="7903"/>
+            <w:tcBorders>
+              <w:top w:val="single" w:color="BFC7D5" w:sz="4"/>
+              <w:left w:val="single" w:color="BFC7D5" w:sz="4"/>
+              <w:bottom w:val="single" w:color="BFC7D5" w:sz="4"/>
+              <w:right w:val="single" w:color="BFC7D5" w:sz="4"/>
+            </w:tcBorders>
+            <w:tcMar>
+              <w:top w:type="dxa" w:w="50"/>
+              <w:left w:type="dxa" w:w="80"/>
+              <w:bottom w:type="dxa" w:w="50"/>
+              <w:right w:type="dxa" w:w="80"/>
+            </w:tcMar>
+          </w:tcPr>
+          <w:p>
+            <w:r>
+              <w:rPr>
+                <w:b w:val="false"/>
+                <w:bCs w:val="false"/>
+                <w:sz w:val="16"/>
+                <w:szCs w:val="16"/>
+              </w:rPr>
+              <w:t xml:space="preserve">a literal &lt;/script&gt; or &lt;!-- in the embedded data cannot break the page</w:t>
+            </w:r>
+          </w:p>
+        </w:tc>
+        <w:tc>
+          <w:tcPr>
+            <w:tcW w:type="dxa" w:w="1735"/>
+            <w:tcBorders>
+              <w:top w:val="single" w:color="BFC7D5" w:sz="4"/>
+              <w:left w:val="single" w:color="BFC7D5" w:sz="4"/>
+              <w:bottom w:val="single" w:color="BFC7D5" w:sz="4"/>
+              <w:right w:val="single" w:color="BFC7D5" w:sz="4"/>
+            </w:tcBorders>
+            <w:shd w:fill="E6F3EA" w:color="auto" w:val="clear"/>
+            <w:tcMar>
+              <w:top w:type="dxa" w:w="50"/>
+              <w:left w:type="dxa" w:w="80"/>
+              <w:bottom w:type="dxa" w:w="50"/>
+              <w:right w:type="dxa" w:w="80"/>
+            </w:tcMar>
+          </w:tcPr>
+          <w:p>
+            <w:r>
+              <w:rPr>
+                <w:b w:val="false"/>
+                <w:bCs w:val="false"/>
+                <w:sz w:val="16"/>
+                <w:szCs w:val="16"/>
+              </w:rPr>
+              <w:t xml:space="preserve">bestanden</w:t>
+            </w:r>
+          </w:p>
+        </w:tc>
+      </w:tr>
+      <w:tr>
+        <w:tc>
+          <w:tcPr>
+            <w:tcW w:type="dxa" w:w="7903"/>
+            <w:tcBorders>
+              <w:top w:val="single" w:color="BFC7D5" w:sz="4"/>
+              <w:left w:val="single" w:color="BFC7D5" w:sz="4"/>
+              <w:bottom w:val="single" w:color="BFC7D5" w:sz="4"/>
+              <w:right w:val="single" w:color="BFC7D5" w:sz="4"/>
+            </w:tcBorders>
+            <w:tcMar>
+              <w:top w:type="dxa" w:w="50"/>
+              <w:left w:type="dxa" w:w="80"/>
+              <w:bottom w:type="dxa" w:w="50"/>
+              <w:right w:type="dxa" w:w="80"/>
+            </w:tcMar>
+          </w:tcPr>
+          <w:p>
+            <w:r>
+              <w:rPr>
+                <w:b w:val="false"/>
+                <w:bCs w:val="false"/>
+                <w:sz w:val="16"/>
+                <w:szCs w:val="16"/>
+              </w:rPr>
+              <w:t xml:space="preserve">the build fails on &lt;/script in an app module and on modules missing from the manifest</w:t>
+            </w:r>
+          </w:p>
+        </w:tc>
+        <w:tc>
+          <w:tcPr>
+            <w:tcW w:type="dxa" w:w="1735"/>
+            <w:tcBorders>
+              <w:top w:val="single" w:color="BFC7D5" w:sz="4"/>
+              <w:left w:val="single" w:color="BFC7D5" w:sz="4"/>
+              <w:bottom w:val="single" w:color="BFC7D5" w:sz="4"/>
+              <w:right w:val="single" w:color="BFC7D5" w:sz="4"/>
+            </w:tcBorders>
+            <w:shd w:fill="E6F3EA" w:color="auto" w:val="clear"/>
+            <w:tcMar>
+              <w:top w:type="dxa" w:w="50"/>
+              <w:left w:type="dxa" w:w="80"/>
+              <w:bottom w:type="dxa" w:w="50"/>
+              <w:right w:type="dxa" w:w="80"/>
+            </w:tcMar>
+          </w:tcPr>
+          <w:p>
+            <w:r>
+              <w:rPr>
+                <w:b w:val="false"/>
+                <w:bCs w:val="false"/>
+                <w:sz w:val="16"/>
+                <w:szCs w:val="16"/>
+              </w:rPr>
+              <w:t xml:space="preserve">bestanden</w:t>
+            </w:r>
+          </w:p>
+        </w:tc>
+      </w:tr>
     </w:tbl>
     <w:p>
       <w:pPr>
@@ -7941,6 +8656,153 @@
         <w:pStyle w:val="Heading2"/>
       </w:pPr>
       <w:r>
+        <w:t xml:space="preserve">Kennungsvergabe (db-ids.test.js)</w:t>
+      </w:r>
+    </w:p>
+    <w:tbl>
+      <w:tblPr>
+        <w:tblW w:type="dxa" w:w="9638"/>
+        <w:tblBorders>
+          <w:top w:val="single" w:color="auto" w:sz="4"/>
+          <w:left w:val="single" w:color="auto" w:sz="4"/>
+          <w:bottom w:val="single" w:color="auto" w:sz="4"/>
+          <w:right w:val="single" w:color="auto" w:sz="4"/>
+          <w:insideH w:val="single" w:color="auto" w:sz="4"/>
+          <w:insideV w:val="single" w:color="auto" w:sz="4"/>
+        </w:tblBorders>
+      </w:tblPr>
+      <w:tblGrid>
+        <w:gridCol w:w="7903"/>
+        <w:gridCol w:w="1735"/>
+      </w:tblGrid>
+      <w:tr>
+        <w:trPr>
+          <w:tblHeader/>
+        </w:trPr>
+        <w:tc>
+          <w:tcPr>
+            <w:tcW w:type="dxa" w:w="7903"/>
+            <w:tcBorders>
+              <w:top w:val="single" w:color="BFC7D5" w:sz="4"/>
+              <w:left w:val="single" w:color="BFC7D5" w:sz="4"/>
+              <w:bottom w:val="single" w:color="BFC7D5" w:sz="4"/>
+              <w:right w:val="single" w:color="BFC7D5" w:sz="4"/>
+            </w:tcBorders>
+            <w:shd w:fill="DCE3EE" w:color="auto" w:val="clear"/>
+            <w:tcMar>
+              <w:top w:type="dxa" w:w="50"/>
+              <w:left w:type="dxa" w:w="80"/>
+              <w:bottom w:type="dxa" w:w="50"/>
+              <w:right w:type="dxa" w:w="80"/>
+            </w:tcMar>
+          </w:tcPr>
+          <w:p>
+            <w:r>
+              <w:rPr>
+                <w:b/>
+                <w:bCs/>
+                <w:sz w:val="16"/>
+                <w:szCs w:val="16"/>
+              </w:rPr>
+              <w:t xml:space="preserve">Testfall</w:t>
+            </w:r>
+          </w:p>
+        </w:tc>
+        <w:tc>
+          <w:tcPr>
+            <w:tcW w:type="dxa" w:w="1735"/>
+            <w:tcBorders>
+              <w:top w:val="single" w:color="BFC7D5" w:sz="4"/>
+              <w:left w:val="single" w:color="BFC7D5" w:sz="4"/>
+              <w:bottom w:val="single" w:color="BFC7D5" w:sz="4"/>
+              <w:right w:val="single" w:color="BFC7D5" w:sz="4"/>
+            </w:tcBorders>
+            <w:shd w:fill="DCE3EE" w:color="auto" w:val="clear"/>
+            <w:tcMar>
+              <w:top w:type="dxa" w:w="50"/>
+              <w:left w:type="dxa" w:w="80"/>
+              <w:bottom w:type="dxa" w:w="50"/>
+              <w:right w:type="dxa" w:w="80"/>
+            </w:tcMar>
+          </w:tcPr>
+          <w:p>
+            <w:r>
+              <w:rPr>
+                <w:b/>
+                <w:bCs/>
+                <w:sz w:val="16"/>
+                <w:szCs w:val="16"/>
+              </w:rPr>
+              <w:t xml:space="preserve">Ergebnis</w:t>
+            </w:r>
+          </w:p>
+        </w:tc>
+      </w:tr>
+      <w:tr>
+        <w:tc>
+          <w:tcPr>
+            <w:tcW w:type="dxa" w:w="7903"/>
+            <w:tcBorders>
+              <w:top w:val="single" w:color="BFC7D5" w:sz="4"/>
+              <w:left w:val="single" w:color="BFC7D5" w:sz="4"/>
+              <w:bottom w:val="single" w:color="BFC7D5" w:sz="4"/>
+              <w:right w:val="single" w:color="BFC7D5" w:sz="4"/>
+            </w:tcBorders>
+            <w:tcMar>
+              <w:top w:type="dxa" w:w="50"/>
+              <w:left w:type="dxa" w:w="80"/>
+              <w:bottom w:type="dxa" w:w="50"/>
+              <w:right w:type="dxa" w:w="80"/>
+            </w:tcMar>
+          </w:tcPr>
+          <w:p>
+            <w:r>
+              <w:rPr>
+                <w:b w:val="false"/>
+                <w:bCs w:val="false"/>
+                <w:sz w:val="16"/>
+                <w:szCs w:val="16"/>
+              </w:rPr>
+              <w:t xml:space="preserve">next id is max(existing ids, persistent counter) + 1</w:t>
+            </w:r>
+          </w:p>
+        </w:tc>
+        <w:tc>
+          <w:tcPr>
+            <w:tcW w:type="dxa" w:w="1735"/>
+            <w:tcBorders>
+              <w:top w:val="single" w:color="BFC7D5" w:sz="4"/>
+              <w:left w:val="single" w:color="BFC7D5" w:sz="4"/>
+              <w:bottom w:val="single" w:color="BFC7D5" w:sz="4"/>
+              <w:right w:val="single" w:color="BFC7D5" w:sz="4"/>
+            </w:tcBorders>
+            <w:shd w:fill="E6F3EA" w:color="auto" w:val="clear"/>
+            <w:tcMar>
+              <w:top w:type="dxa" w:w="50"/>
+              <w:left w:type="dxa" w:w="80"/>
+              <w:bottom w:type="dxa" w:w="50"/>
+              <w:right w:type="dxa" w:w="80"/>
+            </w:tcMar>
+          </w:tcPr>
+          <w:p>
+            <w:r>
+              <w:rPr>
+                <w:b w:val="false"/>
+                <w:bCs w:val="false"/>
+                <w:sz w:val="16"/>
+                <w:szCs w:val="16"/>
+              </w:rPr>
+              <w:t xml:space="preserve">bestanden</w:t>
+            </w:r>
+          </w:p>
+        </w:tc>
+      </w:tr>
+    </w:tbl>
+    <w:p>
+      <w:pPr>
+        <w:pStyle w:val="Heading2"/>
+      </w:pPr>
+      <w:r>
         <w:t xml:space="preserve">Domänenpakete und Demo (domains.test.js)</w:t>
       </w:r>
     </w:p>
@@ -8819,13 +9681,72 @@
           </w:p>
         </w:tc>
       </w:tr>
+      <w:tr>
+        <w:tc>
+          <w:tcPr>
+            <w:tcW w:type="dxa" w:w="7903"/>
+            <w:tcBorders>
+              <w:top w:val="single" w:color="BFC7D5" w:sz="4"/>
+              <w:left w:val="single" w:color="BFC7D5" w:sz="4"/>
+              <w:bottom w:val="single" w:color="BFC7D5" w:sz="4"/>
+              <w:right w:val="single" w:color="BFC7D5" w:sz="4"/>
+            </w:tcBorders>
+            <w:tcMar>
+              <w:top w:type="dxa" w:w="50"/>
+              <w:left w:type="dxa" w:w="80"/>
+              <w:bottom w:type="dxa" w:w="50"/>
+              <w:right w:type="dxa" w:w="80"/>
+            </w:tcMar>
+          </w:tcPr>
+          <w:p>
+            <w:r>
+              <w:rPr>
+                <w:b w:val="false"/>
+                <w:bCs w:val="false"/>
+                <w:sz w:val="16"/>
+                <w:szCs w:val="16"/>
+              </w:rPr>
+              <w:t xml:space="preserve">prompts mark project data and document excerpts as data, not instructions</w:t>
+            </w:r>
+          </w:p>
+        </w:tc>
+        <w:tc>
+          <w:tcPr>
+            <w:tcW w:type="dxa" w:w="1735"/>
+            <w:tcBorders>
+              <w:top w:val="single" w:color="BFC7D5" w:sz="4"/>
+              <w:left w:val="single" w:color="BFC7D5" w:sz="4"/>
+              <w:bottom w:val="single" w:color="BFC7D5" w:sz="4"/>
+              <w:right w:val="single" w:color="BFC7D5" w:sz="4"/>
+            </w:tcBorders>
+            <w:shd w:fill="E6F3EA" w:color="auto" w:val="clear"/>
+            <w:tcMar>
+              <w:top w:type="dxa" w:w="50"/>
+              <w:left w:type="dxa" w:w="80"/>
+              <w:bottom w:type="dxa" w:w="50"/>
+              <w:right w:type="dxa" w:w="80"/>
+            </w:tcMar>
+          </w:tcPr>
+          <w:p>
+            <w:r>
+              <w:rPr>
+                <w:b w:val="false"/>
+                <w:bCs w:val="false"/>
+                <w:sz w:val="16"/>
+                <w:szCs w:val="16"/>
+              </w:rPr>
+              <w:t xml:space="preserve">bestanden</w:t>
+            </w:r>
+          </w:p>
+        </w:tc>
+      </w:tr>
     </w:tbl>
     <w:p>
       <w:pPr>
         <w:pStyle w:val="Heading2"/>
       </w:pPr>
       <w:r>
-        <w:t xml:space="preserve">local-providers.test.js (local-providers.test.js)</w:t>
+        <w:t xml:space="preserve">Import und Kennungen (import-ids.test.js)</w:t>
       </w:r>
     </w:p>
     <w:tbl>
@@ -8932,6 +9853,212 @@
                 <w:sz w:val="16"/>
                 <w:szCs w:val="16"/>
               </w:rPr>
+              <w:t xml:space="preserve">shipped reference project and demo project pass the id check</w:t>
+            </w:r>
+          </w:p>
+        </w:tc>
+        <w:tc>
+          <w:tcPr>
+            <w:tcW w:type="dxa" w:w="1735"/>
+            <w:tcBorders>
+              <w:top w:val="single" w:color="BFC7D5" w:sz="4"/>
+              <w:left w:val="single" w:color="BFC7D5" w:sz="4"/>
+              <w:bottom w:val="single" w:color="BFC7D5" w:sz="4"/>
+              <w:right w:val="single" w:color="BFC7D5" w:sz="4"/>
+            </w:tcBorders>
+            <w:shd w:fill="E6F3EA" w:color="auto" w:val="clear"/>
+            <w:tcMar>
+              <w:top w:type="dxa" w:w="50"/>
+              <w:left w:type="dxa" w:w="80"/>
+              <w:bottom w:type="dxa" w:w="50"/>
+              <w:right w:type="dxa" w:w="80"/>
+            </w:tcMar>
+          </w:tcPr>
+          <w:p>
+            <w:r>
+              <w:rPr>
+                <w:b w:val="false"/>
+                <w:bCs w:val="false"/>
+                <w:sz w:val="16"/>
+                <w:szCs w:val="16"/>
+              </w:rPr>
+              <w:t xml:space="preserve">bestanden</w:t>
+            </w:r>
+          </w:p>
+        </w:tc>
+      </w:tr>
+      <w:tr>
+        <w:tc>
+          <w:tcPr>
+            <w:tcW w:type="dxa" w:w="7903"/>
+            <w:tcBorders>
+              <w:top w:val="single" w:color="BFC7D5" w:sz="4"/>
+              <w:left w:val="single" w:color="BFC7D5" w:sz="4"/>
+              <w:bottom w:val="single" w:color="BFC7D5" w:sz="4"/>
+              <w:right w:val="single" w:color="BFC7D5" w:sz="4"/>
+            </w:tcBorders>
+            <w:tcMar>
+              <w:top w:type="dxa" w:w="50"/>
+              <w:left w:type="dxa" w:w="80"/>
+              <w:bottom w:type="dxa" w:w="50"/>
+              <w:right w:type="dxa" w:w="80"/>
+            </w:tcMar>
+          </w:tcPr>
+          <w:p>
+            <w:r>
+              <w:rPr>
+                <w:b w:val="false"/>
+                <w:bCs w:val="false"/>
+                <w:sz w:val="16"/>
+                <w:szCs w:val="16"/>
+              </w:rPr>
+              <w:t xml:space="preserve">hostile record ids and id references are rejected</w:t>
+            </w:r>
+          </w:p>
+        </w:tc>
+        <w:tc>
+          <w:tcPr>
+            <w:tcW w:type="dxa" w:w="1735"/>
+            <w:tcBorders>
+              <w:top w:val="single" w:color="BFC7D5" w:sz="4"/>
+              <w:left w:val="single" w:color="BFC7D5" w:sz="4"/>
+              <w:bottom w:val="single" w:color="BFC7D5" w:sz="4"/>
+              <w:right w:val="single" w:color="BFC7D5" w:sz="4"/>
+            </w:tcBorders>
+            <w:shd w:fill="E6F3EA" w:color="auto" w:val="clear"/>
+            <w:tcMar>
+              <w:top w:type="dxa" w:w="50"/>
+              <w:left w:type="dxa" w:w="80"/>
+              <w:bottom w:type="dxa" w:w="50"/>
+              <w:right w:type="dxa" w:w="80"/>
+            </w:tcMar>
+          </w:tcPr>
+          <w:p>
+            <w:r>
+              <w:rPr>
+                <w:b w:val="false"/>
+                <w:bCs w:val="false"/>
+                <w:sz w:val="16"/>
+                <w:szCs w:val="16"/>
+              </w:rPr>
+              <w:t xml:space="preserve">bestanden</w:t>
+            </w:r>
+          </w:p>
+        </w:tc>
+      </w:tr>
+    </w:tbl>
+    <w:p>
+      <w:pPr>
+        <w:pStyle w:val="Heading2"/>
+      </w:pPr>
+      <w:r>
+        <w:t xml:space="preserve">Lokale KI-Anbieter und Vertraulichkeit (local-providers.test.js)</w:t>
+      </w:r>
+    </w:p>
+    <w:tbl>
+      <w:tblPr>
+        <w:tblW w:type="dxa" w:w="9638"/>
+        <w:tblBorders>
+          <w:top w:val="single" w:color="auto" w:sz="4"/>
+          <w:left w:val="single" w:color="auto" w:sz="4"/>
+          <w:bottom w:val="single" w:color="auto" w:sz="4"/>
+          <w:right w:val="single" w:color="auto" w:sz="4"/>
+          <w:insideH w:val="single" w:color="auto" w:sz="4"/>
+          <w:insideV w:val="single" w:color="auto" w:sz="4"/>
+        </w:tblBorders>
+      </w:tblPr>
+      <w:tblGrid>
+        <w:gridCol w:w="7903"/>
+        <w:gridCol w:w="1735"/>
+      </w:tblGrid>
+      <w:tr>
+        <w:trPr>
+          <w:tblHeader/>
+        </w:trPr>
+        <w:tc>
+          <w:tcPr>
+            <w:tcW w:type="dxa" w:w="7903"/>
+            <w:tcBorders>
+              <w:top w:val="single" w:color="BFC7D5" w:sz="4"/>
+              <w:left w:val="single" w:color="BFC7D5" w:sz="4"/>
+              <w:bottom w:val="single" w:color="BFC7D5" w:sz="4"/>
+              <w:right w:val="single" w:color="BFC7D5" w:sz="4"/>
+            </w:tcBorders>
+            <w:shd w:fill="DCE3EE" w:color="auto" w:val="clear"/>
+            <w:tcMar>
+              <w:top w:type="dxa" w:w="50"/>
+              <w:left w:type="dxa" w:w="80"/>
+              <w:bottom w:type="dxa" w:w="50"/>
+              <w:right w:type="dxa" w:w="80"/>
+            </w:tcMar>
+          </w:tcPr>
+          <w:p>
+            <w:r>
+              <w:rPr>
+                <w:b/>
+                <w:bCs/>
+                <w:sz w:val="16"/>
+                <w:szCs w:val="16"/>
+              </w:rPr>
+              <w:t xml:space="preserve">Testfall</w:t>
+            </w:r>
+          </w:p>
+        </w:tc>
+        <w:tc>
+          <w:tcPr>
+            <w:tcW w:type="dxa" w:w="1735"/>
+            <w:tcBorders>
+              <w:top w:val="single" w:color="BFC7D5" w:sz="4"/>
+              <w:left w:val="single" w:color="BFC7D5" w:sz="4"/>
+              <w:bottom w:val="single" w:color="BFC7D5" w:sz="4"/>
+              <w:right w:val="single" w:color="BFC7D5" w:sz="4"/>
+            </w:tcBorders>
+            <w:shd w:fill="DCE3EE" w:color="auto" w:val="clear"/>
+            <w:tcMar>
+              <w:top w:type="dxa" w:w="50"/>
+              <w:left w:type="dxa" w:w="80"/>
+              <w:bottom w:type="dxa" w:w="50"/>
+              <w:right w:type="dxa" w:w="80"/>
+            </w:tcMar>
+          </w:tcPr>
+          <w:p>
+            <w:r>
+              <w:rPr>
+                <w:b/>
+                <w:bCs/>
+                <w:sz w:val="16"/>
+                <w:szCs w:val="16"/>
+              </w:rPr>
+              <w:t xml:space="preserve">Ergebnis</w:t>
+            </w:r>
+          </w:p>
+        </w:tc>
+      </w:tr>
+      <w:tr>
+        <w:tc>
+          <w:tcPr>
+            <w:tcW w:type="dxa" w:w="7903"/>
+            <w:tcBorders>
+              <w:top w:val="single" w:color="BFC7D5" w:sz="4"/>
+              <w:left w:val="single" w:color="BFC7D5" w:sz="4"/>
+              <w:bottom w:val="single" w:color="BFC7D5" w:sz="4"/>
+              <w:right w:val="single" w:color="BFC7D5" w:sz="4"/>
+            </w:tcBorders>
+            <w:tcMar>
+              <w:top w:type="dxa" w:w="50"/>
+              <w:left w:type="dxa" w:w="80"/>
+              <w:bottom w:type="dxa" w:w="50"/>
+              <w:right w:type="dxa" w:w="80"/>
+            </w:tcMar>
+          </w:tcPr>
+          <w:p>
+            <w:r>
+              <w:rPr>
+                <w:b w:val="false"/>
+                <w:bCs w:val="false"/>
+                <w:sz w:val="16"/>
+                <w:szCs w:val="16"/>
+              </w:rPr>
               <w:t xml:space="preserve">Ollama: num_ctx, keep_alive, think are sent; answer in content is returned</w:t>
             </w:r>
           </w:p>
@@ -9405,6 +10532,65 @@
                 <w:szCs w:val="16"/>
               </w:rPr>
               <w:t xml:space="preserve">confidential projects: local or private-network servers allowed, cloud or public hosts blocked</w:t>
+            </w:r>
+          </w:p>
+        </w:tc>
+        <w:tc>
+          <w:tcPr>
+            <w:tcW w:type="dxa" w:w="1735"/>
+            <w:tcBorders>
+              <w:top w:val="single" w:color="BFC7D5" w:sz="4"/>
+              <w:left w:val="single" w:color="BFC7D5" w:sz="4"/>
+              <w:bottom w:val="single" w:color="BFC7D5" w:sz="4"/>
+              <w:right w:val="single" w:color="BFC7D5" w:sz="4"/>
+            </w:tcBorders>
+            <w:shd w:fill="E6F3EA" w:color="auto" w:val="clear"/>
+            <w:tcMar>
+              <w:top w:type="dxa" w:w="50"/>
+              <w:left w:type="dxa" w:w="80"/>
+              <w:bottom w:type="dxa" w:w="50"/>
+              <w:right w:type="dxa" w:w="80"/>
+            </w:tcMar>
+          </w:tcPr>
+          <w:p>
+            <w:r>
+              <w:rPr>
+                <w:b w:val="false"/>
+                <w:bCs w:val="false"/>
+                <w:sz w:val="16"/>
+                <w:szCs w:val="16"/>
+              </w:rPr>
+              <w:t xml:space="preserve">bestanden</w:t>
+            </w:r>
+          </w:p>
+        </w:tc>
+      </w:tr>
+      <w:tr>
+        <w:tc>
+          <w:tcPr>
+            <w:tcW w:type="dxa" w:w="7903"/>
+            <w:tcBorders>
+              <w:top w:val="single" w:color="BFC7D5" w:sz="4"/>
+              <w:left w:val="single" w:color="BFC7D5" w:sz="4"/>
+              <w:bottom w:val="single" w:color="BFC7D5" w:sz="4"/>
+              <w:right w:val="single" w:color="BFC7D5" w:sz="4"/>
+            </w:tcBorders>
+            <w:tcMar>
+              <w:top w:type="dxa" w:w="50"/>
+              <w:left w:type="dxa" w:w="80"/>
+              <w:bottom w:type="dxa" w:w="50"/>
+              <w:right w:type="dxa" w:w="80"/>
+            </w:tcMar>
+          </w:tcPr>
+          <w:p>
+            <w:r>
+              <w:rPr>
+                <w:b w:val="false"/>
+                <w:bCs w:val="false"/>
+                <w:sz w:val="16"/>
+                <w:szCs w:val="16"/>
+              </w:rPr>
+              <w:t xml:space="preserve">confidential projects: hostnames that merely start like a private IP are not local</w:t>
             </w:r>
           </w:p>
         </w:tc>
@@ -10588,6 +11774,183 @@
           </w:p>
         </w:tc>
       </w:tr>
+      <w:tr>
+        <w:tc>
+          <w:tcPr>
+            <w:tcW w:type="dxa" w:w="7903"/>
+            <w:tcBorders>
+              <w:top w:val="single" w:color="BFC7D5" w:sz="4"/>
+              <w:left w:val="single" w:color="BFC7D5" w:sz="4"/>
+              <w:bottom w:val="single" w:color="BFC7D5" w:sz="4"/>
+              <w:right w:val="single" w:color="BFC7D5" w:sz="4"/>
+            </w:tcBorders>
+            <w:tcMar>
+              <w:top w:type="dxa" w:w="50"/>
+              <w:left w:type="dxa" w:w="80"/>
+              <w:bottom w:type="dxa" w:w="50"/>
+              <w:right w:type="dxa" w:w="80"/>
+            </w:tcMar>
+          </w:tcPr>
+          <w:p>
+            <w:r>
+              <w:rPr>
+                <w:b w:val="false"/>
+                <w:bCs w:val="false"/>
+                <w:sz w:val="16"/>
+                <w:szCs w:val="16"/>
+              </w:rPr>
+              <w:t xml:space="preserve">proposed (unconfirmed) measures do not lower residual risk or count as control</w:t>
+            </w:r>
+          </w:p>
+        </w:tc>
+        <w:tc>
+          <w:tcPr>
+            <w:tcW w:type="dxa" w:w="1735"/>
+            <w:tcBorders>
+              <w:top w:val="single" w:color="BFC7D5" w:sz="4"/>
+              <w:left w:val="single" w:color="BFC7D5" w:sz="4"/>
+              <w:bottom w:val="single" w:color="BFC7D5" w:sz="4"/>
+              <w:right w:val="single" w:color="BFC7D5" w:sz="4"/>
+            </w:tcBorders>
+            <w:shd w:fill="E6F3EA" w:color="auto" w:val="clear"/>
+            <w:tcMar>
+              <w:top w:type="dxa" w:w="50"/>
+              <w:left w:type="dxa" w:w="80"/>
+              <w:bottom w:type="dxa" w:w="50"/>
+              <w:right w:type="dxa" w:w="80"/>
+            </w:tcMar>
+          </w:tcPr>
+          <w:p>
+            <w:r>
+              <w:rPr>
+                <w:b w:val="false"/>
+                <w:bCs w:val="false"/>
+                <w:sz w:val="16"/>
+                <w:szCs w:val="16"/>
+              </w:rPr>
+              <w:t xml:space="preserve">bestanden</w:t>
+            </w:r>
+          </w:p>
+        </w:tc>
+      </w:tr>
+      <w:tr>
+        <w:tc>
+          <w:tcPr>
+            <w:tcW w:type="dxa" w:w="7903"/>
+            <w:tcBorders>
+              <w:top w:val="single" w:color="BFC7D5" w:sz="4"/>
+              <w:left w:val="single" w:color="BFC7D5" w:sz="4"/>
+              <w:bottom w:val="single" w:color="BFC7D5" w:sz="4"/>
+              <w:right w:val="single" w:color="BFC7D5" w:sz="4"/>
+            </w:tcBorders>
+            <w:tcMar>
+              <w:top w:type="dxa" w:w="50"/>
+              <w:left w:type="dxa" w:w="80"/>
+              <w:bottom w:type="dxa" w:w="50"/>
+              <w:right w:type="dxa" w:w="80"/>
+            </w:tcMar>
+          </w:tcPr>
+          <w:p>
+            <w:r>
+              <w:rPr>
+                <w:b w:val="false"/>
+                <w:bCs w:val="false"/>
+                <w:sz w:val="16"/>
+                <w:szCs w:val="16"/>
+              </w:rPr>
+              <w:t xml:space="preserve">a measure cannot leave the hazard with a residual risk worse than the initial risk</w:t>
+            </w:r>
+          </w:p>
+        </w:tc>
+        <w:tc>
+          <w:tcPr>
+            <w:tcW w:type="dxa" w:w="1735"/>
+            <w:tcBorders>
+              <w:top w:val="single" w:color="BFC7D5" w:sz="4"/>
+              <w:left w:val="single" w:color="BFC7D5" w:sz="4"/>
+              <w:bottom w:val="single" w:color="BFC7D5" w:sz="4"/>
+              <w:right w:val="single" w:color="BFC7D5" w:sz="4"/>
+            </w:tcBorders>
+            <w:shd w:fill="E6F3EA" w:color="auto" w:val="clear"/>
+            <w:tcMar>
+              <w:top w:type="dxa" w:w="50"/>
+              <w:left w:type="dxa" w:w="80"/>
+              <w:bottom w:type="dxa" w:w="50"/>
+              <w:right w:type="dxa" w:w="80"/>
+            </w:tcMar>
+          </w:tcPr>
+          <w:p>
+            <w:r>
+              <w:rPr>
+                <w:b w:val="false"/>
+                <w:bCs w:val="false"/>
+                <w:sz w:val="16"/>
+                <w:szCs w:val="16"/>
+              </w:rPr>
+              <w:t xml:space="preserve">bestanden</w:t>
+            </w:r>
+          </w:p>
+        </w:tc>
+      </w:tr>
+      <w:tr>
+        <w:tc>
+          <w:tcPr>
+            <w:tcW w:type="dxa" w:w="7903"/>
+            <w:tcBorders>
+              <w:top w:val="single" w:color="BFC7D5" w:sz="4"/>
+              <w:left w:val="single" w:color="BFC7D5" w:sz="4"/>
+              <w:bottom w:val="single" w:color="BFC7D5" w:sz="4"/>
+              <w:right w:val="single" w:color="BFC7D5" w:sz="4"/>
+            </w:tcBorders>
+            <w:tcMar>
+              <w:top w:type="dxa" w:w="50"/>
+              <w:left w:type="dxa" w:w="80"/>
+              <w:bottom w:type="dxa" w:w="50"/>
+              <w:right w:type="dxa" w:w="80"/>
+            </w:tcMar>
+          </w:tcPr>
+          <w:p>
+            <w:r>
+              <w:rPr>
+                <w:b w:val="false"/>
+                <w:bCs w:val="false"/>
+                <w:sz w:val="16"/>
+                <w:szCs w:val="16"/>
+              </w:rPr>
+              <w:t xml:space="preserve">&amp;quot;broadly acceptable&amp;quot; on a class that needs measures requires a reasoned deviation</w:t>
+            </w:r>
+          </w:p>
+        </w:tc>
+        <w:tc>
+          <w:tcPr>
+            <w:tcW w:type="dxa" w:w="1735"/>
+            <w:tcBorders>
+              <w:top w:val="single" w:color="BFC7D5" w:sz="4"/>
+              <w:left w:val="single" w:color="BFC7D5" w:sz="4"/>
+              <w:bottom w:val="single" w:color="BFC7D5" w:sz="4"/>
+              <w:right w:val="single" w:color="BFC7D5" w:sz="4"/>
+            </w:tcBorders>
+            <w:shd w:fill="E6F3EA" w:color="auto" w:val="clear"/>
+            <w:tcMar>
+              <w:top w:type="dxa" w:w="50"/>
+              <w:left w:type="dxa" w:w="80"/>
+              <w:bottom w:type="dxa" w:w="50"/>
+              <w:right w:type="dxa" w:w="80"/>
+            </w:tcMar>
+          </w:tcPr>
+          <w:p>
+            <w:r>
+              <w:rPr>
+                <w:b w:val="false"/>
+                <w:bCs w:val="false"/>
+                <w:sz w:val="16"/>
+                <w:szCs w:val="16"/>
+              </w:rPr>
+              <w:t xml:space="preserve">bestanden</w:t>
+            </w:r>
+          </w:p>
+        </w:tc>
+      </w:tr>
     </w:tbl>
     <w:p>
       <w:pPr>
@@ -13532,6 +14895,153 @@
                 <w:szCs w:val="16"/>
               </w:rPr>
               <w:t xml:space="preserve">level 2 report: matrix, threat log, trace; XLSX sheet</w:t>
+            </w:r>
+          </w:p>
+        </w:tc>
+        <w:tc>
+          <w:tcPr>
+            <w:tcW w:type="dxa" w:w="1735"/>
+            <w:tcBorders>
+              <w:top w:val="single" w:color="BFC7D5" w:sz="4"/>
+              <w:left w:val="single" w:color="BFC7D5" w:sz="4"/>
+              <w:bottom w:val="single" w:color="BFC7D5" w:sz="4"/>
+              <w:right w:val="single" w:color="BFC7D5" w:sz="4"/>
+            </w:tcBorders>
+            <w:shd w:fill="E6F3EA" w:color="auto" w:val="clear"/>
+            <w:tcMar>
+              <w:top w:type="dxa" w:w="50"/>
+              <w:left w:type="dxa" w:w="80"/>
+              <w:bottom w:type="dxa" w:w="50"/>
+              <w:right w:type="dxa" w:w="80"/>
+            </w:tcMar>
+          </w:tcPr>
+          <w:p>
+            <w:r>
+              <w:rPr>
+                <w:b w:val="false"/>
+                <w:bCs w:val="false"/>
+                <w:sz w:val="16"/>
+                <w:szCs w:val="16"/>
+              </w:rPr>
+              <w:t xml:space="preserve">bestanden</w:t>
+            </w:r>
+          </w:p>
+        </w:tc>
+      </w:tr>
+    </w:tbl>
+    <w:p>
+      <w:pPr>
+        <w:pStyle w:val="Heading2"/>
+      </w:pPr>
+      <w:r>
+        <w:t xml:space="preserve">Excel: Security-Blätter (xlsx-security.test.js)</w:t>
+      </w:r>
+    </w:p>
+    <w:tbl>
+      <w:tblPr>
+        <w:tblW w:type="dxa" w:w="9638"/>
+        <w:tblBorders>
+          <w:top w:val="single" w:color="auto" w:sz="4"/>
+          <w:left w:val="single" w:color="auto" w:sz="4"/>
+          <w:bottom w:val="single" w:color="auto" w:sz="4"/>
+          <w:right w:val="single" w:color="auto" w:sz="4"/>
+          <w:insideH w:val="single" w:color="auto" w:sz="4"/>
+          <w:insideV w:val="single" w:color="auto" w:sz="4"/>
+        </w:tblBorders>
+      </w:tblPr>
+      <w:tblGrid>
+        <w:gridCol w:w="7903"/>
+        <w:gridCol w:w="1735"/>
+      </w:tblGrid>
+      <w:tr>
+        <w:trPr>
+          <w:tblHeader/>
+        </w:trPr>
+        <w:tc>
+          <w:tcPr>
+            <w:tcW w:type="dxa" w:w="7903"/>
+            <w:tcBorders>
+              <w:top w:val="single" w:color="BFC7D5" w:sz="4"/>
+              <w:left w:val="single" w:color="BFC7D5" w:sz="4"/>
+              <w:bottom w:val="single" w:color="BFC7D5" w:sz="4"/>
+              <w:right w:val="single" w:color="BFC7D5" w:sz="4"/>
+            </w:tcBorders>
+            <w:shd w:fill="DCE3EE" w:color="auto" w:val="clear"/>
+            <w:tcMar>
+              <w:top w:type="dxa" w:w="50"/>
+              <w:left w:type="dxa" w:w="80"/>
+              <w:bottom w:type="dxa" w:w="50"/>
+              <w:right w:type="dxa" w:w="80"/>
+            </w:tcMar>
+          </w:tcPr>
+          <w:p>
+            <w:r>
+              <w:rPr>
+                <w:b/>
+                <w:bCs/>
+                <w:sz w:val="16"/>
+                <w:szCs w:val="16"/>
+              </w:rPr>
+              <w:t xml:space="preserve">Testfall</w:t>
+            </w:r>
+          </w:p>
+        </w:tc>
+        <w:tc>
+          <w:tcPr>
+            <w:tcW w:type="dxa" w:w="1735"/>
+            <w:tcBorders>
+              <w:top w:val="single" w:color="BFC7D5" w:sz="4"/>
+              <w:left w:val="single" w:color="BFC7D5" w:sz="4"/>
+              <w:bottom w:val="single" w:color="BFC7D5" w:sz="4"/>
+              <w:right w:val="single" w:color="BFC7D5" w:sz="4"/>
+            </w:tcBorders>
+            <w:shd w:fill="DCE3EE" w:color="auto" w:val="clear"/>
+            <w:tcMar>
+              <w:top w:type="dxa" w:w="50"/>
+              <w:left w:type="dxa" w:w="80"/>
+              <w:bottom w:type="dxa" w:w="50"/>
+              <w:right w:type="dxa" w:w="80"/>
+            </w:tcMar>
+          </w:tcPr>
+          <w:p>
+            <w:r>
+              <w:rPr>
+                <w:b/>
+                <w:bCs/>
+                <w:sz w:val="16"/>
+                <w:szCs w:val="16"/>
+              </w:rPr>
+              <w:t xml:space="preserve">Ergebnis</w:t>
+            </w:r>
+          </w:p>
+        </w:tc>
+      </w:tr>
+      <w:tr>
+        <w:tc>
+          <w:tcPr>
+            <w:tcW w:type="dxa" w:w="7903"/>
+            <w:tcBorders>
+              <w:top w:val="single" w:color="BFC7D5" w:sz="4"/>
+              <w:left w:val="single" w:color="BFC7D5" w:sz="4"/>
+              <w:bottom w:val="single" w:color="BFC7D5" w:sz="4"/>
+              <w:right w:val="single" w:color="BFC7D5" w:sz="4"/>
+            </w:tcBorders>
+            <w:tcMar>
+              <w:top w:type="dxa" w:w="50"/>
+              <w:left w:type="dxa" w:w="80"/>
+              <w:bottom w:type="dxa" w:w="50"/>
+              <w:right w:type="dxa" w:w="80"/>
+            </w:tcMar>
+          </w:tcPr>
+          <w:p>
+            <w:r>
+              <w:rPr>
+                <w:b w:val="false"/>
+                <w:bCs w:val="false"/>
+                <w:sz w:val="16"/>
+                <w:szCs w:val="16"/>
+              </w:rPr>
+              <w:t xml:space="preserve">xlsx security sheets appear per level, like the Word sections</w:t>
             </w:r>
           </w:p>
         </w:tc>
@@ -18096,8 +19606,8 @@
       </w:tr>
     </w:tbl>
     <w:sectPr>
-      <w:headerReference w:type="default" r:id="rId7"/>
-      <w:footerReference w:type="default" r:id="rId8"/>
+      <w:headerReference w:type="default" r:id="rId6"/>
+      <w:footerReference w:type="default" r:id="rId7"/>
       <w:pgSz w:w="11906" w:h="16838" w:orient="portrait"/>
       <w:pgMar w:top="1134" w:right="1134" w:bottom="1134" w:left="1134" w:header="708" w:footer="708" w:gutter="0"/>
       <w:pgNumType/>
@@ -18109,43 +19619,6 @@
 
 <file path=word/comments.xml><?xml version="1.0" encoding="utf-8"?>
 <w:comments xmlns:cx="http://schemas.microsoft.com/office/drawing/2014/chartex" xmlns:cx1="http://schemas.microsoft.com/office/drawing/2015/9/8/chartex" xmlns:cx2="http://schemas.microsoft.com/office/drawing/2015/10/21/chartex" xmlns:cx3="http://schemas.microsoft.com/office/drawing/2016/5/9/chartex" xmlns:cx4="http://schemas.microsoft.com/office/drawing/2016/5/10/chartex" xmlns:cx5="http://schemas.microsoft.com/office/drawing/2016/5/11/chartex" xmlns:cx6="http://schemas.microsoft.com/office/drawing/2016/5/12/chartex" xmlns:cx7="http://schemas.microsoft.com/office/drawing/2016/5/13/chartex" xmlns:cx8="http://schemas.microsoft.com/office/drawing/2016/5/14/chartex" xmlns:mc="http://schemas.openxmlformats.org/markup-compatibility/2006" xmlns:aink="http://schemas.microsoft.com/office/drawing/2016/ink" xmlns:am3d="http://schemas.microsoft.com/office/drawing/2017/model3d" xmlns:o="urn:schemas-microsoft-com:office:office" xmlns:r="http://schemas.openxmlformats.org/officeDocument/2006/relationships" xmlns:m="http://schemas.openxmlformats.org/officeDocument/2006/math" xmlns:v="urn:schemas-microsoft-com:vml" xmlns:wp14="http://schemas.microsoft.com/office/word/2010/wordprocessingDrawing" xmlns:wp="http://schemas.openxmlformats.org/drawingml/2006/wordprocessingDrawing" xmlns:w10="urn:schemas-microsoft-com:office:word" xmlns:w="http://schemas.openxmlformats.org/wordprocessingml/2006/main" xmlns:w14="http://schemas.microsoft.com/office/word/2010/wordml" xmlns:w15="http://schemas.microsoft.com/office/word/2012/wordml" xmlns:w16cex="http://schemas.microsoft.com/office/word/2018/wordml/cex" xmlns:w16cid="http://schemas.microsoft.com/office/word/2016/wordml/cid" xmlns:w16="http://schemas.microsoft.com/office/word/2018/wordml" xmlns:w16sdtdh="http://schemas.microsoft.com/office/word/2020/wordml/sdtdatahash" xmlns:w16se="http://schemas.microsoft.com/office/word/2015/wordml/symex" xmlns:wpg="http://schemas.microsoft.com/office/word/2010/wordprocessingGroup" xmlns:wpi="http://schemas.microsoft.com/office/word/2010/wordprocessingInk" xmlns:wne="http://schemas.microsoft.com/office/word/2006/wordml" xmlns:wps="http://schemas.microsoft.com/office/word/2010/wordprocessingShape"/>
-</file>
-
-<file path=word/endnotes.xml><?xml version="1.0" encoding="utf-8"?>
-<w:endnotes xmlns:wpc="http://schemas.microsoft.com/office/word/2010/wordprocessingCanvas" xmlns:mc="http://schemas.openxmlformats.org/markup-compatibility/2006" xmlns:o="urn:schemas-microsoft-com:office:office" xmlns:r="http://schemas.openxmlformats.org/officeDocument/2006/relationships" xmlns:m="http://schemas.openxmlformats.org/officeDocument/2006/math" xmlns:v="urn:schemas-microsoft-com:vml" xmlns:wp14="http://schemas.microsoft.com/office/word/2010/wordprocessingDrawing" xmlns:wp="http://schemas.openxmlformats.org/drawingml/2006/wordprocessingDrawing" xmlns:w10="urn:schemas-microsoft-com:office:word" xmlns:w="http://schemas.openxmlformats.org/wordprocessingml/2006/main" xmlns:w14="http://schemas.microsoft.com/office/word/2010/wordml" xmlns:w15="http://schemas.microsoft.com/office/word/2012/wordml" xmlns:wpg="http://schemas.microsoft.com/office/word/2010/wordprocessingGroup" xmlns:wpi="http://schemas.microsoft.com/office/word/2010/wordprocessingInk" xmlns:wne="http://schemas.microsoft.com/office/word/2006/wordml" xmlns:wps="http://schemas.microsoft.com/office/word/2010/wordprocessingShape" mc:Ignorable="w14 w15 wp14">
-  <w:endnote w:type="separator" w:id="-1">
-    <w:p>
-      <w:pPr>
-        <w:spacing w:after="0" w:line="240" w:lineRule="auto"/>
-      </w:pPr>
-      <w:r>
-        <w:rPr>
-          <w:rStyle w:val="EndnoteReference"/>
-        </w:rPr>
-        <w:endnoteRef/>
-      </w:r>
-      <w:r>
-        <w:separator/>
-      </w:r>
-    </w:p>
-  </w:endnote>
-  <w:endnote w:type="continuationSeparator" w:id="0">
-    <w:p>
-      <w:pPr>
-        <w:spacing w:after="0" w:line="240" w:lineRule="auto"/>
-      </w:pPr>
-      <w:r>
-        <w:rPr>
-          <w:rStyle w:val="EndnoteReference"/>
-        </w:rPr>
-        <w:endnoteRef/>
-      </w:r>
-      <w:r>
-        <w:continuationSeparator/>
-      </w:r>
-    </w:p>
-  </w:endnote>
-</w:endnotes>
 </file>
 
 <file path=word/footer1.xml><?xml version="1.0" encoding="utf-8"?>
@@ -18241,7 +19714,7 @@
         <w:sz w:val="16"/>
         <w:szCs w:val="16"/>
       </w:rPr>
-      <w:t xml:space="preserve">INVENSITY · Werkzeugnachweis RHAS 2026-09-27-wp9</w:t>
+      <w:t xml:space="preserve">INVENSITY · Werkzeugnachweis RHAS 2026-10-07-wp10</w:t>
     </w:r>
   </w:p>
 </w:hdr>
@@ -18365,9 +19838,9 @@
   <w:docDefaults>
     <w:rPrDefault>
       <w:rPr>
-        <w:rFonts w:ascii="Calibri" w:cs="Calibri" w:eastAsia="Calibri" w:hAnsi="Calibri"/>
         <w:sz w:val="21"/>
         <w:szCs w:val="21"/>
+        <w:rFonts w:ascii="Calibri" w:cs="Calibri" w:eastAsia="Calibri" w:hAnsi="Calibri"/>
       </w:rPr>
     </w:rPrDefault>
     <w:pPrDefault/>
@@ -18465,8 +19938,8 @@
     <w:uiPriority w:val="99"/>
     <w:unhideWhenUsed/>
     <w:rPr>
+      <w:u w:val="single"/>
       <w:color w:val="0563C1"/>
-      <w:u w:val="single"/>
     </w:rPr>
   </w:style>
   <w:style w:type="character" w:styleId="FootnoteReference">
@@ -18506,59 +19979,22 @@
       <w:szCs w:val="20"/>
     </w:rPr>
   </w:style>
-  <w:style w:type="character" w:styleId="EndnoteReference">
-    <w:name w:val="endnote reference"/>
-    <w:basedOn w:val="DefaultParagraphFont"/>
-    <w:uiPriority w:val="99"/>
-    <w:semiHidden/>
-    <w:unhideWhenUsed/>
-    <w:rPr>
-      <w:vertAlign w:val="superscript"/>
-    </w:rPr>
-  </w:style>
-  <w:style w:type="paragraph" w:styleId="EndnoteText">
-    <w:name w:val="endnote text"/>
-    <w:basedOn w:val="Normal"/>
-    <w:link w:val="EndnoteTextChar"/>
-    <w:uiPriority w:val="99"/>
-    <w:semiHidden/>
-    <w:unhideWhenUsed/>
-    <w:pPr>
-      <w:spacing w:after="0" w:line="240" w:lineRule="auto"/>
-    </w:pPr>
-    <w:rPr>
-      <w:sz w:val="20"/>
-      <w:szCs w:val="20"/>
-    </w:rPr>
-  </w:style>
-  <w:style w:type="character" w:styleId="EndnoteTextChar">
-    <w:name w:val="Endnote Text Char"/>
-    <w:basedOn w:val="DefaultParagraphFont"/>
-    <w:link w:val="EndnoteText"/>
-    <w:uiPriority w:val="99"/>
-    <w:semiHidden/>
-    <w:unhideWhenUsed/>
-    <w:rPr>
-      <w:sz w:val="20"/>
-      <w:szCs w:val="20"/>
-    </w:rPr>
-  </w:style>
   <w:style w:type="paragraph" w:styleId="Heading1">
     <w:name w:val="Heading 1"/>
     <w:basedOn w:val="Normal"/>
     <w:next w:val="Normal"/>
     <w:qFormat/>
     <w:pPr>
-      <w:spacing w:after="120" w:before="280"/>
+      <w:spacing w:before="280" w:after="120"/>
       <w:outlineLvl w:val="0"/>
     </w:pPr>
     <w:rPr>
-      <w:rFonts w:ascii="Calibri" w:cs="Calibri" w:eastAsia="Calibri" w:hAnsi="Calibri"/>
       <w:b/>
       <w:bCs/>
       <w:color w:val="1F3864"/>
       <w:sz w:val="30"/>
       <w:szCs w:val="30"/>
+      <w:rFonts w:ascii="Calibri" w:cs="Calibri" w:eastAsia="Calibri" w:hAnsi="Calibri"/>
     </w:rPr>
   </w:style>
   <w:style w:type="paragraph" w:styleId="Heading2">
@@ -18567,16 +20003,16 @@
     <w:next w:val="Normal"/>
     <w:qFormat/>
     <w:pPr>
-      <w:spacing w:after="100" w:before="200"/>
+      <w:spacing w:before="200" w:after="100"/>
       <w:outlineLvl w:val="1"/>
     </w:pPr>
     <w:rPr>
-      <w:rFonts w:ascii="Calibri" w:cs="Calibri" w:eastAsia="Calibri" w:hAnsi="Calibri"/>
       <w:b/>
       <w:bCs/>
       <w:color w:val="2E5597"/>
       <w:sz w:val="24"/>
       <w:szCs w:val="24"/>
+      <w:rFonts w:ascii="Calibri" w:cs="Calibri" w:eastAsia="Calibri" w:hAnsi="Calibri"/>
     </w:rPr>
   </w:style>
 </w:styles>

</xml_diff>

<commit_message>
RHAS: validation run and Werkzeugnachweis refreshed (115/115 tests, 8/8 browser checks, commit 7b5a601)
Co-Authored-By: Claude Sonnet 5.5 <noreply@anthropic.com>
Claude-Session: https://claude.ai/code/session_01C75FqTLfyAjNtuqqyZgKLW
</commit_message>
<xml_diff>
--- a/rhas/docs/werkzeugnachweis/04_Werkzeugnachweis_RHAS.docx
+++ b/rhas/docs/werkzeugnachweis/04_Werkzeugnachweis_RHAS.docx
@@ -27,7 +27,7 @@
           <w:sz w:val="22"/>
           <w:szCs w:val="22"/>
         </w:rPr>
-        <w:t xml:space="preserve">Werkzeugbeschreibung, Einstufung nach EN 50129:2018 6.3, Validierung · Version 2026-10-07-wp10 · Stand 2026-10-07 08:30 UTC</w:t>
+        <w:t xml:space="preserve">Werkzeugbeschreibung, Einstufung nach EN 50129:2018 6.3, Validierung · Version 2026-10-07-wp10 · Stand 2026-10-07 09:05 UTC</w:t>
       </w:r>
     </w:p>
     <w:tbl>
@@ -220,7 +220,7 @@
                 <w:sz w:val="18"/>
                 <w:szCs w:val="18"/>
               </w:rPr>
-              <w:t xml:space="preserve">2026-10-07-wp10 / Commit 3b3edc6</w:t>
+              <w:t xml:space="preserve">2026-10-07-wp10 / Commit 7b5a601</w:t>
             </w:r>
           </w:p>
         </w:tc>
@@ -336,7 +336,7 @@
                 <w:sz w:val="18"/>
                 <w:szCs w:val="18"/>
               </w:rPr>
-              <w:t xml:space="preserve">2026-10-07 08:30 UTC; Node v22.22.0, Python 3.13.16, Chromium (Playwright)</w:t>
+              <w:t xml:space="preserve">2026-10-07 09:05 UTC; Node v22.22.0, Python 3.13.16, Chromium (Playwright)</w:t>
             </w:r>
           </w:p>
         </w:tc>
@@ -394,7 +394,7 @@
                 <w:sz w:val="18"/>
                 <w:szCs w:val="18"/>
               </w:rPr>
-              <w:t xml:space="preserve">107 von 107 Modul- und Berichtstests bestanden; 8 von 8 Browser-Prüfungen bestanden</w:t>
+              <w:t xml:space="preserve">115 von 115 Modul- und Berichtstests bestanden; 8 von 8 Browser-Prüfungen bestanden</w:t>
             </w:r>
           </w:p>
         </w:tc>
@@ -3589,7 +3589,7 @@
                 <w:sz w:val="18"/>
                 <w:szCs w:val="18"/>
               </w:rPr>
-              <w:t xml:space="preserve">reports, xlsx-security</w:t>
+              <w:t xml:space="preserve">reports, security-reports, xlsx-security</w:t>
             </w:r>
           </w:p>
         </w:tc>
@@ -3608,7 +3608,7 @@
         <w:spacing w:after="120"/>
       </w:pPr>
       <w:r>
-        <w:t xml:space="preserve">Validierungslauf vom 2026-10-07 08:30 UTC mit Version 2026-10-07-wp10 (Commit 3b3edc6). Der Lauf ist mit „python3 scripts/validate.py“ wiederholbar; die Rohdaten liegen unter docs/validation.</w:t>
+        <w:t xml:space="preserve">Validierungslauf vom 2026-10-07 09:05 UTC mit Version 2026-10-07-wp10 (Commit 7b5a601). Der Lauf ist mit „python3 scripts/validate.py“ wiederholbar; die Rohdaten liegen unter docs/validation.</w:t>
       </w:r>
     </w:p>
     <w:p>
@@ -5375,6 +5375,148 @@
                 <w:sz w:val="18"/>
                 <w:szCs w:val="18"/>
               </w:rPr>
+              <w:t xml:space="preserve">Berichte Security-Stufen 1–3 (Golden-Dateien)</w:t>
+            </w:r>
+          </w:p>
+        </w:tc>
+        <w:tc>
+          <w:tcPr>
+            <w:tcW w:type="dxa" w:w="2506"/>
+            <w:tcBorders>
+              <w:top w:val="single" w:color="BFC7D5" w:sz="4"/>
+              <w:left w:val="single" w:color="BFC7D5" w:sz="4"/>
+              <w:bottom w:val="single" w:color="BFC7D5" w:sz="4"/>
+              <w:right w:val="single" w:color="BFC7D5" w:sz="4"/>
+            </w:tcBorders>
+            <w:tcMar>
+              <w:top w:type="dxa" w:w="50"/>
+              <w:left w:type="dxa" w:w="80"/>
+              <w:bottom w:type="dxa" w:w="50"/>
+              <w:right w:type="dxa" w:w="80"/>
+            </w:tcMar>
+          </w:tcPr>
+          <w:p>
+            <w:r>
+              <w:rPr>
+                <w:b w:val="false"/>
+                <w:bCs w:val="false"/>
+                <w:sz w:val="18"/>
+                <w:szCs w:val="18"/>
+              </w:rPr>
+              <w:t xml:space="preserve">security-reports.test.js</w:t>
+            </w:r>
+          </w:p>
+        </w:tc>
+        <w:tc>
+          <w:tcPr>
+            <w:tcW w:type="dxa" w:w="1157"/>
+            <w:tcBorders>
+              <w:top w:val="single" w:color="BFC7D5" w:sz="4"/>
+              <w:left w:val="single" w:color="BFC7D5" w:sz="4"/>
+              <w:bottom w:val="single" w:color="BFC7D5" w:sz="4"/>
+              <w:right w:val="single" w:color="BFC7D5" w:sz="4"/>
+            </w:tcBorders>
+            <w:tcMar>
+              <w:top w:type="dxa" w:w="50"/>
+              <w:left w:type="dxa" w:w="80"/>
+              <w:bottom w:type="dxa" w:w="50"/>
+              <w:right w:type="dxa" w:w="80"/>
+            </w:tcMar>
+          </w:tcPr>
+          <w:p>
+            <w:r>
+              <w:rPr>
+                <w:b w:val="false"/>
+                <w:bCs w:val="false"/>
+                <w:sz w:val="18"/>
+                <w:szCs w:val="18"/>
+              </w:rPr>
+              <w:t xml:space="preserve">8</w:t>
+            </w:r>
+          </w:p>
+        </w:tc>
+        <w:tc>
+          <w:tcPr>
+            <w:tcW w:type="dxa" w:w="1349"/>
+            <w:tcBorders>
+              <w:top w:val="single" w:color="BFC7D5" w:sz="4"/>
+              <w:left w:val="single" w:color="BFC7D5" w:sz="4"/>
+              <w:bottom w:val="single" w:color="BFC7D5" w:sz="4"/>
+              <w:right w:val="single" w:color="BFC7D5" w:sz="4"/>
+            </w:tcBorders>
+            <w:tcMar>
+              <w:top w:type="dxa" w:w="50"/>
+              <w:left w:type="dxa" w:w="80"/>
+              <w:bottom w:type="dxa" w:w="50"/>
+              <w:right w:type="dxa" w:w="80"/>
+            </w:tcMar>
+          </w:tcPr>
+          <w:p>
+            <w:r>
+              <w:rPr>
+                <w:b w:val="false"/>
+                <w:bCs w:val="false"/>
+                <w:sz w:val="18"/>
+                <w:szCs w:val="18"/>
+              </w:rPr>
+              <w:t xml:space="preserve">8</w:t>
+            </w:r>
+          </w:p>
+        </w:tc>
+        <w:tc>
+          <w:tcPr>
+            <w:tcW w:type="dxa" w:w="1349"/>
+            <w:tcBorders>
+              <w:top w:val="single" w:color="BFC7D5" w:sz="4"/>
+              <w:left w:val="single" w:color="BFC7D5" w:sz="4"/>
+              <w:bottom w:val="single" w:color="BFC7D5" w:sz="4"/>
+              <w:right w:val="single" w:color="BFC7D5" w:sz="4"/>
+            </w:tcBorders>
+            <w:tcMar>
+              <w:top w:type="dxa" w:w="50"/>
+              <w:left w:type="dxa" w:w="80"/>
+              <w:bottom w:type="dxa" w:w="50"/>
+              <w:right w:type="dxa" w:w="80"/>
+            </w:tcMar>
+          </w:tcPr>
+          <w:p>
+            <w:r>
+              <w:rPr>
+                <w:b w:val="false"/>
+                <w:bCs w:val="false"/>
+                <w:sz w:val="18"/>
+                <w:szCs w:val="18"/>
+              </w:rPr>
+              <w:t xml:space="preserve">0</w:t>
+            </w:r>
+          </w:p>
+        </w:tc>
+      </w:tr>
+      <w:tr>
+        <w:tc>
+          <w:tcPr>
+            <w:tcW w:type="dxa" w:w="3277"/>
+            <w:tcBorders>
+              <w:top w:val="single" w:color="BFC7D5" w:sz="4"/>
+              <w:left w:val="single" w:color="BFC7D5" w:sz="4"/>
+              <w:bottom w:val="single" w:color="BFC7D5" w:sz="4"/>
+              <w:right w:val="single" w:color="BFC7D5" w:sz="4"/>
+            </w:tcBorders>
+            <w:tcMar>
+              <w:top w:type="dxa" w:w="50"/>
+              <w:left w:type="dxa" w:w="80"/>
+              <w:bottom w:type="dxa" w:w="50"/>
+              <w:right w:type="dxa" w:w="80"/>
+            </w:tcMar>
+          </w:tcPr>
+          <w:p>
+            <w:r>
+              <w:rPr>
+                <w:b w:val="false"/>
+                <w:bCs w:val="false"/>
+                <w:sz w:val="18"/>
+                <w:szCs w:val="18"/>
+              </w:rPr>
               <w:t xml:space="preserve">Security Stufe 1</w:t>
             </w:r>
           </w:p>
@@ -5998,7 +6140,7 @@
                 <w:sz w:val="18"/>
                 <w:szCs w:val="18"/>
               </w:rPr>
-              <w:t xml:space="preserve">107</w:t>
+              <w:t xml:space="preserve">115</w:t>
             </w:r>
           </w:p>
         </w:tc>
@@ -6026,7 +6168,7 @@
                 <w:sz w:val="18"/>
                 <w:szCs w:val="18"/>
               </w:rPr>
-              <w:t xml:space="preserve">107</w:t>
+              <w:t xml:space="preserve">115</w:t>
             </w:r>
           </w:p>
         </w:tc>
@@ -13952,6 +14094,566 @@
                 <w:szCs w:val="16"/>
               </w:rPr>
               <w:t xml:space="preserve">every report states the RAMS scope (safety only)</w:t>
+            </w:r>
+          </w:p>
+        </w:tc>
+        <w:tc>
+          <w:tcPr>
+            <w:tcW w:type="dxa" w:w="1735"/>
+            <w:tcBorders>
+              <w:top w:val="single" w:color="BFC7D5" w:sz="4"/>
+              <w:left w:val="single" w:color="BFC7D5" w:sz="4"/>
+              <w:bottom w:val="single" w:color="BFC7D5" w:sz="4"/>
+              <w:right w:val="single" w:color="BFC7D5" w:sz="4"/>
+            </w:tcBorders>
+            <w:shd w:fill="E6F3EA" w:color="auto" w:val="clear"/>
+            <w:tcMar>
+              <w:top w:type="dxa" w:w="50"/>
+              <w:left w:type="dxa" w:w="80"/>
+              <w:bottom w:type="dxa" w:w="50"/>
+              <w:right w:type="dxa" w:w="80"/>
+            </w:tcMar>
+          </w:tcPr>
+          <w:p>
+            <w:r>
+              <w:rPr>
+                <w:b w:val="false"/>
+                <w:bCs w:val="false"/>
+                <w:sz w:val="16"/>
+                <w:szCs w:val="16"/>
+              </w:rPr>
+              <w:t xml:space="preserve">bestanden</w:t>
+            </w:r>
+          </w:p>
+        </w:tc>
+      </w:tr>
+    </w:tbl>
+    <w:p>
+      <w:pPr>
+        <w:pStyle w:val="Heading2"/>
+      </w:pPr>
+      <w:r>
+        <w:t xml:space="preserve">Berichte Security-Stufen 1–3 (Golden-Dateien) (security-reports.test.js)</w:t>
+      </w:r>
+    </w:p>
+    <w:tbl>
+      <w:tblPr>
+        <w:tblW w:type="dxa" w:w="9638"/>
+        <w:tblBorders>
+          <w:top w:val="single" w:color="auto" w:sz="4"/>
+          <w:left w:val="single" w:color="auto" w:sz="4"/>
+          <w:bottom w:val="single" w:color="auto" w:sz="4"/>
+          <w:right w:val="single" w:color="auto" w:sz="4"/>
+          <w:insideH w:val="single" w:color="auto" w:sz="4"/>
+          <w:insideV w:val="single" w:color="auto" w:sz="4"/>
+        </w:tblBorders>
+      </w:tblPr>
+      <w:tblGrid>
+        <w:gridCol w:w="7903"/>
+        <w:gridCol w:w="1735"/>
+      </w:tblGrid>
+      <w:tr>
+        <w:trPr>
+          <w:tblHeader/>
+        </w:trPr>
+        <w:tc>
+          <w:tcPr>
+            <w:tcW w:type="dxa" w:w="7903"/>
+            <w:tcBorders>
+              <w:top w:val="single" w:color="BFC7D5" w:sz="4"/>
+              <w:left w:val="single" w:color="BFC7D5" w:sz="4"/>
+              <w:bottom w:val="single" w:color="BFC7D5" w:sz="4"/>
+              <w:right w:val="single" w:color="BFC7D5" w:sz="4"/>
+            </w:tcBorders>
+            <w:shd w:fill="DCE3EE" w:color="auto" w:val="clear"/>
+            <w:tcMar>
+              <w:top w:type="dxa" w:w="50"/>
+              <w:left w:type="dxa" w:w="80"/>
+              <w:bottom w:type="dxa" w:w="50"/>
+              <w:right w:type="dxa" w:w="80"/>
+            </w:tcMar>
+          </w:tcPr>
+          <w:p>
+            <w:r>
+              <w:rPr>
+                <w:b/>
+                <w:bCs/>
+                <w:sz w:val="16"/>
+                <w:szCs w:val="16"/>
+              </w:rPr>
+              <w:t xml:space="preserve">Testfall</w:t>
+            </w:r>
+          </w:p>
+        </w:tc>
+        <w:tc>
+          <w:tcPr>
+            <w:tcW w:type="dxa" w:w="1735"/>
+            <w:tcBorders>
+              <w:top w:val="single" w:color="BFC7D5" w:sz="4"/>
+              <w:left w:val="single" w:color="BFC7D5" w:sz="4"/>
+              <w:bottom w:val="single" w:color="BFC7D5" w:sz="4"/>
+              <w:right w:val="single" w:color="BFC7D5" w:sz="4"/>
+            </w:tcBorders>
+            <w:shd w:fill="DCE3EE" w:color="auto" w:val="clear"/>
+            <w:tcMar>
+              <w:top w:type="dxa" w:w="50"/>
+              <w:left w:type="dxa" w:w="80"/>
+              <w:bottom w:type="dxa" w:w="50"/>
+              <w:right w:type="dxa" w:w="80"/>
+            </w:tcMar>
+          </w:tcPr>
+          <w:p>
+            <w:r>
+              <w:rPr>
+                <w:b/>
+                <w:bCs/>
+                <w:sz w:val="16"/>
+                <w:szCs w:val="16"/>
+              </w:rPr>
+              <w:t xml:space="preserve">Ergebnis</w:t>
+            </w:r>
+          </w:p>
+        </w:tc>
+      </w:tr>
+      <w:tr>
+        <w:tc>
+          <w:tcPr>
+            <w:tcW w:type="dxa" w:w="7903"/>
+            <w:tcBorders>
+              <w:top w:val="single" w:color="BFC7D5" w:sz="4"/>
+              <w:left w:val="single" w:color="BFC7D5" w:sz="4"/>
+              <w:bottom w:val="single" w:color="BFC7D5" w:sz="4"/>
+              <w:right w:val="single" w:color="BFC7D5" w:sz="4"/>
+            </w:tcBorders>
+            <w:tcMar>
+              <w:top w:type="dxa" w:w="50"/>
+              <w:left w:type="dxa" w:w="80"/>
+              <w:bottom w:type="dxa" w:w="50"/>
+              <w:right w:type="dxa" w:w="80"/>
+            </w:tcMar>
+          </w:tcPr>
+          <w:p>
+            <w:r>
+              <w:rPr>
+                <w:b w:val="false"/>
+                <w:bCs w:val="false"/>
+                <w:sz w:val="16"/>
+                <w:szCs w:val="16"/>
+              </w:rPr>
+              <w:t xml:space="preserve">level 1: DOCX full is deterministic and matches golden text</w:t>
+            </w:r>
+          </w:p>
+        </w:tc>
+        <w:tc>
+          <w:tcPr>
+            <w:tcW w:type="dxa" w:w="1735"/>
+            <w:tcBorders>
+              <w:top w:val="single" w:color="BFC7D5" w:sz="4"/>
+              <w:left w:val="single" w:color="BFC7D5" w:sz="4"/>
+              <w:bottom w:val="single" w:color="BFC7D5" w:sz="4"/>
+              <w:right w:val="single" w:color="BFC7D5" w:sz="4"/>
+            </w:tcBorders>
+            <w:shd w:fill="E6F3EA" w:color="auto" w:val="clear"/>
+            <w:tcMar>
+              <w:top w:type="dxa" w:w="50"/>
+              <w:left w:type="dxa" w:w="80"/>
+              <w:bottom w:type="dxa" w:w="50"/>
+              <w:right w:type="dxa" w:w="80"/>
+            </w:tcMar>
+          </w:tcPr>
+          <w:p>
+            <w:r>
+              <w:rPr>
+                <w:b w:val="false"/>
+                <w:bCs w:val="false"/>
+                <w:sz w:val="16"/>
+                <w:szCs w:val="16"/>
+              </w:rPr>
+              <w:t xml:space="preserve">bestanden</w:t>
+            </w:r>
+          </w:p>
+        </w:tc>
+      </w:tr>
+      <w:tr>
+        <w:tc>
+          <w:tcPr>
+            <w:tcW w:type="dxa" w:w="7903"/>
+            <w:tcBorders>
+              <w:top w:val="single" w:color="BFC7D5" w:sz="4"/>
+              <w:left w:val="single" w:color="BFC7D5" w:sz="4"/>
+              <w:bottom w:val="single" w:color="BFC7D5" w:sz="4"/>
+              <w:right w:val="single" w:color="BFC7D5" w:sz="4"/>
+            </w:tcBorders>
+            <w:tcMar>
+              <w:top w:type="dxa" w:w="50"/>
+              <w:left w:type="dxa" w:w="80"/>
+              <w:bottom w:type="dxa" w:w="50"/>
+              <w:right w:type="dxa" w:w="80"/>
+            </w:tcMar>
+          </w:tcPr>
+          <w:p>
+            <w:r>
+              <w:rPr>
+                <w:b w:val="false"/>
+                <w:bCs w:val="false"/>
+                <w:sz w:val="16"/>
+                <w:szCs w:val="16"/>
+              </w:rPr>
+              <w:t xml:space="preserve">level 1: XLSX workbook matches golden content</w:t>
+            </w:r>
+          </w:p>
+        </w:tc>
+        <w:tc>
+          <w:tcPr>
+            <w:tcW w:type="dxa" w:w="1735"/>
+            <w:tcBorders>
+              <w:top w:val="single" w:color="BFC7D5" w:sz="4"/>
+              <w:left w:val="single" w:color="BFC7D5" w:sz="4"/>
+              <w:bottom w:val="single" w:color="BFC7D5" w:sz="4"/>
+              <w:right w:val="single" w:color="BFC7D5" w:sz="4"/>
+            </w:tcBorders>
+            <w:shd w:fill="E6F3EA" w:color="auto" w:val="clear"/>
+            <w:tcMar>
+              <w:top w:type="dxa" w:w="50"/>
+              <w:left w:type="dxa" w:w="80"/>
+              <w:bottom w:type="dxa" w:w="50"/>
+              <w:right w:type="dxa" w:w="80"/>
+            </w:tcMar>
+          </w:tcPr>
+          <w:p>
+            <w:r>
+              <w:rPr>
+                <w:b w:val="false"/>
+                <w:bCs w:val="false"/>
+                <w:sz w:val="16"/>
+                <w:szCs w:val="16"/>
+              </w:rPr>
+              <w:t xml:space="preserve">bestanden</w:t>
+            </w:r>
+          </w:p>
+        </w:tc>
+      </w:tr>
+      <w:tr>
+        <w:tc>
+          <w:tcPr>
+            <w:tcW w:type="dxa" w:w="7903"/>
+            <w:tcBorders>
+              <w:top w:val="single" w:color="BFC7D5" w:sz="4"/>
+              <w:left w:val="single" w:color="BFC7D5" w:sz="4"/>
+              <w:bottom w:val="single" w:color="BFC7D5" w:sz="4"/>
+              <w:right w:val="single" w:color="BFC7D5" w:sz="4"/>
+            </w:tcBorders>
+            <w:tcMar>
+              <w:top w:type="dxa" w:w="50"/>
+              <w:left w:type="dxa" w:w="80"/>
+              <w:bottom w:type="dxa" w:w="50"/>
+              <w:right w:type="dxa" w:w="80"/>
+            </w:tcMar>
+          </w:tcPr>
+          <w:p>
+            <w:r>
+              <w:rPr>
+                <w:b w:val="false"/>
+                <w:bCs w:val="false"/>
+                <w:sz w:val="16"/>
+                <w:szCs w:val="16"/>
+              </w:rPr>
+              <w:t xml:space="preserve">level 2: DOCX full is deterministic and matches golden text</w:t>
+            </w:r>
+          </w:p>
+        </w:tc>
+        <w:tc>
+          <w:tcPr>
+            <w:tcW w:type="dxa" w:w="1735"/>
+            <w:tcBorders>
+              <w:top w:val="single" w:color="BFC7D5" w:sz="4"/>
+              <w:left w:val="single" w:color="BFC7D5" w:sz="4"/>
+              <w:bottom w:val="single" w:color="BFC7D5" w:sz="4"/>
+              <w:right w:val="single" w:color="BFC7D5" w:sz="4"/>
+            </w:tcBorders>
+            <w:shd w:fill="E6F3EA" w:color="auto" w:val="clear"/>
+            <w:tcMar>
+              <w:top w:type="dxa" w:w="50"/>
+              <w:left w:type="dxa" w:w="80"/>
+              <w:bottom w:type="dxa" w:w="50"/>
+              <w:right w:type="dxa" w:w="80"/>
+            </w:tcMar>
+          </w:tcPr>
+          <w:p>
+            <w:r>
+              <w:rPr>
+                <w:b w:val="false"/>
+                <w:bCs w:val="false"/>
+                <w:sz w:val="16"/>
+                <w:szCs w:val="16"/>
+              </w:rPr>
+              <w:t xml:space="preserve">bestanden</w:t>
+            </w:r>
+          </w:p>
+        </w:tc>
+      </w:tr>
+      <w:tr>
+        <w:tc>
+          <w:tcPr>
+            <w:tcW w:type="dxa" w:w="7903"/>
+            <w:tcBorders>
+              <w:top w:val="single" w:color="BFC7D5" w:sz="4"/>
+              <w:left w:val="single" w:color="BFC7D5" w:sz="4"/>
+              <w:bottom w:val="single" w:color="BFC7D5" w:sz="4"/>
+              <w:right w:val="single" w:color="BFC7D5" w:sz="4"/>
+            </w:tcBorders>
+            <w:tcMar>
+              <w:top w:type="dxa" w:w="50"/>
+              <w:left w:type="dxa" w:w="80"/>
+              <w:bottom w:type="dxa" w:w="50"/>
+              <w:right w:type="dxa" w:w="80"/>
+            </w:tcMar>
+          </w:tcPr>
+          <w:p>
+            <w:r>
+              <w:rPr>
+                <w:b w:val="false"/>
+                <w:bCs w:val="false"/>
+                <w:sz w:val="16"/>
+                <w:szCs w:val="16"/>
+              </w:rPr>
+              <w:t xml:space="preserve">level 2: XLSX workbook matches golden content</w:t>
+            </w:r>
+          </w:p>
+        </w:tc>
+        <w:tc>
+          <w:tcPr>
+            <w:tcW w:type="dxa" w:w="1735"/>
+            <w:tcBorders>
+              <w:top w:val="single" w:color="BFC7D5" w:sz="4"/>
+              <w:left w:val="single" w:color="BFC7D5" w:sz="4"/>
+              <w:bottom w:val="single" w:color="BFC7D5" w:sz="4"/>
+              <w:right w:val="single" w:color="BFC7D5" w:sz="4"/>
+            </w:tcBorders>
+            <w:shd w:fill="E6F3EA" w:color="auto" w:val="clear"/>
+            <w:tcMar>
+              <w:top w:type="dxa" w:w="50"/>
+              <w:left w:type="dxa" w:w="80"/>
+              <w:bottom w:type="dxa" w:w="50"/>
+              <w:right w:type="dxa" w:w="80"/>
+            </w:tcMar>
+          </w:tcPr>
+          <w:p>
+            <w:r>
+              <w:rPr>
+                <w:b w:val="false"/>
+                <w:bCs w:val="false"/>
+                <w:sz w:val="16"/>
+                <w:szCs w:val="16"/>
+              </w:rPr>
+              <w:t xml:space="preserve">bestanden</w:t>
+            </w:r>
+          </w:p>
+        </w:tc>
+      </w:tr>
+      <w:tr>
+        <w:tc>
+          <w:tcPr>
+            <w:tcW w:type="dxa" w:w="7903"/>
+            <w:tcBorders>
+              <w:top w:val="single" w:color="BFC7D5" w:sz="4"/>
+              <w:left w:val="single" w:color="BFC7D5" w:sz="4"/>
+              <w:bottom w:val="single" w:color="BFC7D5" w:sz="4"/>
+              <w:right w:val="single" w:color="BFC7D5" w:sz="4"/>
+            </w:tcBorders>
+            <w:tcMar>
+              <w:top w:type="dxa" w:w="50"/>
+              <w:left w:type="dxa" w:w="80"/>
+              <w:bottom w:type="dxa" w:w="50"/>
+              <w:right w:type="dxa" w:w="80"/>
+            </w:tcMar>
+          </w:tcPr>
+          <w:p>
+            <w:r>
+              <w:rPr>
+                <w:b w:val="false"/>
+                <w:bCs w:val="false"/>
+                <w:sz w:val="16"/>
+                <w:szCs w:val="16"/>
+              </w:rPr>
+              <w:t xml:space="preserve">level 3: DOCX full is deterministic and matches golden text</w:t>
+            </w:r>
+          </w:p>
+        </w:tc>
+        <w:tc>
+          <w:tcPr>
+            <w:tcW w:type="dxa" w:w="1735"/>
+            <w:tcBorders>
+              <w:top w:val="single" w:color="BFC7D5" w:sz="4"/>
+              <w:left w:val="single" w:color="BFC7D5" w:sz="4"/>
+              <w:bottom w:val="single" w:color="BFC7D5" w:sz="4"/>
+              <w:right w:val="single" w:color="BFC7D5" w:sz="4"/>
+            </w:tcBorders>
+            <w:shd w:fill="E6F3EA" w:color="auto" w:val="clear"/>
+            <w:tcMar>
+              <w:top w:type="dxa" w:w="50"/>
+              <w:left w:type="dxa" w:w="80"/>
+              <w:bottom w:type="dxa" w:w="50"/>
+              <w:right w:type="dxa" w:w="80"/>
+            </w:tcMar>
+          </w:tcPr>
+          <w:p>
+            <w:r>
+              <w:rPr>
+                <w:b w:val="false"/>
+                <w:bCs w:val="false"/>
+                <w:sz w:val="16"/>
+                <w:szCs w:val="16"/>
+              </w:rPr>
+              <w:t xml:space="preserve">bestanden</w:t>
+            </w:r>
+          </w:p>
+        </w:tc>
+      </w:tr>
+      <w:tr>
+        <w:tc>
+          <w:tcPr>
+            <w:tcW w:type="dxa" w:w="7903"/>
+            <w:tcBorders>
+              <w:top w:val="single" w:color="BFC7D5" w:sz="4"/>
+              <w:left w:val="single" w:color="BFC7D5" w:sz="4"/>
+              <w:bottom w:val="single" w:color="BFC7D5" w:sz="4"/>
+              <w:right w:val="single" w:color="BFC7D5" w:sz="4"/>
+            </w:tcBorders>
+            <w:tcMar>
+              <w:top w:type="dxa" w:w="50"/>
+              <w:left w:type="dxa" w:w="80"/>
+              <w:bottom w:type="dxa" w:w="50"/>
+              <w:right w:type="dxa" w:w="80"/>
+            </w:tcMar>
+          </w:tcPr>
+          <w:p>
+            <w:r>
+              <w:rPr>
+                <w:b w:val="false"/>
+                <w:bCs w:val="false"/>
+                <w:sz w:val="16"/>
+                <w:szCs w:val="16"/>
+              </w:rPr>
+              <w:t xml:space="preserve">level 3: XLSX workbook matches golden content</w:t>
+            </w:r>
+          </w:p>
+        </w:tc>
+        <w:tc>
+          <w:tcPr>
+            <w:tcW w:type="dxa" w:w="1735"/>
+            <w:tcBorders>
+              <w:top w:val="single" w:color="BFC7D5" w:sz="4"/>
+              <w:left w:val="single" w:color="BFC7D5" w:sz="4"/>
+              <w:bottom w:val="single" w:color="BFC7D5" w:sz="4"/>
+              <w:right w:val="single" w:color="BFC7D5" w:sz="4"/>
+            </w:tcBorders>
+            <w:shd w:fill="E6F3EA" w:color="auto" w:val="clear"/>
+            <w:tcMar>
+              <w:top w:type="dxa" w:w="50"/>
+              <w:left w:type="dxa" w:w="80"/>
+              <w:bottom w:type="dxa" w:w="50"/>
+              <w:right w:type="dxa" w:w="80"/>
+            </w:tcMar>
+          </w:tcPr>
+          <w:p>
+            <w:r>
+              <w:rPr>
+                <w:b w:val="false"/>
+                <w:bCs w:val="false"/>
+                <w:sz w:val="16"/>
+                <w:szCs w:val="16"/>
+              </w:rPr>
+              <w:t xml:space="preserve">bestanden</w:t>
+            </w:r>
+          </w:p>
+        </w:tc>
+      </w:tr>
+      <w:tr>
+        <w:tc>
+          <w:tcPr>
+            <w:tcW w:type="dxa" w:w="7903"/>
+            <w:tcBorders>
+              <w:top w:val="single" w:color="BFC7D5" w:sz="4"/>
+              <w:left w:val="single" w:color="BFC7D5" w:sz="4"/>
+              <w:bottom w:val="single" w:color="BFC7D5" w:sz="4"/>
+              <w:right w:val="single" w:color="BFC7D5" w:sz="4"/>
+            </w:tcBorders>
+            <w:tcMar>
+              <w:top w:type="dxa" w:w="50"/>
+              <w:left w:type="dxa" w:w="80"/>
+              <w:bottom w:type="dxa" w:w="50"/>
+              <w:right w:type="dxa" w:w="80"/>
+            </w:tcMar>
+          </w:tcPr>
+          <w:p>
+            <w:r>
+              <w:rPr>
+                <w:b w:val="false"/>
+                <w:bCs w:val="false"/>
+                <w:sz w:val="16"/>
+                <w:szCs w:val="16"/>
+              </w:rPr>
+              <w:t xml:space="preserve">level 3: print view matches golden HTML and contains no unescaped markup from data</w:t>
+            </w:r>
+          </w:p>
+        </w:tc>
+        <w:tc>
+          <w:tcPr>
+            <w:tcW w:type="dxa" w:w="1735"/>
+            <w:tcBorders>
+              <w:top w:val="single" w:color="BFC7D5" w:sz="4"/>
+              <w:left w:val="single" w:color="BFC7D5" w:sz="4"/>
+              <w:bottom w:val="single" w:color="BFC7D5" w:sz="4"/>
+              <w:right w:val="single" w:color="BFC7D5" w:sz="4"/>
+            </w:tcBorders>
+            <w:shd w:fill="E6F3EA" w:color="auto" w:val="clear"/>
+            <w:tcMar>
+              <w:top w:type="dxa" w:w="50"/>
+              <w:left w:type="dxa" w:w="80"/>
+              <w:bottom w:type="dxa" w:w="50"/>
+              <w:right w:type="dxa" w:w="80"/>
+            </w:tcMar>
+          </w:tcPr>
+          <w:p>
+            <w:r>
+              <w:rPr>
+                <w:b w:val="false"/>
+                <w:bCs w:val="false"/>
+                <w:sz w:val="16"/>
+                <w:szCs w:val="16"/>
+              </w:rPr>
+              <w:t xml:space="preserve">bestanden</w:t>
+            </w:r>
+          </w:p>
+        </w:tc>
+      </w:tr>
+      <w:tr>
+        <w:tc>
+          <w:tcPr>
+            <w:tcW w:type="dxa" w:w="7903"/>
+            <w:tcBorders>
+              <w:top w:val="single" w:color="BFC7D5" w:sz="4"/>
+              <w:left w:val="single" w:color="BFC7D5" w:sz="4"/>
+              <w:bottom w:val="single" w:color="BFC7D5" w:sz="4"/>
+              <w:right w:val="single" w:color="BFC7D5" w:sz="4"/>
+            </w:tcBorders>
+            <w:tcMar>
+              <w:top w:type="dxa" w:w="50"/>
+              <w:left w:type="dxa" w:w="80"/>
+              <w:bottom w:type="dxa" w:w="50"/>
+              <w:right w:type="dxa" w:w="80"/>
+            </w:tcMar>
+          </w:tcPr>
+          <w:p>
+            <w:r>
+              <w:rPr>
+                <w:b w:val="false"/>
+                <w:bCs w:val="false"/>
+                <w:sz w:val="16"/>
+                <w:szCs w:val="16"/>
+              </w:rPr>
+              <w:t xml:space="preserve">hostile text in security records is escaped in print and DOCX output</w:t>
             </w:r>
           </w:p>
         </w:tc>

</xml_diff>

<commit_message>
RHAS: validation run and Werkzeugnachweis for 2026-10-07-wp11 (115/115 Node tests, 9/9 browser checks); local package updated
Co-Authored-By: Claude Sonnet 5.5 <noreply@anthropic.com>
Claude-Session: https://claude.ai/code/session_01C75FqTLfyAjNtuqqyZgKLW
</commit_message>
<xml_diff>
--- a/rhas/docs/werkzeugnachweis/04_Werkzeugnachweis_RHAS.docx
+++ b/rhas/docs/werkzeugnachweis/04_Werkzeugnachweis_RHAS.docx
@@ -27,7 +27,7 @@
           <w:sz w:val="22"/>
           <w:szCs w:val="22"/>
         </w:rPr>
-        <w:t xml:space="preserve">Werkzeugbeschreibung, Einstufung nach EN 50129:2018 6.3, Validierung · Version 2026-10-07-wp10 · Stand 2026-10-07 09:05 UTC</w:t>
+        <w:t xml:space="preserve">Werkzeugbeschreibung, Einstufung nach EN 50129:2018 6.3, Validierung · Version 2026-10-07-wp11 · Stand 2026-10-07 09:13 UTC</w:t>
       </w:r>
     </w:p>
     <w:tbl>
@@ -220,7 +220,7 @@
                 <w:sz w:val="18"/>
                 <w:szCs w:val="18"/>
               </w:rPr>
-              <w:t xml:space="preserve">2026-10-07-wp10 / Commit 7b5a601</w:t>
+              <w:t xml:space="preserve">2026-10-07-wp11 / Commit 463d301</w:t>
             </w:r>
           </w:p>
         </w:tc>
@@ -278,7 +278,7 @@
                 <w:sz w:val="18"/>
                 <w:szCs w:val="18"/>
               </w:rPr>
-              <w:t xml:space="preserve">aef2ec147b77db306ff2c1ce6ca43432adca325e749bd763af2ee1955c385245</w:t>
+              <w:t xml:space="preserve">ea466c05fd1321b5d750c2d7be5a19318a60411c8c71089bc4d3f84e4c9fc511</w:t>
             </w:r>
           </w:p>
         </w:tc>
@@ -336,7 +336,7 @@
                 <w:sz w:val="18"/>
                 <w:szCs w:val="18"/>
               </w:rPr>
-              <w:t xml:space="preserve">2026-10-07 09:05 UTC; Node v22.22.0, Python 3.13.16, Chromium (Playwright)</w:t>
+              <w:t xml:space="preserve">2026-10-07 09:13 UTC; Node v22.22.0, Python 3.13.16, Chromium (Playwright)</w:t>
             </w:r>
           </w:p>
         </w:tc>
@@ -394,7 +394,7 @@
                 <w:sz w:val="18"/>
                 <w:szCs w:val="18"/>
               </w:rPr>
-              <w:t xml:space="preserve">115 von 115 Modul- und Berichtstests bestanden; 8 von 8 Browser-Prüfungen bestanden</w:t>
+              <w:t xml:space="preserve">115 von 115 Modul- und Berichtstests bestanden; 9 von 9 Browser-Prüfungen bestanden</w:t>
             </w:r>
           </w:p>
         </w:tc>
@@ -3533,6 +3533,92 @@
                 <w:sz w:val="18"/>
                 <w:szCs w:val="18"/>
               </w:rPr>
+              <w:t xml:space="preserve">TR-16</w:t>
+            </w:r>
+          </w:p>
+        </w:tc>
+        <w:tc>
+          <w:tcPr>
+            <w:tcW w:type="dxa" w:w="6168"/>
+            <w:tcBorders>
+              <w:top w:val="single" w:color="BFC7D5" w:sz="4"/>
+              <w:left w:val="single" w:color="BFC7D5" w:sz="4"/>
+              <w:bottom w:val="single" w:color="BFC7D5" w:sz="4"/>
+              <w:right w:val="single" w:color="BFC7D5" w:sz="4"/>
+            </w:tcBorders>
+            <w:tcMar>
+              <w:top w:type="dxa" w:w="50"/>
+              <w:left w:type="dxa" w:w="80"/>
+              <w:bottom w:type="dxa" w:w="50"/>
+              <w:right w:type="dxa" w:w="80"/>
+            </w:tcMar>
+          </w:tcPr>
+          <w:p>
+            <w:r>
+              <w:rPr>
+                <w:b w:val="false"/>
+                <w:bCs w:val="false"/>
+                <w:sz w:val="18"/>
+                <w:szCs w:val="18"/>
+              </w:rPr>
+              <w:t xml:space="preserve">Bedienbarkeit: Tabellenzeilen, Reiter, Dialoge und Seitenleiste sind per Tastatur bedienbar (Fokus in Dialoge und zurück, Fokusfalle in modalen Dialogen); Eingabefelder, Schaltflächen und Statusmeldungen haben zugängliche Namen; automatische Prüfung mit axe-core (WCAG 2.1 AA) ohne Befund auf allen Arbeitsschritten.</w:t>
+            </w:r>
+          </w:p>
+        </w:tc>
+        <w:tc>
+          <w:tcPr>
+            <w:tcW w:type="dxa" w:w="2699"/>
+            <w:tcBorders>
+              <w:top w:val="single" w:color="BFC7D5" w:sz="4"/>
+              <w:left w:val="single" w:color="BFC7D5" w:sz="4"/>
+              <w:bottom w:val="single" w:color="BFC7D5" w:sz="4"/>
+              <w:right w:val="single" w:color="BFC7D5" w:sz="4"/>
+            </w:tcBorders>
+            <w:tcMar>
+              <w:top w:type="dxa" w:w="50"/>
+              <w:left w:type="dxa" w:w="80"/>
+              <w:bottom w:type="dxa" w:w="50"/>
+              <w:right w:type="dxa" w:w="80"/>
+            </w:tcMar>
+          </w:tcPr>
+          <w:p>
+            <w:r>
+              <w:rPr>
+                <w:b w:val="false"/>
+                <w:bCs w:val="false"/>
+                <w:sz w:val="18"/>
+                <w:szCs w:val="18"/>
+              </w:rPr>
+              <w:t xml:space="preserve">Browser: smoke_a11y</w:t>
+            </w:r>
+          </w:p>
+        </w:tc>
+      </w:tr>
+      <w:tr>
+        <w:tc>
+          <w:tcPr>
+            <w:tcW w:type="dxa" w:w="771"/>
+            <w:tcBorders>
+              <w:top w:val="single" w:color="BFC7D5" w:sz="4"/>
+              <w:left w:val="single" w:color="BFC7D5" w:sz="4"/>
+              <w:bottom w:val="single" w:color="BFC7D5" w:sz="4"/>
+              <w:right w:val="single" w:color="BFC7D5" w:sz="4"/>
+            </w:tcBorders>
+            <w:tcMar>
+              <w:top w:type="dxa" w:w="50"/>
+              <w:left w:type="dxa" w:w="80"/>
+              <w:bottom w:type="dxa" w:w="50"/>
+              <w:right w:type="dxa" w:w="80"/>
+            </w:tcMar>
+          </w:tcPr>
+          <w:p>
+            <w:r>
+              <w:rPr>
+                <w:b w:val="false"/>
+                <w:bCs w:val="false"/>
+                <w:sz w:val="18"/>
+                <w:szCs w:val="18"/>
+              </w:rPr>
               <w:t xml:space="preserve">TR-15</w:t>
             </w:r>
           </w:p>
@@ -3608,7 +3694,7 @@
         <w:spacing w:after="120"/>
       </w:pPr>
       <w:r>
-        <w:t xml:space="preserve">Validierungslauf vom 2026-10-07 09:05 UTC mit Version 2026-10-07-wp10 (Commit 7b5a601). Der Lauf ist mit „python3 scripts/validate.py“ wiederholbar; die Rohdaten liegen unter docs/validation.</w:t>
+        <w:t xml:space="preserve">Validierungslauf vom 2026-10-07 09:13 UTC mit Version 2026-10-07-wp11 (Commit 463d301). Der Lauf ist mit „python3 scripts/validate.py“ wiederholbar; die Rohdaten liegen unter docs/validation.</w:t>
       </w:r>
     </w:p>
     <w:p>
@@ -6432,6 +6518,104 @@
                 <w:szCs w:val="16"/>
               </w:rPr>
               <w:t xml:space="preserve">8 export L3: Arbeitsmappe_Stufe3.xlsx</w:t>
+            </w:r>
+          </w:p>
+          <w:p>
+            <w:r>
+              <w:rPr>
+                <w:b w:val="false"/>
+                <w:bCs w:val="false"/>
+                <w:sz w:val="16"/>
+                <w:szCs w:val="16"/>
+              </w:rPr>
+              <w:t xml:space="preserve">Seitenfehler: keine (erwarteter Verbindungsfehler zur nicht gestarteten lokalen KI ausgenommen)</w:t>
+            </w:r>
+          </w:p>
+        </w:tc>
+      </w:tr>
+      <w:tr>
+        <w:tc>
+          <w:tcPr>
+            <w:tcW w:type="dxa" w:w="2120"/>
+            <w:tcBorders>
+              <w:top w:val="single" w:color="BFC7D5" w:sz="4"/>
+              <w:left w:val="single" w:color="BFC7D5" w:sz="4"/>
+              <w:bottom w:val="single" w:color="BFC7D5" w:sz="4"/>
+              <w:right w:val="single" w:color="BFC7D5" w:sz="4"/>
+            </w:tcBorders>
+            <w:tcMar>
+              <w:top w:type="dxa" w:w="50"/>
+              <w:left w:type="dxa" w:w="80"/>
+              <w:bottom w:type="dxa" w:w="50"/>
+              <w:right w:type="dxa" w:w="80"/>
+            </w:tcMar>
+          </w:tcPr>
+          <w:p>
+            <w:r>
+              <w:rPr>
+                <w:b w:val="false"/>
+                <w:bCs w:val="false"/>
+                <w:sz w:val="16"/>
+                <w:szCs w:val="16"/>
+              </w:rPr>
+              <w:t xml:space="preserve">smoke_a11y.py</w:t>
+            </w:r>
+          </w:p>
+        </w:tc>
+        <w:tc>
+          <w:tcPr>
+            <w:tcW w:type="dxa" w:w="1349"/>
+            <w:tcBorders>
+              <w:top w:val="single" w:color="BFC7D5" w:sz="4"/>
+              <w:left w:val="single" w:color="BFC7D5" w:sz="4"/>
+              <w:bottom w:val="single" w:color="BFC7D5" w:sz="4"/>
+              <w:right w:val="single" w:color="BFC7D5" w:sz="4"/>
+            </w:tcBorders>
+            <w:shd w:fill="E6F3EA" w:color="auto" w:val="clear"/>
+            <w:tcMar>
+              <w:top w:type="dxa" w:w="50"/>
+              <w:left w:type="dxa" w:w="80"/>
+              <w:bottom w:type="dxa" w:w="50"/>
+              <w:right w:type="dxa" w:w="80"/>
+            </w:tcMar>
+          </w:tcPr>
+          <w:p>
+            <w:r>
+              <w:rPr>
+                <w:b w:val="false"/>
+                <w:bCs w:val="false"/>
+                <w:sz w:val="16"/>
+                <w:szCs w:val="16"/>
+              </w:rPr>
+              <w:t xml:space="preserve">bestanden</w:t>
+            </w:r>
+          </w:p>
+        </w:tc>
+        <w:tc>
+          <w:tcPr>
+            <w:tcW w:type="dxa" w:w="6169"/>
+            <w:tcBorders>
+              <w:top w:val="single" w:color="BFC7D5" w:sz="4"/>
+              <w:left w:val="single" w:color="BFC7D5" w:sz="4"/>
+              <w:bottom w:val="single" w:color="BFC7D5" w:sz="4"/>
+              <w:right w:val="single" w:color="BFC7D5" w:sz="4"/>
+            </w:tcBorders>
+            <w:tcMar>
+              <w:top w:type="dxa" w:w="50"/>
+              <w:left w:type="dxa" w:w="80"/>
+              <w:bottom w:type="dxa" w:w="50"/>
+              <w:right w:type="dxa" w:w="80"/>
+            </w:tcMar>
+          </w:tcPr>
+          <w:p>
+            <w:r>
+              <w:rPr>
+                <w:b w:val="false"/>
+                <w:bCs w:val="false"/>
+                <w:sz w:val="16"/>
+                <w:szCs w:val="16"/>
+              </w:rPr>
+              <w:t xml:space="preserve">a11y checks passed</w:t>
             </w:r>
           </w:p>
           <w:p>
@@ -20416,7 +20600,7 @@
         <w:sz w:val="16"/>
         <w:szCs w:val="16"/>
       </w:rPr>
-      <w:t xml:space="preserve">INVENSITY · Werkzeugnachweis RHAS 2026-10-07-wp10</w:t>
+      <w:t xml:space="preserve">INVENSITY · Werkzeugnachweis RHAS 2026-10-07-wp11</w:t>
     </w:r>
   </w:p>
 </w:hdr>

</xml_diff>

<commit_message>
RHAS: validation run and Werkzeugnachweis for 2026-10-07-wp12 (118/118 Node tests, 10/10 browser checks); local package updated
Co-Authored-By: Claude Sonnet 5.5 <noreply@anthropic.com>
Claude-Session: https://claude.ai/code/session_01C75FqTLfyAjNtuqqyZgKLW
</commit_message>
<xml_diff>
--- a/rhas/docs/werkzeugnachweis/04_Werkzeugnachweis_RHAS.docx
+++ b/rhas/docs/werkzeugnachweis/04_Werkzeugnachweis_RHAS.docx
@@ -27,7 +27,7 @@
           <w:sz w:val="22"/>
           <w:szCs w:val="22"/>
         </w:rPr>
-        <w:t xml:space="preserve">Werkzeugbeschreibung, Einstufung nach EN 50129:2018 6.3, Validierung · Version 2026-10-07-wp11 · Stand 2026-10-07 09:13 UTC</w:t>
+        <w:t xml:space="preserve">Werkzeugbeschreibung, Einstufung nach EN 50129:2018 6.3, Validierung · Version 2026-10-07-wp12 · Stand 2026-10-07 10:05 UTC</w:t>
       </w:r>
     </w:p>
     <w:tbl>
@@ -220,7 +220,7 @@
                 <w:sz w:val="18"/>
                 <w:szCs w:val="18"/>
               </w:rPr>
-              <w:t xml:space="preserve">2026-10-07-wp11 / Commit 463d301</w:t>
+              <w:t xml:space="preserve">2026-10-07-wp12 / Commit 3fff21c</w:t>
             </w:r>
           </w:p>
         </w:tc>
@@ -278,7 +278,7 @@
                 <w:sz w:val="18"/>
                 <w:szCs w:val="18"/>
               </w:rPr>
-              <w:t xml:space="preserve">ea466c05fd1321b5d750c2d7be5a19318a60411c8c71089bc4d3f84e4c9fc511</w:t>
+              <w:t xml:space="preserve">c5287bc86e7db806fee01f07534c41a77bab35a222c6a5d423b3289f6e09f0b0</w:t>
             </w:r>
           </w:p>
         </w:tc>
@@ -336,7 +336,7 @@
                 <w:sz w:val="18"/>
                 <w:szCs w:val="18"/>
               </w:rPr>
-              <w:t xml:space="preserve">2026-10-07 09:13 UTC; Node v22.22.0, Python 3.13.16, Chromium (Playwright)</w:t>
+              <w:t xml:space="preserve">2026-10-07 10:05 UTC; Node v22.22.0, Python 3.13.16, Chromium (Playwright)</w:t>
             </w:r>
           </w:p>
         </w:tc>
@@ -394,7 +394,7 @@
                 <w:sz w:val="18"/>
                 <w:szCs w:val="18"/>
               </w:rPr>
-              <w:t xml:space="preserve">115 von 115 Modul- und Berichtstests bestanden; 9 von 9 Browser-Prüfungen bestanden</w:t>
+              <w:t xml:space="preserve">118 von 118 Modul- und Berichtstests bestanden; 10 von 10 Browser-Prüfungen bestanden</w:t>
             </w:r>
           </w:p>
         </w:tc>
@@ -3533,6 +3533,92 @@
                 <w:sz w:val="18"/>
                 <w:szCs w:val="18"/>
               </w:rPr>
+              <w:t xml:space="preserve">TR-15</w:t>
+            </w:r>
+          </w:p>
+        </w:tc>
+        <w:tc>
+          <w:tcPr>
+            <w:tcW w:type="dxa" w:w="6168"/>
+            <w:tcBorders>
+              <w:top w:val="single" w:color="BFC7D5" w:sz="4"/>
+              <w:left w:val="single" w:color="BFC7D5" w:sz="4"/>
+              <w:bottom w:val="single" w:color="BFC7D5" w:sz="4"/>
+              <w:right w:val="single" w:color="BFC7D5" w:sz="4"/>
+            </w:tcBorders>
+            <w:tcMar>
+              <w:top w:type="dxa" w:w="50"/>
+              <w:left w:type="dxa" w:w="80"/>
+              <w:bottom w:type="dxa" w:w="50"/>
+              <w:right w:type="dxa" w:w="80"/>
+            </w:tcMar>
+          </w:tcPr>
+          <w:p>
+            <w:r>
+              <w:rPr>
+                <w:b w:val="false"/>
+                <w:bCs w:val="false"/>
+                <w:sz w:val="18"/>
+                <w:szCs w:val="18"/>
+              </w:rPr>
+              <w:t xml:space="preserve">Berichte sind unabhängig von der Zeitzone des Rechners; die Excel-Arbeitsmappe enthält die Security-Tabellen des Word-Berichts je Stufe.</w:t>
+            </w:r>
+          </w:p>
+        </w:tc>
+        <w:tc>
+          <w:tcPr>
+            <w:tcW w:type="dxa" w:w="2699"/>
+            <w:tcBorders>
+              <w:top w:val="single" w:color="BFC7D5" w:sz="4"/>
+              <w:left w:val="single" w:color="BFC7D5" w:sz="4"/>
+              <w:bottom w:val="single" w:color="BFC7D5" w:sz="4"/>
+              <w:right w:val="single" w:color="BFC7D5" w:sz="4"/>
+            </w:tcBorders>
+            <w:tcMar>
+              <w:top w:type="dxa" w:w="50"/>
+              <w:left w:type="dxa" w:w="80"/>
+              <w:bottom w:type="dxa" w:w="50"/>
+              <w:right w:type="dxa" w:w="80"/>
+            </w:tcMar>
+          </w:tcPr>
+          <w:p>
+            <w:r>
+              <w:rPr>
+                <w:b w:val="false"/>
+                <w:bCs w:val="false"/>
+                <w:sz w:val="18"/>
+                <w:szCs w:val="18"/>
+              </w:rPr>
+              <w:t xml:space="preserve">reports, security-reports, xlsx-security</w:t>
+            </w:r>
+          </w:p>
+        </w:tc>
+      </w:tr>
+      <w:tr>
+        <w:tc>
+          <w:tcPr>
+            <w:tcW w:type="dxa" w:w="771"/>
+            <w:tcBorders>
+              <w:top w:val="single" w:color="BFC7D5" w:sz="4"/>
+              <w:left w:val="single" w:color="BFC7D5" w:sz="4"/>
+              <w:bottom w:val="single" w:color="BFC7D5" w:sz="4"/>
+              <w:right w:val="single" w:color="BFC7D5" w:sz="4"/>
+            </w:tcBorders>
+            <w:tcMar>
+              <w:top w:type="dxa" w:w="50"/>
+              <w:left w:type="dxa" w:w="80"/>
+              <w:bottom w:type="dxa" w:w="50"/>
+              <w:right w:type="dxa" w:w="80"/>
+            </w:tcMar>
+          </w:tcPr>
+          <w:p>
+            <w:r>
+              <w:rPr>
+                <w:b w:val="false"/>
+                <w:bCs w:val="false"/>
+                <w:sz w:val="18"/>
+                <w:szCs w:val="18"/>
+              </w:rPr>
               <w:t xml:space="preserve">TR-16</w:t>
             </w:r>
           </w:p>
@@ -3619,7 +3705,7 @@
                 <w:sz w:val="18"/>
                 <w:szCs w:val="18"/>
               </w:rPr>
-              <w:t xml:space="preserve">TR-15</w:t>
+              <w:t xml:space="preserve">TR-17</w:t>
             </w:r>
           </w:p>
         </w:tc>
@@ -3647,7 +3733,7 @@
                 <w:sz w:val="18"/>
                 <w:szCs w:val="18"/>
               </w:rPr>
-              <w:t xml:space="preserve">Berichte sind unabhängig von der Zeitzone des Rechners; die Excel-Arbeitsmappe enthält die Security-Tabellen des Word-Berichts je Stufe.</w:t>
+              <w:t xml:space="preserve">Die Seite trägt eine Content-Security-Policy: Skripte laufen nur, wenn ihre SHA-256-Prüfsumme im Build eingetragen ist (kein unsafe-inline/unsafe-eval für Skripte, keine Inline-Ereignisbehandler); eingeschleustes Markup kann keinen Code ausführen; Import (PDF, DOCX, XLSX, TXT), Export und Druckansicht arbeiten unter der Policy.</w:t>
             </w:r>
           </w:p>
         </w:tc>
@@ -3675,7 +3761,7 @@
                 <w:sz w:val="18"/>
                 <w:szCs w:val="18"/>
               </w:rPr>
-              <w:t xml:space="preserve">reports, security-reports, xlsx-security</w:t>
+              <w:t xml:space="preserve">build; Browser: smoke_csp</w:t>
             </w:r>
           </w:p>
         </w:tc>
@@ -3694,7 +3780,7 @@
         <w:spacing w:after="120"/>
       </w:pPr>
       <w:r>
-        <w:t xml:space="preserve">Validierungslauf vom 2026-10-07 09:13 UTC mit Version 2026-10-07-wp11 (Commit 463d301). Der Lauf ist mit „python3 scripts/validate.py“ wiederholbar; die Rohdaten liegen unter docs/validation.</w:t>
+        <w:t xml:space="preserve">Validierungslauf vom 2026-10-07 10:05 UTC mit Version 2026-10-07-wp12 (Commit 3fff21c). Der Lauf ist mit „python3 scripts/validate.py“ wiederholbar; die Rohdaten liegen unter docs/validation.</w:t>
       </w:r>
     </w:p>
     <w:p>
@@ -3955,7 +4041,7 @@
                 <w:sz w:val="18"/>
                 <w:szCs w:val="18"/>
               </w:rPr>
-              <w:t xml:space="preserve">4</w:t>
+              <w:t xml:space="preserve">5</w:t>
             </w:r>
           </w:p>
         </w:tc>
@@ -3983,7 +4069,7 @@
                 <w:sz w:val="18"/>
                 <w:szCs w:val="18"/>
               </w:rPr>
-              <w:t xml:space="preserve">4</w:t>
+              <w:t xml:space="preserve">5</w:t>
             </w:r>
           </w:p>
         </w:tc>
@@ -4325,6 +4411,148 @@
                 <w:sz w:val="18"/>
                 <w:szCs w:val="18"/>
               </w:rPr>
+              <w:t xml:space="preserve">dedup.test.js</w:t>
+            </w:r>
+          </w:p>
+        </w:tc>
+        <w:tc>
+          <w:tcPr>
+            <w:tcW w:type="dxa" w:w="2506"/>
+            <w:tcBorders>
+              <w:top w:val="single" w:color="BFC7D5" w:sz="4"/>
+              <w:left w:val="single" w:color="BFC7D5" w:sz="4"/>
+              <w:bottom w:val="single" w:color="BFC7D5" w:sz="4"/>
+              <w:right w:val="single" w:color="BFC7D5" w:sz="4"/>
+            </w:tcBorders>
+            <w:tcMar>
+              <w:top w:type="dxa" w:w="50"/>
+              <w:left w:type="dxa" w:w="80"/>
+              <w:bottom w:type="dxa" w:w="50"/>
+              <w:right w:type="dxa" w:w="80"/>
+            </w:tcMar>
+          </w:tcPr>
+          <w:p>
+            <w:r>
+              <w:rPr>
+                <w:b w:val="false"/>
+                <w:bCs w:val="false"/>
+                <w:sz w:val="18"/>
+                <w:szCs w:val="18"/>
+              </w:rPr>
+              <w:t xml:space="preserve">dedup.test.js</w:t>
+            </w:r>
+          </w:p>
+        </w:tc>
+        <w:tc>
+          <w:tcPr>
+            <w:tcW w:type="dxa" w:w="1157"/>
+            <w:tcBorders>
+              <w:top w:val="single" w:color="BFC7D5" w:sz="4"/>
+              <w:left w:val="single" w:color="BFC7D5" w:sz="4"/>
+              <w:bottom w:val="single" w:color="BFC7D5" w:sz="4"/>
+              <w:right w:val="single" w:color="BFC7D5" w:sz="4"/>
+            </w:tcBorders>
+            <w:tcMar>
+              <w:top w:type="dxa" w:w="50"/>
+              <w:left w:type="dxa" w:w="80"/>
+              <w:bottom w:type="dxa" w:w="50"/>
+              <w:right w:type="dxa" w:w="80"/>
+            </w:tcMar>
+          </w:tcPr>
+          <w:p>
+            <w:r>
+              <w:rPr>
+                <w:b w:val="false"/>
+                <w:bCs w:val="false"/>
+                <w:sz w:val="18"/>
+                <w:szCs w:val="18"/>
+              </w:rPr>
+              <w:t xml:space="preserve">2</w:t>
+            </w:r>
+          </w:p>
+        </w:tc>
+        <w:tc>
+          <w:tcPr>
+            <w:tcW w:type="dxa" w:w="1349"/>
+            <w:tcBorders>
+              <w:top w:val="single" w:color="BFC7D5" w:sz="4"/>
+              <w:left w:val="single" w:color="BFC7D5" w:sz="4"/>
+              <w:bottom w:val="single" w:color="BFC7D5" w:sz="4"/>
+              <w:right w:val="single" w:color="BFC7D5" w:sz="4"/>
+            </w:tcBorders>
+            <w:tcMar>
+              <w:top w:type="dxa" w:w="50"/>
+              <w:left w:type="dxa" w:w="80"/>
+              <w:bottom w:type="dxa" w:w="50"/>
+              <w:right w:type="dxa" w:w="80"/>
+            </w:tcMar>
+          </w:tcPr>
+          <w:p>
+            <w:r>
+              <w:rPr>
+                <w:b w:val="false"/>
+                <w:bCs w:val="false"/>
+                <w:sz w:val="18"/>
+                <w:szCs w:val="18"/>
+              </w:rPr>
+              <w:t xml:space="preserve">2</w:t>
+            </w:r>
+          </w:p>
+        </w:tc>
+        <w:tc>
+          <w:tcPr>
+            <w:tcW w:type="dxa" w:w="1349"/>
+            <w:tcBorders>
+              <w:top w:val="single" w:color="BFC7D5" w:sz="4"/>
+              <w:left w:val="single" w:color="BFC7D5" w:sz="4"/>
+              <w:bottom w:val="single" w:color="BFC7D5" w:sz="4"/>
+              <w:right w:val="single" w:color="BFC7D5" w:sz="4"/>
+            </w:tcBorders>
+            <w:tcMar>
+              <w:top w:type="dxa" w:w="50"/>
+              <w:left w:type="dxa" w:w="80"/>
+              <w:bottom w:type="dxa" w:w="50"/>
+              <w:right w:type="dxa" w:w="80"/>
+            </w:tcMar>
+          </w:tcPr>
+          <w:p>
+            <w:r>
+              <w:rPr>
+                <w:b w:val="false"/>
+                <w:bCs w:val="false"/>
+                <w:sz w:val="18"/>
+                <w:szCs w:val="18"/>
+              </w:rPr>
+              <w:t xml:space="preserve">0</w:t>
+            </w:r>
+          </w:p>
+        </w:tc>
+      </w:tr>
+      <w:tr>
+        <w:tc>
+          <w:tcPr>
+            <w:tcW w:type="dxa" w:w="3277"/>
+            <w:tcBorders>
+              <w:top w:val="single" w:color="BFC7D5" w:sz="4"/>
+              <w:left w:val="single" w:color="BFC7D5" w:sz="4"/>
+              <w:bottom w:val="single" w:color="BFC7D5" w:sz="4"/>
+              <w:right w:val="single" w:color="BFC7D5" w:sz="4"/>
+            </w:tcBorders>
+            <w:tcMar>
+              <w:top w:type="dxa" w:w="50"/>
+              <w:left w:type="dxa" w:w="80"/>
+              <w:bottom w:type="dxa" w:w="50"/>
+              <w:right w:type="dxa" w:w="80"/>
+            </w:tcMar>
+          </w:tcPr>
+          <w:p>
+            <w:r>
+              <w:rPr>
+                <w:b w:val="false"/>
+                <w:bCs w:val="false"/>
+                <w:sz w:val="18"/>
+                <w:szCs w:val="18"/>
+              </w:rPr>
               <w:t xml:space="preserve">Domänenpakete und Demo</w:t>
             </w:r>
           </w:p>
@@ -6226,7 +6454,7 @@
                 <w:sz w:val="18"/>
                 <w:szCs w:val="18"/>
               </w:rPr>
-              <w:t xml:space="preserve">115</w:t>
+              <w:t xml:space="preserve">118</w:t>
             </w:r>
           </w:p>
         </w:tc>
@@ -6254,7 +6482,7 @@
                 <w:sz w:val="18"/>
                 <w:szCs w:val="18"/>
               </w:rPr>
-              <w:t xml:space="preserve">115</w:t>
+              <w:t xml:space="preserve">118</w:t>
             </w:r>
           </w:p>
         </w:tc>
@@ -6736,6 +6964,126 @@
                 <w:szCs w:val="16"/>
               </w:rPr>
               <w:t xml:space="preserve">class filter options: ['Alle Risikoklassen', 'Untragbar', 'Unerwünscht', 'Tragbar', 'Vernachlässigbar']</w:t>
+            </w:r>
+          </w:p>
+          <w:p>
+            <w:r>
+              <w:rPr>
+                <w:b w:val="false"/>
+                <w:bCs w:val="false"/>
+                <w:sz w:val="16"/>
+                <w:szCs w:val="16"/>
+              </w:rPr>
+              <w:t xml:space="preserve">Seitenfehler: keine (erwarteter Verbindungsfehler zur nicht gestarteten lokalen KI ausgenommen)</w:t>
+            </w:r>
+          </w:p>
+        </w:tc>
+      </w:tr>
+      <w:tr>
+        <w:tc>
+          <w:tcPr>
+            <w:tcW w:type="dxa" w:w="2120"/>
+            <w:tcBorders>
+              <w:top w:val="single" w:color="BFC7D5" w:sz="4"/>
+              <w:left w:val="single" w:color="BFC7D5" w:sz="4"/>
+              <w:bottom w:val="single" w:color="BFC7D5" w:sz="4"/>
+              <w:right w:val="single" w:color="BFC7D5" w:sz="4"/>
+            </w:tcBorders>
+            <w:tcMar>
+              <w:top w:type="dxa" w:w="50"/>
+              <w:left w:type="dxa" w:w="80"/>
+              <w:bottom w:type="dxa" w:w="50"/>
+              <w:right w:type="dxa" w:w="80"/>
+            </w:tcMar>
+          </w:tcPr>
+          <w:p>
+            <w:r>
+              <w:rPr>
+                <w:b w:val="false"/>
+                <w:bCs w:val="false"/>
+                <w:sz w:val="16"/>
+                <w:szCs w:val="16"/>
+              </w:rPr>
+              <w:t xml:space="preserve">smoke_csp.py</w:t>
+            </w:r>
+          </w:p>
+        </w:tc>
+        <w:tc>
+          <w:tcPr>
+            <w:tcW w:type="dxa" w:w="1349"/>
+            <w:tcBorders>
+              <w:top w:val="single" w:color="BFC7D5" w:sz="4"/>
+              <w:left w:val="single" w:color="BFC7D5" w:sz="4"/>
+              <w:bottom w:val="single" w:color="BFC7D5" w:sz="4"/>
+              <w:right w:val="single" w:color="BFC7D5" w:sz="4"/>
+            </w:tcBorders>
+            <w:shd w:fill="E6F3EA" w:color="auto" w:val="clear"/>
+            <w:tcMar>
+              <w:top w:type="dxa" w:w="50"/>
+              <w:left w:type="dxa" w:w="80"/>
+              <w:bottom w:type="dxa" w:w="50"/>
+              <w:right w:type="dxa" w:w="80"/>
+            </w:tcMar>
+          </w:tcPr>
+          <w:p>
+            <w:r>
+              <w:rPr>
+                <w:b w:val="false"/>
+                <w:bCs w:val="false"/>
+                <w:sz w:val="16"/>
+                <w:szCs w:val="16"/>
+              </w:rPr>
+              <w:t xml:space="preserve">bestanden</w:t>
+            </w:r>
+          </w:p>
+        </w:tc>
+        <w:tc>
+          <w:tcPr>
+            <w:tcW w:type="dxa" w:w="6169"/>
+            <w:tcBorders>
+              <w:top w:val="single" w:color="BFC7D5" w:sz="4"/>
+              <w:left w:val="single" w:color="BFC7D5" w:sz="4"/>
+              <w:bottom w:val="single" w:color="BFC7D5" w:sz="4"/>
+              <w:right w:val="single" w:color="BFC7D5" w:sz="4"/>
+            </w:tcBorders>
+            <w:tcMar>
+              <w:top w:type="dxa" w:w="50"/>
+              <w:left w:type="dxa" w:w="80"/>
+              <w:bottom w:type="dxa" w:w="50"/>
+              <w:right w:type="dxa" w:w="80"/>
+            </w:tcMar>
+          </w:tcPr>
+          <w:p>
+            <w:r>
+              <w:rPr>
+                <w:b w:val="false"/>
+                <w:bCs w:val="false"/>
+                <w:sz w:val="16"/>
+                <w:szCs w:val="16"/>
+              </w:rPr>
+              <w:t xml:space="preserve">docx download: SA-LYNX-RS-001_RevA_Minimel_Lynx_ATWS_Baustellenwarnung_Gleiserneuerung_Gleis_2_.docx</w:t>
+            </w:r>
+          </w:p>
+          <w:p>
+            <w:r>
+              <w:rPr>
+                <w:b w:val="false"/>
+                <w:bCs w:val="false"/>
+                <w:sz w:val="16"/>
+                <w:szCs w:val="16"/>
+              </w:rPr>
+              <w:t xml:space="preserve">violations during normal use: []</w:t>
+            </w:r>
+          </w:p>
+          <w:p>
+            <w:r>
+              <w:rPr>
+                <w:b w:val="false"/>
+                <w:bCs w:val="false"/>
+                <w:sz w:val="16"/>
+                <w:szCs w:val="16"/>
+              </w:rPr>
+              <w:t xml:space="preserve">blocked injection attempts: ['script-src-elem inline ', 'img-src file ', 'script-src-attr inline ']</w:t>
             </w:r>
           </w:p>
           <w:p>
@@ -8475,6 +8823,65 @@
           </w:p>
         </w:tc>
       </w:tr>
+      <w:tr>
+        <w:tc>
+          <w:tcPr>
+            <w:tcW w:type="dxa" w:w="7903"/>
+            <w:tcBorders>
+              <w:top w:val="single" w:color="BFC7D5" w:sz="4"/>
+              <w:left w:val="single" w:color="BFC7D5" w:sz="4"/>
+              <w:bottom w:val="single" w:color="BFC7D5" w:sz="4"/>
+              <w:right w:val="single" w:color="BFC7D5" w:sz="4"/>
+            </w:tcBorders>
+            <w:tcMar>
+              <w:top w:type="dxa" w:w="50"/>
+              <w:left w:type="dxa" w:w="80"/>
+              <w:bottom w:type="dxa" w:w="50"/>
+              <w:right w:type="dxa" w:w="80"/>
+            </w:tcMar>
+          </w:tcPr>
+          <w:p>
+            <w:r>
+              <w:rPr>
+                <w:b w:val="false"/>
+                <w:bCs w:val="false"/>
+                <w:sz w:val="16"/>
+                <w:szCs w:val="16"/>
+              </w:rPr>
+              <w:t xml:space="preserve">Content-Security-Policy: every inline script is allowed by hash, nothing is allowed by keyword</w:t>
+            </w:r>
+          </w:p>
+        </w:tc>
+        <w:tc>
+          <w:tcPr>
+            <w:tcW w:type="dxa" w:w="1735"/>
+            <w:tcBorders>
+              <w:top w:val="single" w:color="BFC7D5" w:sz="4"/>
+              <w:left w:val="single" w:color="BFC7D5" w:sz="4"/>
+              <w:bottom w:val="single" w:color="BFC7D5" w:sz="4"/>
+              <w:right w:val="single" w:color="BFC7D5" w:sz="4"/>
+            </w:tcBorders>
+            <w:shd w:fill="E6F3EA" w:color="auto" w:val="clear"/>
+            <w:tcMar>
+              <w:top w:type="dxa" w:w="50"/>
+              <w:left w:type="dxa" w:w="80"/>
+              <w:bottom w:type="dxa" w:w="50"/>
+              <w:right w:type="dxa" w:w="80"/>
+            </w:tcMar>
+          </w:tcPr>
+          <w:p>
+            <w:r>
+              <w:rPr>
+                <w:b w:val="false"/>
+                <w:bCs w:val="false"/>
+                <w:sz w:val="16"/>
+                <w:szCs w:val="16"/>
+              </w:rPr>
+              <w:t xml:space="preserve">bestanden</w:t>
+            </w:r>
+          </w:p>
+        </w:tc>
+      </w:tr>
     </w:tbl>
     <w:p>
       <w:pPr>
@@ -9090,6 +9497,212 @@
                 <w:szCs w:val="16"/>
               </w:rPr>
               <w:t xml:space="preserve">next id is max(existing ids, persistent counter) + 1</w:t>
+            </w:r>
+          </w:p>
+        </w:tc>
+        <w:tc>
+          <w:tcPr>
+            <w:tcW w:type="dxa" w:w="1735"/>
+            <w:tcBorders>
+              <w:top w:val="single" w:color="BFC7D5" w:sz="4"/>
+              <w:left w:val="single" w:color="BFC7D5" w:sz="4"/>
+              <w:bottom w:val="single" w:color="BFC7D5" w:sz="4"/>
+              <w:right w:val="single" w:color="BFC7D5" w:sz="4"/>
+            </w:tcBorders>
+            <w:shd w:fill="E6F3EA" w:color="auto" w:val="clear"/>
+            <w:tcMar>
+              <w:top w:type="dxa" w:w="50"/>
+              <w:left w:type="dxa" w:w="80"/>
+              <w:bottom w:type="dxa" w:w="50"/>
+              <w:right w:type="dxa" w:w="80"/>
+            </w:tcMar>
+          </w:tcPr>
+          <w:p>
+            <w:r>
+              <w:rPr>
+                <w:b w:val="false"/>
+                <w:bCs w:val="false"/>
+                <w:sz w:val="16"/>
+                <w:szCs w:val="16"/>
+              </w:rPr>
+              <w:t xml:space="preserve">bestanden</w:t>
+            </w:r>
+          </w:p>
+        </w:tc>
+      </w:tr>
+    </w:tbl>
+    <w:p>
+      <w:pPr>
+        <w:pStyle w:val="Heading2"/>
+      </w:pPr>
+      <w:r>
+        <w:t xml:space="preserve">dedup.test.js (dedup.test.js)</w:t>
+      </w:r>
+    </w:p>
+    <w:tbl>
+      <w:tblPr>
+        <w:tblW w:type="dxa" w:w="9638"/>
+        <w:tblBorders>
+          <w:top w:val="single" w:color="auto" w:sz="4"/>
+          <w:left w:val="single" w:color="auto" w:sz="4"/>
+          <w:bottom w:val="single" w:color="auto" w:sz="4"/>
+          <w:right w:val="single" w:color="auto" w:sz="4"/>
+          <w:insideH w:val="single" w:color="auto" w:sz="4"/>
+          <w:insideV w:val="single" w:color="auto" w:sz="4"/>
+        </w:tblBorders>
+      </w:tblPr>
+      <w:tblGrid>
+        <w:gridCol w:w="7903"/>
+        <w:gridCol w:w="1735"/>
+      </w:tblGrid>
+      <w:tr>
+        <w:trPr>
+          <w:tblHeader/>
+        </w:trPr>
+        <w:tc>
+          <w:tcPr>
+            <w:tcW w:type="dxa" w:w="7903"/>
+            <w:tcBorders>
+              <w:top w:val="single" w:color="BFC7D5" w:sz="4"/>
+              <w:left w:val="single" w:color="BFC7D5" w:sz="4"/>
+              <w:bottom w:val="single" w:color="BFC7D5" w:sz="4"/>
+              <w:right w:val="single" w:color="BFC7D5" w:sz="4"/>
+            </w:tcBorders>
+            <w:shd w:fill="DCE3EE" w:color="auto" w:val="clear"/>
+            <w:tcMar>
+              <w:top w:type="dxa" w:w="50"/>
+              <w:left w:type="dxa" w:w="80"/>
+              <w:bottom w:type="dxa" w:w="50"/>
+              <w:right w:type="dxa" w:w="80"/>
+            </w:tcMar>
+          </w:tcPr>
+          <w:p>
+            <w:r>
+              <w:rPr>
+                <w:b/>
+                <w:bCs/>
+                <w:sz w:val="16"/>
+                <w:szCs w:val="16"/>
+              </w:rPr>
+              <w:t xml:space="preserve">Testfall</w:t>
+            </w:r>
+          </w:p>
+        </w:tc>
+        <w:tc>
+          <w:tcPr>
+            <w:tcW w:type="dxa" w:w="1735"/>
+            <w:tcBorders>
+              <w:top w:val="single" w:color="BFC7D5" w:sz="4"/>
+              <w:left w:val="single" w:color="BFC7D5" w:sz="4"/>
+              <w:bottom w:val="single" w:color="BFC7D5" w:sz="4"/>
+              <w:right w:val="single" w:color="BFC7D5" w:sz="4"/>
+            </w:tcBorders>
+            <w:shd w:fill="DCE3EE" w:color="auto" w:val="clear"/>
+            <w:tcMar>
+              <w:top w:type="dxa" w:w="50"/>
+              <w:left w:type="dxa" w:w="80"/>
+              <w:bottom w:type="dxa" w:w="50"/>
+              <w:right w:type="dxa" w:w="80"/>
+            </w:tcMar>
+          </w:tcPr>
+          <w:p>
+            <w:r>
+              <w:rPr>
+                <w:b/>
+                <w:bCs/>
+                <w:sz w:val="16"/>
+                <w:szCs w:val="16"/>
+              </w:rPr>
+              <w:t xml:space="preserve">Ergebnis</w:t>
+            </w:r>
+          </w:p>
+        </w:tc>
+      </w:tr>
+      <w:tr>
+        <w:tc>
+          <w:tcPr>
+            <w:tcW w:type="dxa" w:w="7903"/>
+            <w:tcBorders>
+              <w:top w:val="single" w:color="BFC7D5" w:sz="4"/>
+              <w:left w:val="single" w:color="BFC7D5" w:sz="4"/>
+              <w:bottom w:val="single" w:color="BFC7D5" w:sz="4"/>
+              <w:right w:val="single" w:color="BFC7D5" w:sz="4"/>
+            </w:tcBorders>
+            <w:tcMar>
+              <w:top w:type="dxa" w:w="50"/>
+              <w:left w:type="dxa" w:w="80"/>
+              <w:bottom w:type="dxa" w:w="50"/>
+              <w:right w:type="dxa" w:w="80"/>
+            </w:tcMar>
+          </w:tcPr>
+          <w:p>
+            <w:r>
+              <w:rPr>
+                <w:b w:val="false"/>
+                <w:bCs w:val="false"/>
+                <w:sz w:val="16"/>
+                <w:szCs w:val="16"/>
+              </w:rPr>
+              <w:t xml:space="preserve">tokenize lower-cases, strips punctuation and drops words of two letters or fewer</w:t>
+            </w:r>
+          </w:p>
+        </w:tc>
+        <w:tc>
+          <w:tcPr>
+            <w:tcW w:type="dxa" w:w="1735"/>
+            <w:tcBorders>
+              <w:top w:val="single" w:color="BFC7D5" w:sz="4"/>
+              <w:left w:val="single" w:color="BFC7D5" w:sz="4"/>
+              <w:bottom w:val="single" w:color="BFC7D5" w:sz="4"/>
+              <w:right w:val="single" w:color="BFC7D5" w:sz="4"/>
+            </w:tcBorders>
+            <w:shd w:fill="E6F3EA" w:color="auto" w:val="clear"/>
+            <w:tcMar>
+              <w:top w:type="dxa" w:w="50"/>
+              <w:left w:type="dxa" w:w="80"/>
+              <w:bottom w:type="dxa" w:w="50"/>
+              <w:right w:type="dxa" w:w="80"/>
+            </w:tcMar>
+          </w:tcPr>
+          <w:p>
+            <w:r>
+              <w:rPr>
+                <w:b w:val="false"/>
+                <w:bCs w:val="false"/>
+                <w:sz w:val="16"/>
+                <w:szCs w:val="16"/>
+              </w:rPr>
+              <w:t xml:space="preserve">bestanden</w:t>
+            </w:r>
+          </w:p>
+        </w:tc>
+      </w:tr>
+      <w:tr>
+        <w:tc>
+          <w:tcPr>
+            <w:tcW w:type="dxa" w:w="7903"/>
+            <w:tcBorders>
+              <w:top w:val="single" w:color="BFC7D5" w:sz="4"/>
+              <w:left w:val="single" w:color="BFC7D5" w:sz="4"/>
+              <w:bottom w:val="single" w:color="BFC7D5" w:sz="4"/>
+              <w:right w:val="single" w:color="BFC7D5" w:sz="4"/>
+            </w:tcBorders>
+            <w:tcMar>
+              <w:top w:type="dxa" w:w="50"/>
+              <w:left w:type="dxa" w:w="80"/>
+              <w:bottom w:type="dxa" w:w="50"/>
+              <w:right w:type="dxa" w:w="80"/>
+            </w:tcMar>
+          </w:tcPr>
+          <w:p>
+            <w:r>
+              <w:rPr>
+                <w:b w:val="false"/>
+                <w:bCs w:val="false"/>
+                <w:sz w:val="16"/>
+                <w:szCs w:val="16"/>
+              </w:rPr>
+              <w:t xml:space="preserve">jaccard is 1 for identical sets, 0 for disjoint or empty, symmetric otherwise</w:t>
             </w:r>
           </w:p>
         </w:tc>
@@ -20600,7 +21213,7 @@
         <w:sz w:val="16"/>
         <w:szCs w:val="16"/>
       </w:rPr>
-      <w:t xml:space="preserve">INVENSITY · Werkzeugnachweis RHAS 2026-10-07-wp11</w:t>
+      <w:t xml:space="preserve">INVENSITY · Werkzeugnachweis RHAS 2026-10-07-wp12</w:t>
     </w:r>
   </w:p>
 </w:hdr>

</xml_diff>